<commit_message>
Update insyaallah final proposal 13 Des 2025
</commit_message>
<xml_diff>
--- a/Proposal Rizki Fikriansyah/Proposal Rizki Fikriansyah.docx
+++ b/Proposal Rizki Fikriansyah/Proposal Rizki Fikriansyah.docx
@@ -1181,7 +1181,17 @@
                 <w:szCs w:val="24"/>
                 <w:lang w:val="id-ID"/>
               </w:rPr>
-              <w:t>Teguh Ansyor Lorosae, M.Kom</w:t>
+              <w:t>Ir</w:t>
+            </w:r>
+            <w:r>
+              <w:rPr>
+                <w:b/>
+                <w:bCs/>
+                <w:color w:val="000000" w:themeColor="text1"/>
+                <w:szCs w:val="24"/>
+                <w:lang w:val="id-ID"/>
+              </w:rPr>
+              <w:t>. Dahlan, S.T., M.Kom</w:t>
             </w:r>
           </w:p>
           <w:p>
@@ -1214,7 +1224,7 @@
                 <w:szCs w:val="24"/>
                 <w:lang w:val="id-ID"/>
               </w:rPr>
-              <w:t xml:space="preserve"> 0818119501</w:t>
+              <w:t xml:space="preserve"> </w:t>
             </w:r>
           </w:p>
           <w:p>
@@ -2151,7 +2161,16 @@
         <w:ind w:left="284" w:right="-299" w:hanging="568"/>
       </w:pPr>
       <w:r>
-        <w:t xml:space="preserve">Bapak Teguh Ansyor Lorosae, M.Kom, </w:t>
+        <w:t xml:space="preserve">Bapak </w:t>
+      </w:r>
+      <w:r>
+        <w:t>Ir. Dahlan, S.T</w:t>
+      </w:r>
+      <w:r>
+        <w:t>., M.Kom</w:t>
+      </w:r>
+      <w:r>
+        <w:t xml:space="preserve">, </w:t>
       </w:r>
       <w:r>
         <w:t>selaku</w:t>
@@ -5546,7 +5565,7 @@
         <w:tabs>
           <w:tab w:val="right" w:leader="dot" w:pos="7346"/>
         </w:tabs>
-        <w:spacing w:line="360" w:lineRule="auto"/>
+        <w:spacing w:line="480" w:lineRule="auto"/>
         <w:rPr>
           <w:noProof/>
         </w:rPr>
@@ -5569,7 +5588,7 @@
         </w:rPr>
         <w:fldChar w:fldCharType="separate"/>
       </w:r>
-      <w:hyperlink w:anchor="_Toc215385242" w:history="1">
+      <w:hyperlink w:anchor="_Toc216192520" w:history="1">
         <w:r>
           <w:rPr>
             <w:rStyle w:val="Hyperlink"/>
@@ -5596,7 +5615,462 @@
             <w:noProof/>
             <w:webHidden/>
           </w:rPr>
-          <w:instrText xml:space="preserve"> PAGEREF _Toc215385242 \h </w:instrText>
+          <w:instrText xml:space="preserve"> PAGEREF _Toc216192520 \h </w:instrText>
+        </w:r>
+        <w:r>
+          <w:rPr>
+            <w:noProof/>
+            <w:webHidden/>
+          </w:rPr>
+        </w:r>
+        <w:r>
+          <w:rPr>
+            <w:noProof/>
+            <w:webHidden/>
+          </w:rPr>
+          <w:fldChar w:fldCharType="separate"/>
+        </w:r>
+        <w:r>
+          <w:rPr>
+            <w:noProof/>
+            <w:webHidden/>
+          </w:rPr>
+          <w:t>10</w:t>
+        </w:r>
+        <w:r>
+          <w:rPr>
+            <w:noProof/>
+            <w:webHidden/>
+          </w:rPr>
+          <w:fldChar w:fldCharType="end"/>
+        </w:r>
+      </w:hyperlink>
+      <w:r>
+        <w:rPr>
+          <w:lang w:val="id-ID"/>
+        </w:rPr>
+        <w:fldChar w:fldCharType="end"/>
+      </w:r>
+      <w:r>
+        <w:rPr>
+          <w:lang w:val="id-ID"/>
+        </w:rPr>
+        <w:fldChar w:fldCharType="begin"/>
+      </w:r>
+      <w:r>
+        <w:rPr>
+          <w:lang w:val="id-ID"/>
+        </w:rPr>
+        <w:instrText xml:space="preserve"> TOC \h \z \c "Tabel 3." </w:instrText>
+      </w:r>
+      <w:r>
+        <w:rPr>
+          <w:lang w:val="id-ID"/>
+        </w:rPr>
+        <w:fldChar w:fldCharType="separate"/>
+      </w:r>
+    </w:p>
+    <w:p>
+      <w:pPr>
+        <w:pStyle w:val="TableofFigures"/>
+        <w:tabs>
+          <w:tab w:val="right" w:leader="dot" w:pos="7346"/>
+        </w:tabs>
+        <w:spacing w:line="480" w:lineRule="auto"/>
+        <w:rPr>
+          <w:rFonts w:asciiTheme="minorHAnsi" w:eastAsiaTheme="minorEastAsia" w:hAnsiTheme="minorHAnsi" w:cstheme="minorBidi"/>
+          <w:noProof/>
+          <w:kern w:val="2"/>
+          <w:szCs w:val="24"/>
+          <w:lang w:val="en-ID" w:eastAsia="en-ID"/>
+          <w14:ligatures w14:val="standardContextual"/>
+        </w:rPr>
+      </w:pPr>
+      <w:hyperlink w:anchor="_Toc216192526" w:history="1">
+        <w:r>
+          <w:rPr>
+            <w:rStyle w:val="Hyperlink"/>
+            <w:noProof/>
+          </w:rPr>
+          <w:t>Tabel 3. 1 Kebutuhan hardware</w:t>
+        </w:r>
+        <w:r>
+          <w:rPr>
+            <w:noProof/>
+            <w:webHidden/>
+          </w:rPr>
+          <w:tab/>
+        </w:r>
+        <w:r>
+          <w:rPr>
+            <w:noProof/>
+            <w:webHidden/>
+          </w:rPr>
+          <w:fldChar w:fldCharType="begin"/>
+        </w:r>
+        <w:r>
+          <w:rPr>
+            <w:noProof/>
+            <w:webHidden/>
+          </w:rPr>
+          <w:instrText xml:space="preserve"> PAGEREF _Toc216192526 \h </w:instrText>
+        </w:r>
+        <w:r>
+          <w:rPr>
+            <w:noProof/>
+            <w:webHidden/>
+          </w:rPr>
+        </w:r>
+        <w:r>
+          <w:rPr>
+            <w:noProof/>
+            <w:webHidden/>
+          </w:rPr>
+          <w:fldChar w:fldCharType="separate"/>
+        </w:r>
+        <w:r>
+          <w:rPr>
+            <w:noProof/>
+            <w:webHidden/>
+          </w:rPr>
+          <w:t>15</w:t>
+        </w:r>
+        <w:r>
+          <w:rPr>
+            <w:noProof/>
+            <w:webHidden/>
+          </w:rPr>
+          <w:fldChar w:fldCharType="end"/>
+        </w:r>
+      </w:hyperlink>
+    </w:p>
+    <w:p>
+      <w:pPr>
+        <w:pStyle w:val="TableofFigures"/>
+        <w:tabs>
+          <w:tab w:val="right" w:leader="dot" w:pos="7346"/>
+        </w:tabs>
+        <w:spacing w:line="480" w:lineRule="auto"/>
+        <w:rPr>
+          <w:rFonts w:asciiTheme="minorHAnsi" w:eastAsiaTheme="minorEastAsia" w:hAnsiTheme="minorHAnsi" w:cstheme="minorBidi"/>
+          <w:noProof/>
+          <w:kern w:val="2"/>
+          <w:szCs w:val="24"/>
+          <w:lang w:val="en-ID" w:eastAsia="en-ID"/>
+          <w14:ligatures w14:val="standardContextual"/>
+        </w:rPr>
+      </w:pPr>
+      <w:hyperlink w:anchor="_Toc216192527" w:history="1">
+        <w:r>
+          <w:rPr>
+            <w:rStyle w:val="Hyperlink"/>
+            <w:noProof/>
+          </w:rPr>
+          <w:t>Tabel 3. 2 Perancangan pengujian sistem</w:t>
+        </w:r>
+        <w:r>
+          <w:rPr>
+            <w:noProof/>
+            <w:webHidden/>
+          </w:rPr>
+          <w:tab/>
+        </w:r>
+        <w:r>
+          <w:rPr>
+            <w:noProof/>
+            <w:webHidden/>
+          </w:rPr>
+          <w:fldChar w:fldCharType="begin"/>
+        </w:r>
+        <w:r>
+          <w:rPr>
+            <w:noProof/>
+            <w:webHidden/>
+          </w:rPr>
+          <w:instrText xml:space="preserve"> PAGEREF _Toc216192527 \h </w:instrText>
+        </w:r>
+        <w:r>
+          <w:rPr>
+            <w:noProof/>
+            <w:webHidden/>
+          </w:rPr>
+        </w:r>
+        <w:r>
+          <w:rPr>
+            <w:noProof/>
+            <w:webHidden/>
+          </w:rPr>
+          <w:fldChar w:fldCharType="separate"/>
+        </w:r>
+        <w:r>
+          <w:rPr>
+            <w:noProof/>
+            <w:webHidden/>
+          </w:rPr>
+          <w:t>25</w:t>
+        </w:r>
+        <w:r>
+          <w:rPr>
+            <w:noProof/>
+            <w:webHidden/>
+          </w:rPr>
+          <w:fldChar w:fldCharType="end"/>
+        </w:r>
+      </w:hyperlink>
+    </w:p>
+    <w:p>
+      <w:pPr>
+        <w:pStyle w:val="TableofFigures"/>
+        <w:tabs>
+          <w:tab w:val="right" w:leader="dot" w:pos="7346"/>
+        </w:tabs>
+        <w:spacing w:line="480" w:lineRule="auto"/>
+        <w:rPr>
+          <w:lang w:val="id-ID"/>
+        </w:rPr>
+      </w:pPr>
+      <w:r>
+        <w:rPr>
+          <w:lang w:val="id-ID"/>
+        </w:rPr>
+        <w:fldChar w:fldCharType="end"/>
+      </w:r>
+    </w:p>
+    <w:p>
+      <w:pPr>
+        <w:pStyle w:val="Heading1"/>
+        <w:rPr>
+          <w:lang w:val="id-ID"/>
+        </w:rPr>
+      </w:pPr>
+      <w:r>
+        <w:rPr>
+          <w:lang w:val="id-ID"/>
+        </w:rPr>
+        <w:br w:type="page"/>
+      </w:r>
+      <w:bookmarkStart w:id="5" w:name="_Toc215384853"/>
+      <w:r>
+        <w:rPr>
+          <w:lang w:val="id-ID"/>
+        </w:rPr>
+        <w:lastRenderedPageBreak/>
+        <w:t>DAFTAR GAMBAR</w:t>
+      </w:r>
+      <w:bookmarkEnd w:id="5"/>
+    </w:p>
+    <w:p>
+      <w:pPr>
+        <w:rPr>
+          <w:lang w:val="id-ID"/>
+        </w:rPr>
+      </w:pPr>
+    </w:p>
+    <w:p>
+      <w:pPr>
+        <w:pStyle w:val="TableofFigures"/>
+        <w:tabs>
+          <w:tab w:val="right" w:leader="dot" w:pos="7346"/>
+        </w:tabs>
+        <w:spacing w:line="480" w:lineRule="auto"/>
+        <w:rPr>
+          <w:rFonts w:asciiTheme="minorHAnsi" w:eastAsiaTheme="minorEastAsia" w:hAnsiTheme="minorHAnsi" w:cstheme="minorBidi"/>
+          <w:noProof/>
+          <w:kern w:val="2"/>
+          <w:szCs w:val="24"/>
+          <w:lang w:val="en-ID" w:eastAsia="en-ID"/>
+          <w14:ligatures w14:val="standardContextual"/>
+        </w:rPr>
+      </w:pPr>
+      <w:r>
+        <w:rPr>
+          <w:lang w:val="id-ID"/>
+        </w:rPr>
+        <w:fldChar w:fldCharType="begin"/>
+      </w:r>
+      <w:r>
+        <w:rPr>
+          <w:lang w:val="id-ID"/>
+        </w:rPr>
+        <w:instrText xml:space="preserve"> TOC \h \z \c "Gambar 2." </w:instrText>
+      </w:r>
+      <w:r>
+        <w:rPr>
+          <w:lang w:val="id-ID"/>
+        </w:rPr>
+        <w:fldChar w:fldCharType="separate"/>
+      </w:r>
+      <w:hyperlink w:anchor="_Toc216192558" w:history="1">
+        <w:r>
+          <w:rPr>
+            <w:rStyle w:val="Hyperlink"/>
+            <w:noProof/>
+          </w:rPr>
+          <w:t>Gambar 2. 1 ESP32</w:t>
+        </w:r>
+        <w:r>
+          <w:rPr>
+            <w:noProof/>
+            <w:webHidden/>
+          </w:rPr>
+          <w:tab/>
+        </w:r>
+        <w:r>
+          <w:rPr>
+            <w:noProof/>
+            <w:webHidden/>
+          </w:rPr>
+          <w:fldChar w:fldCharType="begin"/>
+        </w:r>
+        <w:r>
+          <w:rPr>
+            <w:noProof/>
+            <w:webHidden/>
+          </w:rPr>
+          <w:instrText xml:space="preserve"> PAGEREF _Toc216192558 \h </w:instrText>
+        </w:r>
+        <w:r>
+          <w:rPr>
+            <w:noProof/>
+            <w:webHidden/>
+          </w:rPr>
+        </w:r>
+        <w:r>
+          <w:rPr>
+            <w:noProof/>
+            <w:webHidden/>
+          </w:rPr>
+          <w:fldChar w:fldCharType="separate"/>
+        </w:r>
+        <w:r>
+          <w:rPr>
+            <w:noProof/>
+            <w:webHidden/>
+          </w:rPr>
+          <w:t>7</w:t>
+        </w:r>
+        <w:r>
+          <w:rPr>
+            <w:noProof/>
+            <w:webHidden/>
+          </w:rPr>
+          <w:fldChar w:fldCharType="end"/>
+        </w:r>
+      </w:hyperlink>
+    </w:p>
+    <w:p>
+      <w:pPr>
+        <w:pStyle w:val="TableofFigures"/>
+        <w:tabs>
+          <w:tab w:val="right" w:leader="dot" w:pos="7346"/>
+        </w:tabs>
+        <w:spacing w:line="480" w:lineRule="auto"/>
+        <w:rPr>
+          <w:rFonts w:asciiTheme="minorHAnsi" w:eastAsiaTheme="minorEastAsia" w:hAnsiTheme="minorHAnsi" w:cstheme="minorBidi"/>
+          <w:noProof/>
+          <w:kern w:val="2"/>
+          <w:szCs w:val="24"/>
+          <w:lang w:val="en-ID" w:eastAsia="en-ID"/>
+          <w14:ligatures w14:val="standardContextual"/>
+        </w:rPr>
+      </w:pPr>
+      <w:hyperlink w:anchor="_Toc216192559" w:history="1">
+        <w:r>
+          <w:rPr>
+            <w:rStyle w:val="Hyperlink"/>
+            <w:noProof/>
+          </w:rPr>
+          <w:t>Gambar 2. 2 GPS NEO-6M</w:t>
+        </w:r>
+        <w:r>
+          <w:rPr>
+            <w:noProof/>
+            <w:webHidden/>
+          </w:rPr>
+          <w:tab/>
+        </w:r>
+        <w:r>
+          <w:rPr>
+            <w:noProof/>
+            <w:webHidden/>
+          </w:rPr>
+          <w:fldChar w:fldCharType="begin"/>
+        </w:r>
+        <w:r>
+          <w:rPr>
+            <w:noProof/>
+            <w:webHidden/>
+          </w:rPr>
+          <w:instrText xml:space="preserve"> PAGEREF _Toc216192559 \h </w:instrText>
+        </w:r>
+        <w:r>
+          <w:rPr>
+            <w:noProof/>
+            <w:webHidden/>
+          </w:rPr>
+        </w:r>
+        <w:r>
+          <w:rPr>
+            <w:noProof/>
+            <w:webHidden/>
+          </w:rPr>
+          <w:fldChar w:fldCharType="separate"/>
+        </w:r>
+        <w:r>
+          <w:rPr>
+            <w:noProof/>
+            <w:webHidden/>
+          </w:rPr>
+          <w:t>8</w:t>
+        </w:r>
+        <w:r>
+          <w:rPr>
+            <w:noProof/>
+            <w:webHidden/>
+          </w:rPr>
+          <w:fldChar w:fldCharType="end"/>
+        </w:r>
+      </w:hyperlink>
+    </w:p>
+    <w:p>
+      <w:pPr>
+        <w:pStyle w:val="TableofFigures"/>
+        <w:tabs>
+          <w:tab w:val="right" w:leader="dot" w:pos="7346"/>
+        </w:tabs>
+        <w:spacing w:line="480" w:lineRule="auto"/>
+        <w:rPr>
+          <w:noProof/>
+        </w:rPr>
+      </w:pPr>
+      <w:hyperlink w:anchor="_Toc216192560" w:history="1">
+        <w:r>
+          <w:rPr>
+            <w:rStyle w:val="Hyperlink"/>
+            <w:noProof/>
+          </w:rPr>
+          <w:t>Gambar 2. 3 ESP32-CAM</w:t>
+        </w:r>
+        <w:r>
+          <w:rPr>
+            <w:noProof/>
+            <w:webHidden/>
+          </w:rPr>
+          <w:tab/>
+        </w:r>
+        <w:r>
+          <w:rPr>
+            <w:noProof/>
+            <w:webHidden/>
+          </w:rPr>
+          <w:fldChar w:fldCharType="begin"/>
+        </w:r>
+        <w:r>
+          <w:rPr>
+            <w:noProof/>
+            <w:webHidden/>
+          </w:rPr>
+          <w:instrText xml:space="preserve"> PAGEREF _Toc216192560 \h </w:instrText>
         </w:r>
         <w:r>
           <w:rPr>
@@ -5642,7 +6116,7 @@
         <w:rPr>
           <w:lang w:val="id-ID"/>
         </w:rPr>
-        <w:instrText xml:space="preserve"> TOC \h \z \c "Tabel 3." </w:instrText>
+        <w:instrText xml:space="preserve"> TOC \h \z \c "Gambar 3." </w:instrText>
       </w:r>
       <w:r>
         <w:rPr>
@@ -5657,7 +6131,7 @@
         <w:tabs>
           <w:tab w:val="right" w:leader="dot" w:pos="7346"/>
         </w:tabs>
-        <w:spacing w:line="360" w:lineRule="auto"/>
+        <w:spacing w:line="480" w:lineRule="auto"/>
         <w:rPr>
           <w:rFonts w:asciiTheme="minorHAnsi" w:eastAsiaTheme="minorEastAsia" w:hAnsiTheme="minorHAnsi" w:cstheme="minorBidi"/>
           <w:noProof/>
@@ -5667,13 +6141,13 @@
           <w14:ligatures w14:val="standardContextual"/>
         </w:rPr>
       </w:pPr>
-      <w:hyperlink w:anchor="_Toc215385274" w:history="1">
+      <w:hyperlink w:anchor="_Toc216192579" w:history="1">
         <w:r>
           <w:rPr>
             <w:rStyle w:val="Hyperlink"/>
             <w:noProof/>
           </w:rPr>
-          <w:t>Tabel 3. 1 Perancangan pengujian sistem</w:t>
+          <w:t>Gambar 3. 1 Tahapan Pengerjaan Penelitian</w:t>
         </w:r>
         <w:r>
           <w:rPr>
@@ -5694,7 +6168,303 @@
             <w:noProof/>
             <w:webHidden/>
           </w:rPr>
-          <w:instrText xml:space="preserve"> PAGEREF _Toc215385274 \h </w:instrText>
+          <w:instrText xml:space="preserve"> PAGEREF _Toc216192579 \h </w:instrText>
+        </w:r>
+        <w:r>
+          <w:rPr>
+            <w:noProof/>
+            <w:webHidden/>
+          </w:rPr>
+        </w:r>
+        <w:r>
+          <w:rPr>
+            <w:noProof/>
+            <w:webHidden/>
+          </w:rPr>
+          <w:fldChar w:fldCharType="separate"/>
+        </w:r>
+        <w:r>
+          <w:rPr>
+            <w:noProof/>
+            <w:webHidden/>
+          </w:rPr>
+          <w:t>14</w:t>
+        </w:r>
+        <w:r>
+          <w:rPr>
+            <w:noProof/>
+            <w:webHidden/>
+          </w:rPr>
+          <w:fldChar w:fldCharType="end"/>
+        </w:r>
+      </w:hyperlink>
+    </w:p>
+    <w:p>
+      <w:pPr>
+        <w:pStyle w:val="TableofFigures"/>
+        <w:tabs>
+          <w:tab w:val="right" w:leader="dot" w:pos="7346"/>
+        </w:tabs>
+        <w:spacing w:line="480" w:lineRule="auto"/>
+        <w:rPr>
+          <w:rFonts w:asciiTheme="minorHAnsi" w:eastAsiaTheme="minorEastAsia" w:hAnsiTheme="minorHAnsi" w:cstheme="minorBidi"/>
+          <w:noProof/>
+          <w:kern w:val="2"/>
+          <w:szCs w:val="24"/>
+          <w:lang w:val="en-ID" w:eastAsia="en-ID"/>
+          <w14:ligatures w14:val="standardContextual"/>
+        </w:rPr>
+      </w:pPr>
+      <w:hyperlink w:anchor="_Toc216192580" w:history="1">
+        <w:r>
+          <w:rPr>
+            <w:rStyle w:val="Hyperlink"/>
+            <w:noProof/>
+          </w:rPr>
+          <w:t>Gambar 3. 2 Rancangan umum sistem</w:t>
+        </w:r>
+        <w:r>
+          <w:rPr>
+            <w:noProof/>
+            <w:webHidden/>
+          </w:rPr>
+          <w:tab/>
+        </w:r>
+        <w:r>
+          <w:rPr>
+            <w:noProof/>
+            <w:webHidden/>
+          </w:rPr>
+          <w:fldChar w:fldCharType="begin"/>
+        </w:r>
+        <w:r>
+          <w:rPr>
+            <w:noProof/>
+            <w:webHidden/>
+          </w:rPr>
+          <w:instrText xml:space="preserve"> PAGEREF _Toc216192580 \h </w:instrText>
+        </w:r>
+        <w:r>
+          <w:rPr>
+            <w:noProof/>
+            <w:webHidden/>
+          </w:rPr>
+        </w:r>
+        <w:r>
+          <w:rPr>
+            <w:noProof/>
+            <w:webHidden/>
+          </w:rPr>
+          <w:fldChar w:fldCharType="separate"/>
+        </w:r>
+        <w:r>
+          <w:rPr>
+            <w:noProof/>
+            <w:webHidden/>
+          </w:rPr>
+          <w:t>18</w:t>
+        </w:r>
+        <w:r>
+          <w:rPr>
+            <w:noProof/>
+            <w:webHidden/>
+          </w:rPr>
+          <w:fldChar w:fldCharType="end"/>
+        </w:r>
+      </w:hyperlink>
+    </w:p>
+    <w:p>
+      <w:pPr>
+        <w:pStyle w:val="TableofFigures"/>
+        <w:tabs>
+          <w:tab w:val="right" w:leader="dot" w:pos="7346"/>
+        </w:tabs>
+        <w:spacing w:line="480" w:lineRule="auto"/>
+        <w:rPr>
+          <w:rFonts w:asciiTheme="minorHAnsi" w:eastAsiaTheme="minorEastAsia" w:hAnsiTheme="minorHAnsi" w:cstheme="minorBidi"/>
+          <w:noProof/>
+          <w:kern w:val="2"/>
+          <w:szCs w:val="24"/>
+          <w:lang w:val="en-ID" w:eastAsia="en-ID"/>
+          <w14:ligatures w14:val="standardContextual"/>
+        </w:rPr>
+      </w:pPr>
+      <w:hyperlink w:anchor="_Toc216192581" w:history="1">
+        <w:r>
+          <w:rPr>
+            <w:rStyle w:val="Hyperlink"/>
+            <w:noProof/>
+          </w:rPr>
+          <w:t>Gambar 3. 3 Alur kerja sistem</w:t>
+        </w:r>
+        <w:r>
+          <w:rPr>
+            <w:noProof/>
+            <w:webHidden/>
+          </w:rPr>
+          <w:tab/>
+        </w:r>
+        <w:r>
+          <w:rPr>
+            <w:noProof/>
+            <w:webHidden/>
+          </w:rPr>
+          <w:fldChar w:fldCharType="begin"/>
+        </w:r>
+        <w:r>
+          <w:rPr>
+            <w:noProof/>
+            <w:webHidden/>
+          </w:rPr>
+          <w:instrText xml:space="preserve"> PAGEREF _Toc216192581 \h </w:instrText>
+        </w:r>
+        <w:r>
+          <w:rPr>
+            <w:noProof/>
+            <w:webHidden/>
+          </w:rPr>
+        </w:r>
+        <w:r>
+          <w:rPr>
+            <w:noProof/>
+            <w:webHidden/>
+          </w:rPr>
+          <w:fldChar w:fldCharType="separate"/>
+        </w:r>
+        <w:r>
+          <w:rPr>
+            <w:noProof/>
+            <w:webHidden/>
+          </w:rPr>
+          <w:t>19</w:t>
+        </w:r>
+        <w:r>
+          <w:rPr>
+            <w:noProof/>
+            <w:webHidden/>
+          </w:rPr>
+          <w:fldChar w:fldCharType="end"/>
+        </w:r>
+      </w:hyperlink>
+    </w:p>
+    <w:p>
+      <w:pPr>
+        <w:pStyle w:val="TableofFigures"/>
+        <w:tabs>
+          <w:tab w:val="right" w:leader="dot" w:pos="7346"/>
+        </w:tabs>
+        <w:spacing w:line="480" w:lineRule="auto"/>
+        <w:rPr>
+          <w:rFonts w:asciiTheme="minorHAnsi" w:eastAsiaTheme="minorEastAsia" w:hAnsiTheme="minorHAnsi" w:cstheme="minorBidi"/>
+          <w:noProof/>
+          <w:kern w:val="2"/>
+          <w:szCs w:val="24"/>
+          <w:lang w:val="en-ID" w:eastAsia="en-ID"/>
+          <w14:ligatures w14:val="standardContextual"/>
+        </w:rPr>
+      </w:pPr>
+      <w:hyperlink w:anchor="_Toc216192582" w:history="1">
+        <w:r>
+          <w:rPr>
+            <w:rStyle w:val="Hyperlink"/>
+            <w:noProof/>
+          </w:rPr>
+          <w:t>Gambar 3. 4 Rancangan Hardware</w:t>
+        </w:r>
+        <w:r>
+          <w:rPr>
+            <w:noProof/>
+            <w:webHidden/>
+          </w:rPr>
+          <w:tab/>
+        </w:r>
+        <w:r>
+          <w:rPr>
+            <w:noProof/>
+            <w:webHidden/>
+          </w:rPr>
+          <w:fldChar w:fldCharType="begin"/>
+        </w:r>
+        <w:r>
+          <w:rPr>
+            <w:noProof/>
+            <w:webHidden/>
+          </w:rPr>
+          <w:instrText xml:space="preserve"> PAGEREF _Toc216192582 \h </w:instrText>
+        </w:r>
+        <w:r>
+          <w:rPr>
+            <w:noProof/>
+            <w:webHidden/>
+          </w:rPr>
+        </w:r>
+        <w:r>
+          <w:rPr>
+            <w:noProof/>
+            <w:webHidden/>
+          </w:rPr>
+          <w:fldChar w:fldCharType="separate"/>
+        </w:r>
+        <w:r>
+          <w:rPr>
+            <w:noProof/>
+            <w:webHidden/>
+          </w:rPr>
+          <w:t>20</w:t>
+        </w:r>
+        <w:r>
+          <w:rPr>
+            <w:noProof/>
+            <w:webHidden/>
+          </w:rPr>
+          <w:fldChar w:fldCharType="end"/>
+        </w:r>
+      </w:hyperlink>
+    </w:p>
+    <w:p>
+      <w:pPr>
+        <w:pStyle w:val="TableofFigures"/>
+        <w:tabs>
+          <w:tab w:val="right" w:leader="dot" w:pos="7346"/>
+        </w:tabs>
+        <w:spacing w:line="480" w:lineRule="auto"/>
+        <w:rPr>
+          <w:rFonts w:asciiTheme="minorHAnsi" w:eastAsiaTheme="minorEastAsia" w:hAnsiTheme="minorHAnsi" w:cstheme="minorBidi"/>
+          <w:noProof/>
+          <w:kern w:val="2"/>
+          <w:szCs w:val="24"/>
+          <w:lang w:val="en-ID" w:eastAsia="en-ID"/>
+          <w14:ligatures w14:val="standardContextual"/>
+        </w:rPr>
+      </w:pPr>
+      <w:hyperlink w:anchor="_Toc216192583" w:history="1">
+        <w:r>
+          <w:rPr>
+            <w:rStyle w:val="Hyperlink"/>
+            <w:noProof/>
+          </w:rPr>
+          <w:t>Gambar 3. 5 Konfigurasi ESP32</w:t>
+        </w:r>
+        <w:r>
+          <w:rPr>
+            <w:noProof/>
+            <w:webHidden/>
+          </w:rPr>
+          <w:tab/>
+        </w:r>
+        <w:r>
+          <w:rPr>
+            <w:noProof/>
+            <w:webHidden/>
+          </w:rPr>
+          <w:fldChar w:fldCharType="begin"/>
+        </w:r>
+        <w:r>
+          <w:rPr>
+            <w:noProof/>
+            <w:webHidden/>
+          </w:rPr>
+          <w:instrText xml:space="preserve"> PAGEREF _Toc216192583 \h </w:instrText>
         </w:r>
         <w:r>
           <w:rPr>
@@ -5727,55 +6497,11 @@
     </w:p>
     <w:p>
       <w:pPr>
-        <w:spacing w:line="360" w:lineRule="auto"/>
-        <w:rPr>
-          <w:lang w:val="id-ID"/>
-        </w:rPr>
-      </w:pPr>
-      <w:r>
-        <w:rPr>
-          <w:lang w:val="id-ID"/>
-        </w:rPr>
-        <w:fldChar w:fldCharType="end"/>
-      </w:r>
-    </w:p>
-    <w:p>
-      <w:pPr>
-        <w:pStyle w:val="Heading1"/>
-        <w:rPr>
-          <w:lang w:val="id-ID"/>
-        </w:rPr>
-      </w:pPr>
-      <w:r>
-        <w:rPr>
-          <w:lang w:val="id-ID"/>
-        </w:rPr>
-        <w:br w:type="page"/>
-      </w:r>
-      <w:bookmarkStart w:id="5" w:name="_Toc215384853"/>
-      <w:r>
-        <w:rPr>
-          <w:lang w:val="id-ID"/>
-        </w:rPr>
-        <w:lastRenderedPageBreak/>
-        <w:t>DAFTAR GAMBAR</w:t>
-      </w:r>
-      <w:bookmarkEnd w:id="5"/>
-    </w:p>
-    <w:p>
-      <w:pPr>
-        <w:rPr>
-          <w:lang w:val="id-ID"/>
-        </w:rPr>
-      </w:pPr>
-    </w:p>
-    <w:p>
-      <w:pPr>
         <w:pStyle w:val="TableofFigures"/>
         <w:tabs>
           <w:tab w:val="right" w:leader="dot" w:pos="7346"/>
         </w:tabs>
-        <w:spacing w:line="360" w:lineRule="auto"/>
+        <w:spacing w:line="480" w:lineRule="auto"/>
         <w:rPr>
           <w:rFonts w:asciiTheme="minorHAnsi" w:eastAsiaTheme="minorEastAsia" w:hAnsiTheme="minorHAnsi" w:cstheme="minorBidi"/>
           <w:noProof/>
@@ -5785,31 +6511,13 @@
           <w14:ligatures w14:val="standardContextual"/>
         </w:rPr>
       </w:pPr>
-      <w:r>
-        <w:rPr>
-          <w:lang w:val="id-ID"/>
-        </w:rPr>
-        <w:fldChar w:fldCharType="begin"/>
-      </w:r>
-      <w:r>
-        <w:rPr>
-          <w:lang w:val="id-ID"/>
-        </w:rPr>
-        <w:instrText xml:space="preserve"> TOC \h \z \c "Gambar 2." </w:instrText>
-      </w:r>
-      <w:r>
-        <w:rPr>
-          <w:lang w:val="id-ID"/>
-        </w:rPr>
-        <w:fldChar w:fldCharType="separate"/>
-      </w:r>
-      <w:hyperlink w:anchor="_Toc215385583" w:history="1">
+      <w:hyperlink w:anchor="_Toc216192584" w:history="1">
         <w:r>
           <w:rPr>
             <w:rStyle w:val="Hyperlink"/>
             <w:noProof/>
           </w:rPr>
-          <w:t>Gambar 2. 1 ESP32</w:t>
+          <w:t>Gambar 3. 6 Konfigurasi GPS Neo-6M</w:t>
         </w:r>
         <w:r>
           <w:rPr>
@@ -5830,7 +6538,7 @@
             <w:noProof/>
             <w:webHidden/>
           </w:rPr>
-          <w:instrText xml:space="preserve"> PAGEREF _Toc215385583 \h </w:instrText>
+          <w:instrText xml:space="preserve"> PAGEREF _Toc216192584 \h </w:instrText>
         </w:r>
         <w:r>
           <w:rPr>
@@ -5850,7 +6558,7 @@
             <w:noProof/>
             <w:webHidden/>
           </w:rPr>
-          <w:t>7</w:t>
+          <w:t>22</w:t>
         </w:r>
         <w:r>
           <w:rPr>
@@ -5867,18 +6575,23 @@
         <w:tabs>
           <w:tab w:val="right" w:leader="dot" w:pos="7346"/>
         </w:tabs>
-        <w:spacing w:line="360" w:lineRule="auto"/>
-        <w:rPr>
+        <w:spacing w:line="480" w:lineRule="auto"/>
+        <w:rPr>
+          <w:rFonts w:asciiTheme="minorHAnsi" w:eastAsiaTheme="minorEastAsia" w:hAnsiTheme="minorHAnsi" w:cstheme="minorBidi"/>
           <w:noProof/>
-        </w:rPr>
-      </w:pPr>
-      <w:hyperlink w:anchor="_Toc215385584" w:history="1">
+          <w:kern w:val="2"/>
+          <w:szCs w:val="24"/>
+          <w:lang w:val="en-ID" w:eastAsia="en-ID"/>
+          <w14:ligatures w14:val="standardContextual"/>
+        </w:rPr>
+      </w:pPr>
+      <w:hyperlink w:anchor="_Toc216192585" w:history="1">
         <w:r>
           <w:rPr>
             <w:rStyle w:val="Hyperlink"/>
             <w:noProof/>
           </w:rPr>
-          <w:t>Gambar 2. 2 GPS NEO-6M</w:t>
+          <w:t>Gambar 3. 7 Konfigurasi ESP32-Cam</w:t>
         </w:r>
         <w:r>
           <w:rPr>
@@ -5899,7 +6612,7 @@
             <w:noProof/>
             <w:webHidden/>
           </w:rPr>
-          <w:instrText xml:space="preserve"> PAGEREF _Toc215385584 \h </w:instrText>
+          <w:instrText xml:space="preserve"> PAGEREF _Toc216192585 \h </w:instrText>
         </w:r>
         <w:r>
           <w:rPr>
@@ -5919,7 +6632,7 @@
             <w:noProof/>
             <w:webHidden/>
           </w:rPr>
-          <w:t>8</w:t>
+          <w:t>23</w:t>
         </w:r>
         <w:r>
           <w:rPr>
@@ -5929,30 +6642,6 @@
           <w:fldChar w:fldCharType="end"/>
         </w:r>
       </w:hyperlink>
-      <w:r>
-        <w:rPr>
-          <w:lang w:val="id-ID"/>
-        </w:rPr>
-        <w:fldChar w:fldCharType="end"/>
-      </w:r>
-      <w:r>
-        <w:rPr>
-          <w:lang w:val="id-ID"/>
-        </w:rPr>
-        <w:fldChar w:fldCharType="begin"/>
-      </w:r>
-      <w:r>
-        <w:rPr>
-          <w:lang w:val="id-ID"/>
-        </w:rPr>
-        <w:instrText xml:space="preserve"> TOC \h \z \c "Gambar 3." </w:instrText>
-      </w:r>
-      <w:r>
-        <w:rPr>
-          <w:lang w:val="id-ID"/>
-        </w:rPr>
-        <w:fldChar w:fldCharType="separate"/>
-      </w:r>
     </w:p>
     <w:p>
       <w:pPr>
@@ -5960,225 +6649,7 @@
         <w:tabs>
           <w:tab w:val="right" w:leader="dot" w:pos="7346"/>
         </w:tabs>
-        <w:spacing w:line="360" w:lineRule="auto"/>
-        <w:rPr>
-          <w:rFonts w:asciiTheme="minorHAnsi" w:eastAsiaTheme="minorEastAsia" w:hAnsiTheme="minorHAnsi" w:cstheme="minorBidi"/>
-          <w:noProof/>
-          <w:kern w:val="2"/>
-          <w:szCs w:val="24"/>
-          <w:lang w:val="en-ID" w:eastAsia="en-ID"/>
-          <w14:ligatures w14:val="standardContextual"/>
-        </w:rPr>
-      </w:pPr>
-      <w:hyperlink w:anchor="_Toc215385579" w:history="1">
-        <w:r>
-          <w:rPr>
-            <w:rStyle w:val="Hyperlink"/>
-            <w:noProof/>
-          </w:rPr>
-          <w:t>Gambar 3. 1 Tahapan Pengerjaan Penelitian</w:t>
-        </w:r>
-        <w:r>
-          <w:rPr>
-            <w:noProof/>
-            <w:webHidden/>
-          </w:rPr>
-          <w:tab/>
-        </w:r>
-        <w:r>
-          <w:rPr>
-            <w:noProof/>
-            <w:webHidden/>
-          </w:rPr>
-          <w:fldChar w:fldCharType="begin"/>
-        </w:r>
-        <w:r>
-          <w:rPr>
-            <w:noProof/>
-            <w:webHidden/>
-          </w:rPr>
-          <w:instrText xml:space="preserve"> PAGEREF _Toc215385579 \h </w:instrText>
-        </w:r>
-        <w:r>
-          <w:rPr>
-            <w:noProof/>
-            <w:webHidden/>
-          </w:rPr>
-        </w:r>
-        <w:r>
-          <w:rPr>
-            <w:noProof/>
-            <w:webHidden/>
-          </w:rPr>
-          <w:fldChar w:fldCharType="separate"/>
-        </w:r>
-        <w:r>
-          <w:rPr>
-            <w:noProof/>
-            <w:webHidden/>
-          </w:rPr>
-          <w:t>13</w:t>
-        </w:r>
-        <w:r>
-          <w:rPr>
-            <w:noProof/>
-            <w:webHidden/>
-          </w:rPr>
-          <w:fldChar w:fldCharType="end"/>
-        </w:r>
-      </w:hyperlink>
-    </w:p>
-    <w:p>
-      <w:pPr>
-        <w:pStyle w:val="TableofFigures"/>
-        <w:tabs>
-          <w:tab w:val="right" w:leader="dot" w:pos="7346"/>
-        </w:tabs>
-        <w:spacing w:line="360" w:lineRule="auto"/>
-        <w:rPr>
-          <w:rFonts w:asciiTheme="minorHAnsi" w:eastAsiaTheme="minorEastAsia" w:hAnsiTheme="minorHAnsi" w:cstheme="minorBidi"/>
-          <w:noProof/>
-          <w:kern w:val="2"/>
-          <w:szCs w:val="24"/>
-          <w:lang w:val="en-ID" w:eastAsia="en-ID"/>
-          <w14:ligatures w14:val="standardContextual"/>
-        </w:rPr>
-      </w:pPr>
-      <w:hyperlink w:anchor="_Toc215385580" w:history="1">
-        <w:r>
-          <w:rPr>
-            <w:rStyle w:val="Hyperlink"/>
-            <w:noProof/>
-          </w:rPr>
-          <w:t>Gambar 3. 2 Rancangan umum sistem</w:t>
-        </w:r>
-        <w:r>
-          <w:rPr>
-            <w:noProof/>
-            <w:webHidden/>
-          </w:rPr>
-          <w:tab/>
-        </w:r>
-        <w:r>
-          <w:rPr>
-            <w:noProof/>
-            <w:webHidden/>
-          </w:rPr>
-          <w:fldChar w:fldCharType="begin"/>
-        </w:r>
-        <w:r>
-          <w:rPr>
-            <w:noProof/>
-            <w:webHidden/>
-          </w:rPr>
-          <w:instrText xml:space="preserve"> PAGEREF _Toc215385580 \h </w:instrText>
-        </w:r>
-        <w:r>
-          <w:rPr>
-            <w:noProof/>
-            <w:webHidden/>
-          </w:rPr>
-        </w:r>
-        <w:r>
-          <w:rPr>
-            <w:noProof/>
-            <w:webHidden/>
-          </w:rPr>
-          <w:fldChar w:fldCharType="separate"/>
-        </w:r>
-        <w:r>
-          <w:rPr>
-            <w:noProof/>
-            <w:webHidden/>
-          </w:rPr>
-          <w:t>16</w:t>
-        </w:r>
-        <w:r>
-          <w:rPr>
-            <w:noProof/>
-            <w:webHidden/>
-          </w:rPr>
-          <w:fldChar w:fldCharType="end"/>
-        </w:r>
-      </w:hyperlink>
-    </w:p>
-    <w:p>
-      <w:pPr>
-        <w:pStyle w:val="TableofFigures"/>
-        <w:tabs>
-          <w:tab w:val="right" w:leader="dot" w:pos="7346"/>
-        </w:tabs>
-        <w:spacing w:line="360" w:lineRule="auto"/>
-        <w:rPr>
-          <w:rFonts w:asciiTheme="minorHAnsi" w:eastAsiaTheme="minorEastAsia" w:hAnsiTheme="minorHAnsi" w:cstheme="minorBidi"/>
-          <w:noProof/>
-          <w:kern w:val="2"/>
-          <w:szCs w:val="24"/>
-          <w:lang w:val="en-ID" w:eastAsia="en-ID"/>
-          <w14:ligatures w14:val="standardContextual"/>
-        </w:rPr>
-      </w:pPr>
-      <w:hyperlink w:anchor="_Toc215385581" w:history="1">
-        <w:r>
-          <w:rPr>
-            <w:rStyle w:val="Hyperlink"/>
-            <w:noProof/>
-          </w:rPr>
-          <w:t>Gambar 3. 3 Alur kerja sistem</w:t>
-        </w:r>
-        <w:r>
-          <w:rPr>
-            <w:noProof/>
-            <w:webHidden/>
-          </w:rPr>
-          <w:tab/>
-        </w:r>
-        <w:r>
-          <w:rPr>
-            <w:noProof/>
-            <w:webHidden/>
-          </w:rPr>
-          <w:fldChar w:fldCharType="begin"/>
-        </w:r>
-        <w:r>
-          <w:rPr>
-            <w:noProof/>
-            <w:webHidden/>
-          </w:rPr>
-          <w:instrText xml:space="preserve"> PAGEREF _Toc215385581 \h </w:instrText>
-        </w:r>
-        <w:r>
-          <w:rPr>
-            <w:noProof/>
-            <w:webHidden/>
-          </w:rPr>
-        </w:r>
-        <w:r>
-          <w:rPr>
-            <w:noProof/>
-            <w:webHidden/>
-          </w:rPr>
-          <w:fldChar w:fldCharType="separate"/>
-        </w:r>
-        <w:r>
-          <w:rPr>
-            <w:noProof/>
-            <w:webHidden/>
-          </w:rPr>
-          <w:t>17</w:t>
-        </w:r>
-        <w:r>
-          <w:rPr>
-            <w:noProof/>
-            <w:webHidden/>
-          </w:rPr>
-          <w:fldChar w:fldCharType="end"/>
-        </w:r>
-      </w:hyperlink>
-    </w:p>
-    <w:p>
-      <w:pPr>
-        <w:spacing w:line="360" w:lineRule="auto"/>
+        <w:spacing w:line="480" w:lineRule="auto"/>
         <w:rPr>
           <w:lang w:val="id-ID"/>
         </w:rPr>
@@ -6274,13 +6745,13 @@
         <w:fldChar w:fldCharType="begin"/>
       </w:r>
       <w:r>
-        <w:instrText xml:space="preserve"> ADDIN ZOTERO_ITEM CSL_CITATION {"citationID":"Qgz1gOil","properties":{"formattedCitation":"(Wibowo et al., 2019)","plainCitation":"(Wibowo et al., 2019)","noteIndex":0},"citationItems":[{"id":47,"uris":["http://zotero.org/users/local/40ttfIiH/items/7H6GF88R"],"itemData":{"id":47,"type":"article-journal","abstract":"One of the common problems experienced by animal farmers is heat stress or cold stress caused by changes in the environment. This resulted in a decrease in the productivity of livestock, cattle. Early monitoring needs to be done to avoid problems through monitoring tools for temperature, heart rate, and internet-based location of things (IoT). The monitor receives the value through the paired sensor and is sent to the web server. Users or breeders get information about the condition of farm animals and observe changes in value through graphs through the android application. The system built is able to receive values in a short interval time (10 seconds) so that the value obtained is the most recent value. Based on observations on the graph, the user can identify drastic changes, both decreases or increases, in the temperature and heart rate of the animal's condition and take precautions as early as possible.","container-title":"JURNAL ELTEK","DOI":"10.33795/eltek.v17i2.188","ISSN":"2355-0740, 1693-4024","issue":"2","journalAbbreviation":"eltek","language":"id","license":"http://creativecommons.org/licenses/by-nc-nd/4.0","page":"18","source":"DOI.org (Crossref)","title":"SISTEM CERDAS PEMANTAU HEWAN TERNAK PADA ALAM BEBAS BERBASIS INTERNET OF THINGS (IOT)","volume":"17","author":[{"family":"Wibowo","given":"Galih Hendra"},{"family":"Ayatullah","given":"Mohamad Dimyati"},{"family":"Prasetyo","given":"Junaedi Adi"}],"issued":{"date-parts":[["2019",11,11]]}}}],"schema":"https://github.com/citation-style-language/schema/raw/master/csl-citation.json"} </w:instrText>
+        <w:instrText xml:space="preserve"> ADDIN ZOTERO_ITEM CSL_CITATION {"citationID":"Qgz1gOil","properties":{"formattedCitation":"[1]","plainCitation":"[1]","noteIndex":0},"citationItems":[{"id":47,"uris":["http://zotero.org/users/local/40ttfIiH/items/7H6GF88R"],"itemData":{"id":47,"type":"article-journal","abstract":"One of the common problems experienced by animal farmers is heat stress or cold stress caused by changes in the environment. This resulted in a decrease in the productivity of livestock, cattle. Early monitoring needs to be done to avoid problems through monitoring tools for temperature, heart rate, and internet-based location of things (IoT). The monitor receives the value through the paired sensor and is sent to the web server. Users or breeders get information about the condition of farm animals and observe changes in value through graphs through the android application. The system built is able to receive values in a short interval time (10 seconds) so that the value obtained is the most recent value. Based on observations on the graph, the user can identify drastic changes, both decreases or increases, in the temperature and heart rate of the animal's condition and take precautions as early as possible.","container-title":"JURNAL ELTEK","DOI":"10.33795/eltek.v17i2.188","ISSN":"2355-0740, 1693-4024","issue":"2","journalAbbreviation":"eltek","language":"id","license":"http://creativecommons.org/licenses/by-nc-nd/4.0","page":"18","source":"DOI.org (Crossref)","title":"SISTEM CERDAS PEMANTAU HEWAN TERNAK PADA ALAM BEBAS BERBASIS INTERNET OF THINGS (IOT)","volume":"17","author":[{"family":"Wibowo","given":"Galih Hendra"},{"family":"Ayatullah","given":"Mohamad Dimyati"},{"family":"Prasetyo","given":"Junaedi Adi"}],"issued":{"date-parts":[["2019",11,11]]}}}],"schema":"https://github.com/citation-style-language/schema/raw/master/csl-citation.json"} </w:instrText>
       </w:r>
       <w:r>
         <w:fldChar w:fldCharType="separate"/>
       </w:r>
       <w:r>
-        <w:t>(Wibowo et al., 2019)</w:t>
+        <w:t>[1]</w:t>
       </w:r>
       <w:r>
         <w:fldChar w:fldCharType="end"/>
@@ -6334,13 +6805,13 @@
         <w:fldChar w:fldCharType="begin"/>
       </w:r>
       <w:r>
-        <w:instrText xml:space="preserve"> ADDIN ZOTERO_ITEM CSL_CITATION {"citationID":"fgROfMHh","properties":{"formattedCitation":"(kahaba.net, 2024)","plainCitation":"(kahaba.net, 2024)","noteIndex":0},"citationItems":[{"id":86,"uris":["http://zotero.org/users/local/40ttfIiH/items/WTPVU4CZ"],"itemData":{"id":86,"type":"post-weblog","abstract":"Kota Bima, Kahaba.- Asisten I Setda Kota Bima H Alwi Yasin mengungkapkan bahwa Kota Bima masih menghadapi masalah kebersihan dan hewan ternak yang berkeliaran. (Baca. Kota Bima Jadi Tuan Rumah Rakor Kominfo se-NTB, Bahas Sinergitas Program)  Pernyataan itu diungkap Alwi saat menyampaikan sambutan pada acara Rakor Kominfo se-NTB yang dihelat… – Baca selengkapnya di Kahaba.net","container-title":"https://kahaba.net","language":"id_ID","note":"section: Kabar Kota Bima","title":"Kota Bima Masih Jorok, Ternak Liar dan Pemerintah Terus Berbenah - Kabar Harian Bima","URL":"https://kahaba.net/kota-bima-masih-jorok-ternak-liar-dan-pemerintah-terus-berbenah","author":[{"literal":"kahaba.net"}],"accessed":{"date-parts":[["2025",11,27]]},"issued":{"date-parts":[["2024",3,5]]}}}],"schema":"https://github.com/citation-style-language/schema/raw/master/csl-citation.json"} </w:instrText>
+        <w:instrText xml:space="preserve"> ADDIN ZOTERO_ITEM CSL_CITATION {"citationID":"fgROfMHh","properties":{"formattedCitation":"[2]","plainCitation":"[2]","noteIndex":0},"citationItems":[{"id":86,"uris":["http://zotero.org/users/local/40ttfIiH/items/WTPVU4CZ"],"itemData":{"id":86,"type":"post-weblog","abstract":"Kota Bima, Kahaba.- Asisten I Setda Kota Bima H Alwi Yasin mengungkapkan bahwa Kota Bima masih menghadapi masalah kebersihan dan hewan ternak yang berkeliaran. (Baca. Kota Bima Jadi Tuan Rumah Rakor Kominfo se-NTB, Bahas Sinergitas Program)  Pernyataan itu diungkap Alwi saat menyampaikan sambutan pada acara Rakor Kominfo se-NTB yang dihelat… – Baca selengkapnya di Kahaba.net","container-title":"https://kahaba.net","language":"id_ID","note":"section: Kabar Kota Bima","title":"Kota Bima Masih Jorok, Ternak Liar dan Pemerintah Terus Berbenah - Kabar Harian Bima","URL":"https://kahaba.net/kota-bima-masih-jorok-ternak-liar-dan-pemerintah-terus-berbenah","author":[{"literal":"kahaba.net"}],"accessed":{"date-parts":[["2025",11,27]]},"issued":{"date-parts":[["2024",3,5]]}}}],"schema":"https://github.com/citation-style-language/schema/raw/master/csl-citation.json"} </w:instrText>
       </w:r>
       <w:r>
         <w:fldChar w:fldCharType="separate"/>
       </w:r>
       <w:r>
-        <w:t>(kahaba.net, 2024)</w:t>
+        <w:t>[2]</w:t>
       </w:r>
       <w:r>
         <w:fldChar w:fldCharType="end"/>
@@ -6404,13 +6875,13 @@
         <w:fldChar w:fldCharType="begin"/>
       </w:r>
       <w:r>
-        <w:instrText xml:space="preserve"> ADDIN ZOTERO_ITEM CSL_CITATION {"citationID":"Xulv5TLt","properties":{"formattedCitation":"(Muta\\uc0\\u8217{}affif et al., 2017)","plainCitation":"(Muta’affif et al., 2017)","noteIndex":0},"citationItems":[{"id":67,"uris":["http://zotero.org/users/local/40ttfIiH/items/2CRGJ33Q"],"itemData":{"id":67,"type":"article-journal","language":"id","source":"Zotero","title":"Sistem Kendali Peternakan Jarak Jauh Berbasis Internet of Things (IoT)","author":[{"family":"Muta’affif","given":"Muhammad Farish"},{"family":"Mujtahid","given":"Muhammad"},{"family":"Bari","given":"Bilal El"},{"family":"Evita","given":"Maria"}],"issued":{"date-parts":[["2017"]]}}}],"schema":"https://github.com/citation-style-language/schema/raw/master/csl-citation.json"} </w:instrText>
+        <w:instrText xml:space="preserve"> ADDIN ZOTERO_ITEM CSL_CITATION {"citationID":"Xulv5TLt","properties":{"formattedCitation":"[3]","plainCitation":"[3]","noteIndex":0},"citationItems":[{"id":67,"uris":["http://zotero.org/users/local/40ttfIiH/items/2CRGJ33Q"],"itemData":{"id":67,"type":"article-journal","language":"id","source":"Zotero","title":"Sistem Kendali Peternakan Jarak Jauh Berbasis Internet of Things (IoT)","author":[{"family":"Muta’affif","given":"Muhammad Farish"},{"family":"Mujtahid","given":"Muhammad"},{"family":"Bari","given":"Bilal El"},{"family":"Evita","given":"Maria"}],"issued":{"date-parts":[["2017"]]}}}],"schema":"https://github.com/citation-style-language/schema/raw/master/csl-citation.json"} </w:instrText>
       </w:r>
       <w:r>
         <w:fldChar w:fldCharType="separate"/>
       </w:r>
       <w:r>
-        <w:t>(Muta’affif et al., 2017)</w:t>
+        <w:t>[3]</w:t>
       </w:r>
       <w:r>
         <w:fldChar w:fldCharType="end"/>
@@ -6433,7 +6904,13 @@
         <w:rPr>
           <w:szCs w:val="24"/>
         </w:rPr>
-        <w:t>Berkat perkembangan teknologi Internet of Things (IoT), perangkat cerdas seperti ESP32 kini dapat digunakan untuk mengumpulkan data dari berbagai sensor yang tersedia</w:t>
+        <w:t>P</w:t>
+      </w:r>
+      <w:r>
+        <w:rPr>
+          <w:szCs w:val="24"/>
+        </w:rPr>
+        <w:t>erkembangan teknologi Internet of Things (IoT), perangkat cerdas seperti ESP32 kini dapat digunakan untuk mengumpulkan data dari berbagai sensor yang tersedia</w:t>
       </w:r>
       <w:r>
         <w:rPr>
@@ -6451,7 +6928,7 @@
         <w:rPr>
           <w:szCs w:val="24"/>
         </w:rPr>
-        <w:instrText xml:space="preserve"> ADDIN ZOTERO_ITEM CSL_CITATION {"citationID":"RcCi8TAC","properties":{"formattedCitation":"(Al-Fajri, n.d.)","plainCitation":"(Al-Fajri, n.d.)","noteIndex":0},"citationItems":[{"id":69,"uris":["http://zotero.org/users/local/40ttfIiH/items/FHH7IBZB"],"itemData":{"id":69,"type":"article-journal","abstract":"Dried fish is a food product that is preserved using sunlight. This drying process is very dependent on environmental conditions such as weather and takes a long time. This study aims to design a fish drying system that aims to speed up the drying process. The system is designed to use the ESP32 microcontroller as the control center. The Internet of Things application is used as a monitoring system for temperature, humidity, current, voltage and electrical energy used during the drying process. Based on the results of research that has been tested the fish drying process using a fish drying machine is determined based on the temperature and humidity produced, so that if the fish drying machine temperature is above 80 Celsius, the fish drying process is faster.","language":"id","source":"Zotero","title":"Rancang Bangun Alat Pengering Ikan dengan Memonitoring Suhu dan Kelembapan Berbasis Internet of Things (IoT)","author":[{"family":"Al-Fajri","given":"Syukron"}]}}],"schema":"https://github.com/citation-style-language/schema/raw/master/csl-citation.json"} </w:instrText>
+        <w:instrText xml:space="preserve"> ADDIN ZOTERO_ITEM CSL_CITATION {"citationID":"RcCi8TAC","properties":{"formattedCitation":"[4]","plainCitation":"[4]","noteIndex":0},"citationItems":[{"id":69,"uris":["http://zotero.org/users/local/40ttfIiH/items/FHH7IBZB"],"itemData":{"id":69,"type":"article-journal","abstract":"Dried fish is a food product that is preserved using sunlight. This drying process is very dependent on environmental conditions such as weather and takes a long time. This study aims to design a fish drying system that aims to speed up the drying process. The system is designed to use the ESP32 microcontroller as the control center. The Internet of Things application is used as a monitoring system for temperature, humidity, current, voltage and electrical energy used during the drying process. Based on the results of research that has been tested the fish drying process using a fish drying machine is determined based on the temperature and humidity produced, so that if the fish drying machine temperature is above 80 Celsius, the fish drying process is faster.","language":"id","source":"Zotero","title":"Rancang Bangun Alat Pengering Ikan dengan Memonitoring Suhu dan Kelembapan Berbasis Internet of Things (IoT)","author":[{"family":"Al-Fajri","given":"Syukron"}]}}],"schema":"https://github.com/citation-style-language/schema/raw/master/csl-citation.json"} </w:instrText>
       </w:r>
       <w:r>
         <w:rPr>
@@ -6460,7 +6937,7 @@
         <w:fldChar w:fldCharType="separate"/>
       </w:r>
       <w:r>
-        <w:t>(Al-Fajri, n.d.)</w:t>
+        <w:t>[4]</w:t>
       </w:r>
       <w:r>
         <w:rPr>
@@ -6490,7 +6967,7 @@
         <w:rPr>
           <w:szCs w:val="24"/>
         </w:rPr>
-        <w:instrText xml:space="preserve"> ADDIN ZOTERO_ITEM CSL_CITATION {"citationID":"esT1mmFg","properties":{"formattedCitation":"(Tambunan &amp; Putra, 2019)","plainCitation":"(Tambunan &amp; Putra, 2019)","noteIndex":0},"citationItems":[{"id":51,"uris":["http://zotero.org/users/local/40ttfIiH/items/5GJEVCRZ"],"itemData":{"id":51,"type":"article-journal","abstract":"Vehicle tracking system based on GPS (Global Positioning System) by using SMS gateway communication is a system where the position of a vehicle can be known with certainty. This tracking system uses Arduino Nano as a microcontroller, GPS module technology to determine the position of the vehicle and the SMS gateway device to communicate via Smartphone. With the Google maps application on the Smartphone, it is easy to track the position of the vehicle. The vehicle can be controlled by turning off and turning on remotely with the SMS gateway device via text message media on the Smartphone.","container-title":"JSR : Jaringan Sistem Informasi Robotik","DOI":"10.58486/jsr.v3i1.41","ISSN":"2579-373X, 2356-2137","issue":"1","journalAbbreviation":"JSR","language":"id","page":"152-160","source":"DOI.org (Crossref)","title":"SISTEM KONTROL KENDARAAN BERBASIS IOT","volume":"3","author":[{"family":"Tambunan","given":"Leonard"},{"family":"Putra","given":"Diki Dwi"}],"issued":{"date-parts":[["2019",7,29]]}}}],"schema":"https://github.com/citation-style-language/schema/raw/master/csl-citation.json"} </w:instrText>
+        <w:instrText xml:space="preserve"> ADDIN ZOTERO_ITEM CSL_CITATION {"citationID":"esT1mmFg","properties":{"formattedCitation":"[5]","plainCitation":"[5]","noteIndex":0},"citationItems":[{"id":51,"uris":["http://zotero.org/users/local/40ttfIiH/items/5GJEVCRZ"],"itemData":{"id":51,"type":"article-journal","abstract":"Vehicle tracking system based on GPS (Global Positioning System) by using SMS gateway communication is a system where the position of a vehicle can be known with certainty. This tracking system uses Arduino Nano as a microcontroller, GPS module technology to determine the position of the vehicle and the SMS gateway device to communicate via Smartphone. With the Google maps application on the Smartphone, it is easy to track the position of the vehicle. The vehicle can be controlled by turning off and turning on remotely with the SMS gateway device via text message media on the Smartphone.","container-title":"JSR : Jaringan Sistem Informasi Robotik","DOI":"10.58486/jsr.v3i1.41","ISSN":"2579-373X, 2356-2137","issue":"1","journalAbbreviation":"JSR","language":"id","page":"152-160","source":"DOI.org (Crossref)","title":"SISTEM KONTROL KENDARAAN BERBASIS IOT","volume":"3","author":[{"family":"Tambunan","given":"Leonard"},{"family":"Putra","given":"Diki Dwi"}],"issued":{"date-parts":[["2019",7,29]]}}}],"schema":"https://github.com/citation-style-language/schema/raw/master/csl-citation.json"} </w:instrText>
       </w:r>
       <w:r>
         <w:rPr>
@@ -6499,7 +6976,7 @@
         <w:fldChar w:fldCharType="separate"/>
       </w:r>
       <w:r>
-        <w:t>(Tambunan &amp; Putra, 2019)</w:t>
+        <w:t>[5]</w:t>
       </w:r>
       <w:r>
         <w:rPr>
@@ -6547,7 +7024,7 @@
         <w:rPr>
           <w:szCs w:val="24"/>
         </w:rPr>
-        <w:instrText xml:space="preserve"> ADDIN ZOTERO_ITEM CSL_CITATION {"citationID":"OTsMfLjV","properties":{"formattedCitation":"(Rifaini et al., 2022)","plainCitation":"(Rifaini et al., 2022)","noteIndex":0},"citationItems":[{"id":73,"uris":["http://zotero.org/users/local/40ttfIiH/items/39J7XYVY"],"itemData":{"id":73,"type":"article-journal","abstract":"In addition to rations and drinking water, the quality of the cage must also be considered to support increased productivity and poultry farming. Choosing a location far from settlements can make predators one of the barriers for pet owners, killing animals because they are hunted by wild animals. This study aims to protect livestock from predators by making traps to catch predators. This security system uses Internet of Things (IoT) technology to provide real-time data information when predators are caught in the traps created. PIR sensors are used to detect the presence of trapped animals. The ESP32Cam is used as a microcontroller which processes the data via the telegram application and sends it to the guard's cell phone. The result of this research is security that can detect the presence of predators that can send data in text or photo format. This system is expected to provide convenience and comfort for poultry farm owners.","container-title":"Jurnal Teknik dan Sistem Komputer","DOI":"10.33365/jtikom.v2i2.1486","ISSN":"2723-6382","issue":"2","journalAbbreviation":"JTIKOM","language":"id","license":"https://creativecommons.org/licenses/by-sa/4.0","page":"52-63","source":"DOI.org (Crossref)","title":"ALAT PERANGKAP DAN KAMERA PENGAWAS DENGAN MENGGUNAKAN ESP32-CAM SEBAGAI SISTEM KEAMANAN KANDANG AYAM","volume":"2","author":[{"family":"Rifaini","given":"Arinda"},{"family":"Sintaro","given":"Sanriomi"},{"family":"Surahman","given":"Ade"}],"issued":{"date-parts":[["2022",1,7]]}}}],"schema":"https://github.com/citation-style-language/schema/raw/master/csl-citation.json"} </w:instrText>
+        <w:instrText xml:space="preserve"> ADDIN ZOTERO_ITEM CSL_CITATION {"citationID":"OTsMfLjV","properties":{"formattedCitation":"[6]","plainCitation":"[6]","noteIndex":0},"citationItems":[{"id":73,"uris":["http://zotero.org/users/local/40ttfIiH/items/39J7XYVY"],"itemData":{"id":73,"type":"article-journal","abstract":"In addition to rations and drinking water, the quality of the cage must also be considered to support increased productivity and poultry farming. Choosing a location far from settlements can make predators one of the barriers for pet owners, killing animals because they are hunted by wild animals. This study aims to protect livestock from predators by making traps to catch predators. This security system uses Internet of Things (IoT) technology to provide real-time data information when predators are caught in the traps created. PIR sensors are used to detect the presence of trapped animals. The ESP32Cam is used as a microcontroller which processes the data via the telegram application and sends it to the guard's cell phone. The result of this research is security that can detect the presence of predators that can send data in text or photo format. This system is expected to provide convenience and comfort for poultry farm owners.","container-title":"Jurnal Teknik dan Sistem Komputer","DOI":"10.33365/jtikom.v2i2.1486","ISSN":"2723-6382","issue":"2","journalAbbreviation":"JTIKOM","language":"id","license":"https://creativecommons.org/licenses/by-sa/4.0","page":"52-63","source":"DOI.org (Crossref)","title":"ALAT PERANGKAP DAN KAMERA PENGAWAS DENGAN MENGGUNAKAN ESP32-CAM SEBAGAI SISTEM KEAMANAN KANDANG AYAM","volume":"2","author":[{"family":"Rifaini","given":"Arinda"},{"family":"Sintaro","given":"Sanriomi"},{"family":"Surahman","given":"Ade"}],"issued":{"date-parts":[["2022",1,7]]}}}],"schema":"https://github.com/citation-style-language/schema/raw/master/csl-citation.json"} </w:instrText>
       </w:r>
       <w:r>
         <w:rPr>
@@ -6556,7 +7033,7 @@
         <w:fldChar w:fldCharType="separate"/>
       </w:r>
       <w:r>
-        <w:t>(Rifaini et al., 2022)</w:t>
+        <w:t>[6]</w:t>
       </w:r>
       <w:r>
         <w:rPr>
@@ -6687,7 +7164,7 @@
         <w:rPr>
           <w:szCs w:val="24"/>
         </w:rPr>
-        <w:instrText xml:space="preserve"> ADDIN ZOTERO_ITEM CSL_CITATION {"citationID":"xAziw3I1","properties":{"formattedCitation":"(Muta\\uc0\\u8217{}affif et al., 2017)","plainCitation":"(Muta’affif et al., 2017)","noteIndex":0},"citationItems":[{"id":67,"uris":["http://zotero.org/users/local/40ttfIiH/items/2CRGJ33Q"],"itemData":{"id":67,"type":"article-journal","language":"id","source":"Zotero","title":"Sistem Kendali Peternakan Jarak Jauh Berbasis Internet of Things (IoT)","author":[{"family":"Muta’affif","given":"Muhammad Farish"},{"family":"Mujtahid","given":"Muhammad"},{"family":"Bari","given":"Bilal El"},{"family":"Evita","given":"Maria"}],"issued":{"date-parts":[["2017"]]}}}],"schema":"https://github.com/citation-style-language/schema/raw/master/csl-citation.json"} </w:instrText>
+        <w:instrText xml:space="preserve"> ADDIN ZOTERO_ITEM CSL_CITATION {"citationID":"xAziw3I1","properties":{"formattedCitation":"[3]","plainCitation":"[3]","noteIndex":0},"citationItems":[{"id":67,"uris":["http://zotero.org/users/local/40ttfIiH/items/2CRGJ33Q"],"itemData":{"id":67,"type":"article-journal","language":"id","source":"Zotero","title":"Sistem Kendali Peternakan Jarak Jauh Berbasis Internet of Things (IoT)","author":[{"family":"Muta’affif","given":"Muhammad Farish"},{"family":"Mujtahid","given":"Muhammad"},{"family":"Bari","given":"Bilal El"},{"family":"Evita","given":"Maria"}],"issued":{"date-parts":[["2017"]]}}}],"schema":"https://github.com/citation-style-language/schema/raw/master/csl-citation.json"} </w:instrText>
       </w:r>
       <w:r>
         <w:rPr>
@@ -6696,7 +7173,7 @@
         <w:fldChar w:fldCharType="separate"/>
       </w:r>
       <w:r>
-        <w:t>(Muta’affif et al., 2017)</w:t>
+        <w:t>[3]</w:t>
       </w:r>
       <w:r>
         <w:rPr>
@@ -6720,7 +7197,7 @@
         <w:rPr>
           <w:szCs w:val="24"/>
         </w:rPr>
-        <w:instrText xml:space="preserve"> ADDIN ZOTERO_ITEM CSL_CITATION {"citationID":"tQPPkeel","properties":{"formattedCitation":"(Wibowo et al., 2019)","plainCitation":"(Wibowo et al., 2019)","noteIndex":0},"citationItems":[{"id":47,"uris":["http://zotero.org/users/local/40ttfIiH/items/7H6GF88R"],"itemData":{"id":47,"type":"article-journal","abstract":"One of the common problems experienced by animal farmers is heat stress or cold stress caused by changes in the environment. This resulted in a decrease in the productivity of livestock, cattle. Early monitoring needs to be done to avoid problems through monitoring tools for temperature, heart rate, and internet-based location of things (IoT). The monitor receives the value through the paired sensor and is sent to the web server. Users or breeders get information about the condition of farm animals and observe changes in value through graphs through the android application. The system built is able to receive values in a short interval time (10 seconds) so that the value obtained is the most recent value. Based on observations on the graph, the user can identify drastic changes, both decreases or increases, in the temperature and heart rate of the animal's condition and take precautions as early as possible.","container-title":"JURNAL ELTEK","DOI":"10.33795/eltek.v17i2.188","ISSN":"2355-0740, 1693-4024","issue":"2","journalAbbreviation":"eltek","language":"id","license":"http://creativecommons.org/licenses/by-nc-nd/4.0","page":"18","source":"DOI.org (Crossref)","title":"SISTEM CERDAS PEMANTAU HEWAN TERNAK PADA ALAM BEBAS BERBASIS INTERNET OF THINGS (IOT)","volume":"17","author":[{"family":"Wibowo","given":"Galih Hendra"},{"family":"Ayatullah","given":"Mohamad Dimyati"},{"family":"Prasetyo","given":"Junaedi Adi"}],"issued":{"date-parts":[["2019",11,11]]}}}],"schema":"https://github.com/citation-style-language/schema/raw/master/csl-citation.json"} </w:instrText>
+        <w:instrText xml:space="preserve"> ADDIN ZOTERO_ITEM CSL_CITATION {"citationID":"tQPPkeel","properties":{"formattedCitation":"[1]","plainCitation":"[1]","noteIndex":0},"citationItems":[{"id":47,"uris":["http://zotero.org/users/local/40ttfIiH/items/7H6GF88R"],"itemData":{"id":47,"type":"article-journal","abstract":"One of the common problems experienced by animal farmers is heat stress or cold stress caused by changes in the environment. This resulted in a decrease in the productivity of livestock, cattle. Early monitoring needs to be done to avoid problems through monitoring tools for temperature, heart rate, and internet-based location of things (IoT). The monitor receives the value through the paired sensor and is sent to the web server. Users or breeders get information about the condition of farm animals and observe changes in value through graphs through the android application. The system built is able to receive values in a short interval time (10 seconds) so that the value obtained is the most recent value. Based on observations on the graph, the user can identify drastic changes, both decreases or increases, in the temperature and heart rate of the animal's condition and take precautions as early as possible.","container-title":"JURNAL ELTEK","DOI":"10.33795/eltek.v17i2.188","ISSN":"2355-0740, 1693-4024","issue":"2","journalAbbreviation":"eltek","language":"id","license":"http://creativecommons.org/licenses/by-nc-nd/4.0","page":"18","source":"DOI.org (Crossref)","title":"SISTEM CERDAS PEMANTAU HEWAN TERNAK PADA ALAM BEBAS BERBASIS INTERNET OF THINGS (IOT)","volume":"17","author":[{"family":"Wibowo","given":"Galih Hendra"},{"family":"Ayatullah","given":"Mohamad Dimyati"},{"family":"Prasetyo","given":"Junaedi Adi"}],"issued":{"date-parts":[["2019",11,11]]}}}],"schema":"https://github.com/citation-style-language/schema/raw/master/csl-citation.json"} </w:instrText>
       </w:r>
       <w:r>
         <w:rPr>
@@ -6729,7 +7206,7 @@
         <w:fldChar w:fldCharType="separate"/>
       </w:r>
       <w:r>
-        <w:t>(Wibowo et al., 2019)</w:t>
+        <w:t>[1]</w:t>
       </w:r>
       <w:r>
         <w:rPr>
@@ -6753,7 +7230,7 @@
         <w:rPr>
           <w:szCs w:val="24"/>
         </w:rPr>
-        <w:instrText xml:space="preserve"> ADDIN ZOTERO_ITEM CSL_CITATION {"citationID":"mxDvLDXT","properties":{"formattedCitation":"(Angriawan &amp; Anugraha, 2019)","plainCitation":"(Angriawan &amp; Anugraha, 2019)","noteIndex":0},"citationItems":[{"id":49,"uris":["http://zotero.org/users/local/40ttfIiH/items/RJBYXNBW"],"itemData":{"id":49,"type":"article-journal","abstract":"The development of communication technology is currently growing rapidly in the Internet of Things (IoT), it has developed in various aspects of human life. One of them is the efficiency of tracking mobile objects. There are many types of communication available. Cellular communication is one of the most common and widely used, but it has a problem like some locations are not covered by cellular networks. To overcome this problem, in this paper we proposed to use Lora for sending the location of the cow. LoRa sending data from Node to the Gateway and forwarded to the internet. The implementation results of sending data from Node to Gateway shows that the distance is directly proportional to the loss of data and signal strength (RSSI). For example, a distance of 1 km with the RSSI -98 the number of lost packages is around 2 and the furthest distance is 2.5 km with RSSI -128 the number of lost packages is about 19.","container-title":"Inspiration: Jurnal Teknologi Informasi dan Komunikasi","DOI":"10.35585/inspir.v9i1.2494","ISSN":"2621-5608, 2088-6705","issue":"1","journalAbbreviation":"j. inspir.","language":"id","page":"33","source":"DOI.org (Crossref)","title":"Sistem Pelacak Lokasi Sapi dengan Sistem Komunikasi LoRa","volume":"9","author":[{"family":"Angriawan","given":"Randy"},{"family":"Anugraha","given":"Nurhajar"}],"issued":{"date-parts":[["2019",6,15]]}}}],"schema":"https://github.com/citation-style-language/schema/raw/master/csl-citation.json"} </w:instrText>
+        <w:instrText xml:space="preserve"> ADDIN ZOTERO_ITEM CSL_CITATION {"citationID":"mxDvLDXT","properties":{"formattedCitation":"[7]","plainCitation":"[7]","noteIndex":0},"citationItems":[{"id":49,"uris":["http://zotero.org/users/local/40ttfIiH/items/RJBYXNBW"],"itemData":{"id":49,"type":"article-journal","abstract":"The development of communication technology is currently growing rapidly in the Internet of Things (IoT), it has developed in various aspects of human life. One of them is the efficiency of tracking mobile objects. There are many types of communication available. Cellular communication is one of the most common and widely used, but it has a problem like some locations are not covered by cellular networks. To overcome this problem, in this paper we proposed to use Lora for sending the location of the cow. LoRa sending data from Node to the Gateway and forwarded to the internet. The implementation results of sending data from Node to Gateway shows that the distance is directly proportional to the loss of data and signal strength (RSSI). For example, a distance of 1 km with the RSSI -98 the number of lost packages is around 2 and the furthest distance is 2.5 km with RSSI -128 the number of lost packages is about 19.","container-title":"Inspiration: Jurnal Teknologi Informasi dan Komunikasi","DOI":"10.35585/inspir.v9i1.2494","ISSN":"2621-5608, 2088-6705","issue":"1","journalAbbreviation":"j. inspir.","language":"id","page":"33","source":"DOI.org (Crossref)","title":"Sistem Pelacak Lokasi Sapi dengan Sistem Komunikasi LoRa","volume":"9","author":[{"family":"Angriawan","given":"Randy"},{"family":"Anugraha","given":"Nurhajar"}],"issued":{"date-parts":[["2019",6,15]]}}}],"schema":"https://github.com/citation-style-language/schema/raw/master/csl-citation.json"} </w:instrText>
       </w:r>
       <w:r>
         <w:rPr>
@@ -6762,7 +7239,7 @@
         <w:fldChar w:fldCharType="separate"/>
       </w:r>
       <w:r>
-        <w:t>(Angriawan &amp; Anugraha, 2019)</w:t>
+        <w:t>[7]</w:t>
       </w:r>
       <w:r>
         <w:rPr>
@@ -6798,7 +7275,6 @@
         <w:rPr>
           <w:szCs w:val="24"/>
         </w:rPr>
-        <w:lastRenderedPageBreak/>
         <w:t xml:space="preserve">mengembangkan sistem kontrol </w:t>
       </w:r>
       <w:r>
@@ -6847,7 +7323,7 @@
         <w:rPr>
           <w:szCs w:val="24"/>
         </w:rPr>
-        <w:instrText xml:space="preserve"> ADDIN ZOTERO_ITEM CSL_CITATION {"citationID":"iZol01DJ","properties":{"formattedCitation":"(Tambunan &amp; Putra, 2019)","plainCitation":"(Tambunan &amp; Putra, 2019)","noteIndex":0},"citationItems":[{"id":51,"uris":["http://zotero.org/users/local/40ttfIiH/items/5GJEVCRZ"],"itemData":{"id":51,"type":"article-journal","abstract":"Vehicle tracking system based on GPS (Global Positioning System) by using SMS gateway communication is a system where the position of a vehicle can be known with certainty. This tracking system uses Arduino Nano as a microcontroller, GPS module technology to determine the position of the vehicle and the SMS gateway device to communicate via Smartphone. With the Google maps application on the Smartphone, it is easy to track the position of the vehicle. The vehicle can be controlled by turning off and turning on remotely with the SMS gateway device via text message media on the Smartphone.","container-title":"JSR : Jaringan Sistem Informasi Robotik","DOI":"10.58486/jsr.v3i1.41","ISSN":"2579-373X, 2356-2137","issue":"1","journalAbbreviation":"JSR","language":"id","page":"152-160","source":"DOI.org (Crossref)","title":"SISTEM KONTROL KENDARAAN BERBASIS IOT","volume":"3","author":[{"family":"Tambunan","given":"Leonard"},{"family":"Putra","given":"Diki Dwi"}],"issued":{"date-parts":[["2019",7,29]]}}}],"schema":"https://github.com/citation-style-language/schema/raw/master/csl-citation.json"} </w:instrText>
+        <w:instrText xml:space="preserve"> ADDIN ZOTERO_ITEM CSL_CITATION {"citationID":"iZol01DJ","properties":{"formattedCitation":"[5]","plainCitation":"[5]","noteIndex":0},"citationItems":[{"id":51,"uris":["http://zotero.org/users/local/40ttfIiH/items/5GJEVCRZ"],"itemData":{"id":51,"type":"article-journal","abstract":"Vehicle tracking system based on GPS (Global Positioning System) by using SMS gateway communication is a system where the position of a vehicle can be known with certainty. This tracking system uses Arduino Nano as a microcontroller, GPS module technology to determine the position of the vehicle and the SMS gateway device to communicate via Smartphone. With the Google maps application on the Smartphone, it is easy to track the position of the vehicle. The vehicle can be controlled by turning off and turning on remotely with the SMS gateway device via text message media on the Smartphone.","container-title":"JSR : Jaringan Sistem Informasi Robotik","DOI":"10.58486/jsr.v3i1.41","ISSN":"2579-373X, 2356-2137","issue":"1","journalAbbreviation":"JSR","language":"id","page":"152-160","source":"DOI.org (Crossref)","title":"SISTEM KONTROL KENDARAAN BERBASIS IOT","volume":"3","author":[{"family":"Tambunan","given":"Leonard"},{"family":"Putra","given":"Diki Dwi"}],"issued":{"date-parts":[["2019",7,29]]}}}],"schema":"https://github.com/citation-style-language/schema/raw/master/csl-citation.json"} </w:instrText>
       </w:r>
       <w:r>
         <w:rPr>
@@ -6856,7 +7332,7 @@
         <w:fldChar w:fldCharType="separate"/>
       </w:r>
       <w:r>
-        <w:t>(Tambunan &amp; Putra, 2019)</w:t>
+        <w:t>[5]</w:t>
       </w:r>
       <w:r>
         <w:rPr>
@@ -7106,6 +7582,7 @@
           <w:ilvl w:val="1"/>
           <w:numId w:val="5"/>
         </w:numPr>
+        <w:ind w:left="284"/>
         <w:rPr>
           <w:lang w:val="en-ID"/>
         </w:rPr>
@@ -7191,6 +7668,7 @@
           <w:ilvl w:val="1"/>
           <w:numId w:val="5"/>
         </w:numPr>
+        <w:ind w:left="284"/>
         <w:rPr>
           <w:lang w:val="en-ID"/>
         </w:rPr>
@@ -7285,6 +7763,7 @@
         <w:rPr>
           <w:szCs w:val="24"/>
         </w:rPr>
+        <w:lastRenderedPageBreak/>
         <w:t>Perangkat GPS yang digunakan adalah modul GPS NEO-6M</w:t>
       </w:r>
       <w:r>
@@ -7312,7 +7791,6 @@
           <w:szCs w:val="24"/>
           <w:lang w:val="en-ID"/>
         </w:rPr>
-        <w:lastRenderedPageBreak/>
         <w:t xml:space="preserve">Sistem </w:t>
       </w:r>
       <w:r>
@@ -7414,6 +7892,7 @@
           <w:numId w:val="5"/>
         </w:numPr>
         <w:spacing w:line="360" w:lineRule="auto"/>
+        <w:ind w:left="284" w:hanging="426"/>
         <w:rPr>
           <w:lang w:val="en-ID"/>
         </w:rPr>
@@ -7524,19 +8003,7 @@
         <w:rPr>
           <w:szCs w:val="24"/>
         </w:rPr>
-        <w:t xml:space="preserve">Diharapkan </w:t>
-      </w:r>
-      <w:r>
-        <w:rPr>
-          <w:szCs w:val="24"/>
-        </w:rPr>
-        <w:t>membantu penanganan apabila terjadi kecelakaan pada hewan ternak serta memastikan hewan tetap berada dalam area peternakan</w:t>
-      </w:r>
-      <w:r>
-        <w:rPr>
-          <w:szCs w:val="24"/>
-        </w:rPr>
-        <w:t>.</w:t>
+        <w:t>Diharapkan meningkatkan efektivitas pengelolaan dan pemantauan hewan ternak melalui penyediaan informasi real-time yang akurat dan mudah diakses oleh peternak dari jarak jauh</w:t>
       </w:r>
     </w:p>
     <w:p>
@@ -7721,6 +8188,7 @@
         <w:rPr>
           <w:szCs w:val="24"/>
         </w:rPr>
+        <w:lastRenderedPageBreak/>
         <w:t>sehingga menimbulkan kecelakaan hewan ternak terhadap pengguna jalan</w:t>
       </w:r>
     </w:p>
@@ -7731,6 +8199,7 @@
           <w:ilvl w:val="1"/>
           <w:numId w:val="5"/>
         </w:numPr>
+        <w:ind w:left="284"/>
         <w:rPr>
           <w:lang w:val="en-ID"/>
         </w:rPr>
@@ -7740,13 +8209,13 @@
         <w:rPr>
           <w:lang w:val="en-ID"/>
         </w:rPr>
-        <w:lastRenderedPageBreak/>
         <w:t>Sistematika Penulisan</w:t>
       </w:r>
       <w:bookmarkEnd w:id="12"/>
     </w:p>
     <w:p>
       <w:pPr>
+        <w:ind w:left="284"/>
         <w:rPr>
           <w:szCs w:val="24"/>
           <w:lang w:val="en-ID"/>
@@ -7933,6 +8402,7 @@
           <w:ilvl w:val="1"/>
           <w:numId w:val="6"/>
         </w:numPr>
+        <w:ind w:left="0"/>
         <w:rPr>
           <w:lang w:val="id-ID"/>
         </w:rPr>
@@ -7954,6 +8424,7 @@
           <w:numId w:val="6"/>
         </w:numPr>
         <w:spacing w:line="480" w:lineRule="auto"/>
+        <w:ind w:left="709"/>
         <w:rPr>
           <w:lang w:val="id-ID"/>
         </w:rPr>
@@ -8002,7 +8473,7 @@
         <w:rPr>
           <w:szCs w:val="24"/>
         </w:rPr>
-        <w:instrText xml:space="preserve"> ADDIN ZOTERO_ITEM CSL_CITATION {"citationID":"mhjpMZLg","properties":{"formattedCitation":"(Sukanteri et al., n.d.)","plainCitation":"(Sukanteri et al., n.d.)","noteIndex":0},"citationItems":[{"id":75,"uris":["http://zotero.org/users/local/40ttfIiH/items/BT8L7MLE"],"itemData":{"id":75,"type":"article-journal","language":"id","source":"Zotero","title":"TEKNOLOGI PERTANIAN TERPADU BERBASIS FILOSOFI TRI HITA KARANA DALAM USAHATANI MENUJU PERTANIAN ORGANIK","author":[{"family":"Sukanteri","given":"Ni Putu"},{"family":"Suparyana","given":"Pande Komang"},{"family":"Suryana","given":"I Made"},{"family":"Setyawan","given":"I Made Dedy"}]}}],"schema":"https://github.com/citation-style-language/schema/raw/master/csl-citation.json"} </w:instrText>
+        <w:instrText xml:space="preserve"> ADDIN ZOTERO_ITEM CSL_CITATION {"citationID":"mhjpMZLg","properties":{"formattedCitation":"[8]","plainCitation":"[8]","noteIndex":0},"citationItems":[{"id":75,"uris":["http://zotero.org/users/local/40ttfIiH/items/BT8L7MLE"],"itemData":{"id":75,"type":"article-journal","language":"id","source":"Zotero","title":"TEKNOLOGI PERTANIAN TERPADU BERBASIS FILOSOFI TRI HITA KARANA DALAM USAHATANI MENUJU PERTANIAN ORGANIK","author":[{"family":"Sukanteri","given":"Ni Putu"},{"family":"Suparyana","given":"Pande Komang"},{"family":"Suryana","given":"I Made"},{"family":"Setyawan","given":"I Made Dedy"}]}}],"schema":"https://github.com/citation-style-language/schema/raw/master/csl-citation.json"} </w:instrText>
       </w:r>
       <w:r>
         <w:rPr>
@@ -8011,7 +8482,7 @@
         <w:fldChar w:fldCharType="separate"/>
       </w:r>
       <w:r>
-        <w:t>(Sukanteri et al., n.d.)</w:t>
+        <w:t>[8]</w:t>
       </w:r>
       <w:r>
         <w:rPr>
@@ -8155,7 +8626,7 @@
           <w:szCs w:val="24"/>
           <w:lang w:val="id-ID"/>
         </w:rPr>
-        <w:instrText xml:space="preserve"> ADDIN ZOTERO_ITEM CSL_CITATION {"citationID":"aMMD7Tjq","properties":{"formattedCitation":"(Wolfert et al., 2017)","plainCitation":"(Wolfert et al., 2017)","noteIndex":0},"citationItems":[{"id":77,"uris":["http://zotero.org/users/local/40ttfIiH/items/REENGG33"],"itemData":{"id":77,"type":"article-journal","container-title":"Agricultural Systems","DOI":"10.1016/j.agsy.2017.01.023","ISSN":"0308521X","journalAbbreviation":"Agricultural Systems","language":"en","page":"69-80","source":"DOI.org (Crossref)","title":"Big Data in Smart Farming – A review","volume":"153","author":[{"family":"Wolfert","given":"Sjaak"},{"family":"Ge","given":"Lan"},{"family":"Verdouw","given":"Cor"},{"family":"Bogaardt","given":"Marc-Jeroen"}],"issued":{"date-parts":[["2017",5]]}}}],"schema":"https://github.com/citation-style-language/schema/raw/master/csl-citation.json"} </w:instrText>
+        <w:instrText xml:space="preserve"> ADDIN ZOTERO_ITEM CSL_CITATION {"citationID":"aMMD7Tjq","properties":{"formattedCitation":"[9]","plainCitation":"[9]","noteIndex":0},"citationItems":[{"id":77,"uris":["http://zotero.org/users/local/40ttfIiH/items/REENGG33"],"itemData":{"id":77,"type":"article-journal","container-title":"Agricultural Systems","DOI":"10.1016/j.agsy.2017.01.023","ISSN":"0308521X","journalAbbreviation":"Agricultural Systems","language":"en","page":"69-80","source":"DOI.org (Crossref)","title":"Big Data in Smart Farming – A review","volume":"153","author":[{"family":"Wolfert","given":"Sjaak"},{"family":"Ge","given":"Lan"},{"family":"Verdouw","given":"Cor"},{"family":"Bogaardt","given":"Marc-Jeroen"}],"issued":{"date-parts":[["2017",5]]}}}],"schema":"https://github.com/citation-style-language/schema/raw/master/csl-citation.json"} </w:instrText>
       </w:r>
       <w:r>
         <w:rPr>
@@ -8165,7 +8636,7 @@
         <w:fldChar w:fldCharType="separate"/>
       </w:r>
       <w:r>
-        <w:t>(Wolfert et al., 2017)</w:t>
+        <w:t>[9]</w:t>
       </w:r>
       <w:r>
         <w:rPr>
@@ -8190,6 +8661,7 @@
           <w:numId w:val="6"/>
         </w:numPr>
         <w:spacing w:line="480" w:lineRule="auto"/>
+        <w:ind w:left="709"/>
         <w:rPr>
           <w:lang w:val="id-ID"/>
         </w:rPr>
@@ -8245,7 +8717,7 @@
         <w:rPr>
           <w:szCs w:val="24"/>
         </w:rPr>
-        <w:instrText xml:space="preserve"> ADDIN ZOTERO_ITEM CSL_CITATION {"citationID":"6MTXv5RO","properties":{"formattedCitation":"(M Rif\\uc0\\u8217{}an, 2024)","plainCitation":"(M Rif’an, 2024)","noteIndex":0},"citationItems":[{"id":79,"uris":["http://zotero.org/users/local/40ttfIiH/items/KI8PA2NT"],"itemData":{"id":79,"type":"article-journal","language":"id","source":"Zotero","title":"PENERAPAN IOT DALAM PERTANIAN PRESISI UNTUK PENINGKATAN PRODUKSI DAN EFISIENSI PENGGUNAAN SUMBER DAYA","author":[{"family":"M Rif'an","given":""}],"issued":{"date-parts":[["2024"]]}}}],"schema":"https://github.com/citation-style-language/schema/raw/master/csl-citation.json"} </w:instrText>
+        <w:instrText xml:space="preserve"> ADDIN ZOTERO_ITEM CSL_CITATION {"citationID":"6MTXv5RO","properties":{"formattedCitation":"[10]","plainCitation":"[10]","noteIndex":0},"citationItems":[{"id":79,"uris":["http://zotero.org/users/local/40ttfIiH/items/KI8PA2NT"],"itemData":{"id":79,"type":"article-journal","language":"id","source":"Zotero","title":"PENERAPAN IOT DALAM PERTANIAN PRESISI UNTUK PENINGKATAN PRODUKSI DAN EFISIENSI PENGGUNAAN SUMBER DAYA","author":[{"family":"M Rif'an","given":""}],"issued":{"date-parts":[["2024"]]}}}],"schema":"https://github.com/citation-style-language/schema/raw/master/csl-citation.json"} </w:instrText>
       </w:r>
       <w:r>
         <w:rPr>
@@ -8254,7 +8726,7 @@
         <w:fldChar w:fldCharType="separate"/>
       </w:r>
       <w:r>
-        <w:t>(M Rif’an, 2024)</w:t>
+        <w:t>[10]</w:t>
       </w:r>
       <w:r>
         <w:rPr>
@@ -8305,7 +8777,7 @@
         <w:rPr>
           <w:szCs w:val="24"/>
         </w:rPr>
-        <w:instrText xml:space="preserve"> ADDIN ZOTERO_ITEM CSL_CITATION {"citationID":"OcV67dK4","properties":{"formattedCitation":"(Wijaya &amp; Rivai, 2018)","plainCitation":"(Wijaya &amp; Rivai, 2018)","noteIndex":0},"citationItems":[{"id":81,"uris":["http://zotero.org/users/local/40ttfIiH/items/MA72Z8K5"],"itemData":{"id":81,"type":"article-journal","container-title":"Jurnal Teknik ITS","DOI":"10.12962/j23373539.v7i2.31113","ISSN":"2337-3539, 2301-9271","issue":"2","journalAbbreviation":"JTITS","language":"id","page":"288-292","source":"DOI.org (Crossref)","title":"Monitoring dan Kontrol Sistem irigasi Berbasis IoT Menggunakan Banana PI","volume":"7","author":[{"family":"Wijaya","given":"Andrie"},{"family":"Rivai","given":"Muhammad"}],"issued":{"date-parts":[["2018",12,17]]}}}],"schema":"https://github.com/citation-style-language/schema/raw/master/csl-citation.json"} </w:instrText>
+        <w:instrText xml:space="preserve"> ADDIN ZOTERO_ITEM CSL_CITATION {"citationID":"OcV67dK4","properties":{"formattedCitation":"[11]","plainCitation":"[11]","noteIndex":0},"citationItems":[{"id":81,"uris":["http://zotero.org/users/local/40ttfIiH/items/MA72Z8K5"],"itemData":{"id":81,"type":"article-journal","container-title":"Jurnal Teknik ITS","DOI":"10.12962/j23373539.v7i2.31113","ISSN":"2337-3539, 2301-9271","issue":"2","journalAbbreviation":"JTITS","language":"id","page":"288-292","source":"DOI.org (Crossref)","title":"Monitoring dan Kontrol Sistem irigasi Berbasis IoT Menggunakan Banana PI","volume":"7","author":[{"family":"Wijaya","given":"Andrie"},{"family":"Rivai","given":"Muhammad"}],"issued":{"date-parts":[["2018",12,17]]}}}],"schema":"https://github.com/citation-style-language/schema/raw/master/csl-citation.json"} </w:instrText>
       </w:r>
       <w:r>
         <w:rPr>
@@ -8314,7 +8786,7 @@
         <w:fldChar w:fldCharType="separate"/>
       </w:r>
       <w:r>
-        <w:t>(Wijaya &amp; Rivai, 2018)</w:t>
+        <w:t>[11]</w:t>
       </w:r>
       <w:r>
         <w:rPr>
@@ -8337,6 +8809,7 @@
           <w:numId w:val="6"/>
         </w:numPr>
         <w:spacing w:line="480" w:lineRule="auto"/>
+        <w:ind w:left="709"/>
       </w:pPr>
       <w:bookmarkStart w:id="17" w:name="_Toc215384864"/>
       <w:bookmarkStart w:id="18" w:name="_Toc213338684"/>
@@ -8384,7 +8857,7 @@
         <w:rPr>
           <w:szCs w:val="24"/>
         </w:rPr>
-        <w:instrText xml:space="preserve"> ADDIN ZOTERO_ITEM CSL_CITATION {"citationID":"Gw4SYtP3","properties":{"formattedCitation":"(Gunadi, 2022)","plainCitation":"(Gunadi, 2022)","noteIndex":0},"citationItems":[{"id":83,"uris":["http://zotero.org/users/local/40ttfIiH/items/ZLTUXHNK"],"itemData":{"id":83,"type":"article-journal","abstract":"A sensor or transducer is an electronic component that functions to convert a physical quantity into an electrical quantity. With various kinds of sensors, various physical phenomena such as temperature, air humidity, air pressure, gas intensity, air quality, etc. can be detected. In measurement/instrumentation activities the role of sensors is very important. With the sensor, changes in the value of the quantity being measured can be detected, then the change in the value of the quantity can be visualized as the output of the measurement system. The implementation of measurement techniques at this time mostly requires an integrated system, based on IoT (Internet of Thing). In this paper, we will review the implementation of various sensors on the Arduino-based IoT.","container-title":"Jurnal Matematika","issue":"3","language":"id","source":"Zotero","title":"Wahana Matematika dan Sains: Jurnal Matematika, Sains, dan Pembelajarannya, Vol. 16  No 3,  Desember  2022                                                                                        e-ISSN: 2549-6727 ,  p-ISSN: 1858-0629","volume":"16","author":[{"family":"Gunadi","given":"I Gede Aris"}],"issued":{"date-parts":[["2022"]]}}}],"schema":"https://github.com/citation-style-language/schema/raw/master/csl-citation.json"} </w:instrText>
+        <w:instrText xml:space="preserve"> ADDIN ZOTERO_ITEM CSL_CITATION {"citationID":"Gw4SYtP3","properties":{"formattedCitation":"[12]","plainCitation":"[12]","noteIndex":0},"citationItems":[{"id":83,"uris":["http://zotero.org/users/local/40ttfIiH/items/ZLTUXHNK"],"itemData":{"id":83,"type":"article-journal","abstract":"A sensor or transducer is an electronic component that functions to convert a physical quantity into an electrical quantity. With various kinds of sensors, various physical phenomena such as temperature, air humidity, air pressure, gas intensity, air quality, etc. can be detected. In measurement/instrumentation activities the role of sensors is very important. With the sensor, changes in the value of the quantity being measured can be detected, then the change in the value of the quantity can be visualized as the output of the measurement system. The implementation of measurement techniques at this time mostly requires an integrated system, based on IoT (Internet of Thing). In this paper, we will review the implementation of various sensors on the Arduino-based IoT.","container-title":"Jurnal Matematika","issue":"3","language":"id","source":"Zotero","title":"Wahana Matematika dan Sains: Jurnal Matematika, Sains, dan Pembelajarannya, Vol. 16  No 3,  Desember  2022                                                                                        e-ISSN: 2549-6727 ,  p-ISSN: 1858-0629","volume":"16","author":[{"family":"Gunadi","given":"I Gede Aris"}],"issued":{"date-parts":[["2022"]]}}}],"schema":"https://github.com/citation-style-language/schema/raw/master/csl-citation.json"} </w:instrText>
       </w:r>
       <w:r>
         <w:rPr>
@@ -8393,7 +8866,7 @@
         <w:fldChar w:fldCharType="separate"/>
       </w:r>
       <w:r>
-        <w:t>(Gunadi, 2022)</w:t>
+        <w:t>[12]</w:t>
       </w:r>
       <w:r>
         <w:rPr>
@@ -8416,6 +8889,7 @@
           <w:numId w:val="6"/>
         </w:numPr>
         <w:spacing w:line="480" w:lineRule="auto"/>
+        <w:ind w:left="709"/>
       </w:pPr>
       <w:bookmarkStart w:id="19" w:name="_Toc215384865"/>
       <w:r>
@@ -8431,7 +8905,13 @@
         <w:tab/>
       </w:r>
       <w:r>
-        <w:t>ESP32 mendukung konektivitas Wi-Fi dan Bluetooth sehingga memungkinkan integrasi dengan berbagai perangkat dan aplikasi IoT</w:t>
+        <w:t xml:space="preserve">ESP32 mendukung konektivitas Wi-Fi dan Bluetooth sehingga memungkinkan integrasi dengan berbagai </w:t>
+      </w:r>
+      <w:r>
+        <w:t>sensor</w:t>
+      </w:r>
+      <w:r>
+        <w:t xml:space="preserve"> dan aplikasi IoT</w:t>
       </w:r>
       <w:r>
         <w:t xml:space="preserve"> seperti yang ditunjukan pada gambar 2.1.</w:t>
@@ -8440,16 +8920,24 @@
     <w:p>
       <w:pPr>
         <w:jc w:val="center"/>
-      </w:pPr>
-      <w:r>
         <w:rPr>
           <w:noProof/>
         </w:rPr>
+      </w:pPr>
+    </w:p>
+    <w:p>
+      <w:pPr>
+        <w:jc w:val="center"/>
+      </w:pPr>
+      <w:r>
+        <w:rPr>
+          <w:noProof/>
+        </w:rPr>
         <w:drawing>
-          <wp:inline distT="0" distB="0" distL="0" distR="0" wp14:anchorId="0C337C4B" wp14:editId="01B33DFB">
-            <wp:extent cx="3752491" cy="2041016"/>
-            <wp:effectExtent l="0" t="0" r="635" b="0"/>
-            <wp:docPr id="1740368008" name="Picture 2"/>
+          <wp:inline distT="0" distB="0" distL="0" distR="0" wp14:anchorId="5647A1EF" wp14:editId="2343070B">
+            <wp:extent cx="4617754" cy="3371850"/>
+            <wp:effectExtent l="0" t="0" r="0" b="0"/>
+            <wp:docPr id="1120262191" name="Picture 1"/>
             <wp:cNvGraphicFramePr>
               <a:graphicFrameLocks xmlns:a="http://schemas.openxmlformats.org/drawingml/2006/main" noChangeAspect="1"/>
             </wp:cNvGraphicFramePr>
@@ -8457,10 +8945,10 @@
               <a:graphicData uri="http://schemas.openxmlformats.org/drawingml/2006/picture">
                 <pic:pic xmlns:pic="http://schemas.openxmlformats.org/drawingml/2006/picture">
                   <pic:nvPicPr>
-                    <pic:cNvPr id="1740368008" name="Picture 1740368008"/>
+                    <pic:cNvPr id="1120262191" name="Picture 1120262191"/>
                     <pic:cNvPicPr/>
                   </pic:nvPicPr>
-                  <pic:blipFill>
+                  <pic:blipFill rotWithShape="1">
                     <a:blip r:embed="rId10" cstate="print">
                       <a:extLst>
                         <a:ext uri="{28A0092B-C50C-407E-A947-70E740481C1C}">
@@ -8468,18 +8956,27 @@
                         </a:ext>
                       </a:extLst>
                     </a:blip>
+                    <a:srcRect l="2447" t="3151" r="2325" b="7269"/>
                     <a:stretch>
                       <a:fillRect/>
                     </a:stretch>
                   </pic:blipFill>
-                  <pic:spPr>
+                  <pic:spPr bwMode="auto">
                     <a:xfrm>
                       <a:off x="0" y="0"/>
-                      <a:ext cx="3769815" cy="2050439"/>
+                      <a:ext cx="4619655" cy="3373238"/>
                     </a:xfrm>
                     <a:prstGeom prst="rect">
                       <a:avLst/>
                     </a:prstGeom>
+                    <a:ln>
+                      <a:noFill/>
+                    </a:ln>
+                    <a:extLst>
+                      <a:ext uri="{53640926-AAD7-44D8-BBD7-CCE9431645EC}">
+                        <a14:shadowObscured xmlns:a14="http://schemas.microsoft.com/office/drawing/2010/main"/>
+                      </a:ext>
+                    </a:extLst>
                   </pic:spPr>
                 </pic:pic>
               </a:graphicData>
@@ -8502,7 +8999,7 @@
       </w:pPr>
       <w:bookmarkStart w:id="20" w:name="_Toc215385145"/>
       <w:bookmarkStart w:id="21" w:name="_Toc215385231"/>
-      <w:bookmarkStart w:id="22" w:name="_Toc215385583"/>
+      <w:bookmarkStart w:id="22" w:name="_Toc216192558"/>
       <w:r>
         <w:rPr>
           <w:i w:val="0"/>
@@ -8594,13 +9091,27 @@
         <w:jc w:val="center"/>
       </w:pPr>
       <w:r>
-        <w:t>Sumber : Angelo Rowe Sr.</w:t>
+        <w:t xml:space="preserve">Sumber : </w:t>
+      </w:r>
+      <w:r>
+        <w:t>discourse.webflow.com</w:t>
       </w:r>
       <w:r>
         <w:t xml:space="preserve"> </w:t>
       </w:r>
       <w:r>
-        <w:t>(Google)</w:t>
+        <w:t>(</w:t>
+      </w:r>
+      <w:hyperlink r:id="rId11" w:history="1">
+        <w:r>
+          <w:rPr>
+            <w:rStyle w:val="Hyperlink"/>
+          </w:rPr>
+          <w:t>Google</w:t>
+        </w:r>
+      </w:hyperlink>
+      <w:r>
+        <w:t>)</w:t>
       </w:r>
     </w:p>
     <w:p>
@@ -8661,7 +9172,7 @@
         <w:rPr>
           <w:szCs w:val="24"/>
         </w:rPr>
-        <w:instrText xml:space="preserve"> ADDIN ZOTERO_ITEM CSL_CITATION {"citationID":"TZhmcgdn","properties":{"formattedCitation":"(Humam &amp; Triawan, 2024)","plainCitation":"(Humam &amp; Triawan, 2024)","noteIndex":0},"citationItems":[{"id":55,"uris":["http://zotero.org/users/local/40ttfIiH/items/SSP87YCU"],"itemData":{"id":55,"type":"article-journal","abstract":"In the current digital era, the demand for effective and efficient security systems is increasing. This research develops a room security system using ESP32CAM and motion sensors based on the Internet of Things (IoT). The system is designed to detect movement within a room and send real-time notifications to users via a mobile application. The ESP32CAM functions as a surveillance camera that captures images when the motion sensor detects activity. Data from the motion sensor and images from the ESP32CAM are sent to a cloud server for processing and storage. System testing shows that this solution can provide a quick response to movement, send notifications within seconds, and securely store data in the cloud. Thus, this system can significantly enhance room security and provide peace of mind to its users.","container-title":"Infotek: Jurnal Informatika dan Teknologi","DOI":"10.29408/jit.v7i2.26109","ISSN":"2614-8773","issue":"2","journalAbbreviation":"INFOTEK","language":"id","license":"https://creativecommons.org/licenses/by/4.0","page":"575-584","source":"DOI.org (Crossref)","title":"Sistem Keamanan Ruangan Menggunakan ESP32CAM dan Sensor Gerak Berbasis IoT","volume":"7","author":[{"family":"Humam","given":"Faris"},{"family":"Triawan","given":"Muhammad Agus"}],"issued":{"date-parts":[["2024",7,24]]}}}],"schema":"https://github.com/citation-style-language/schema/raw/master/csl-citation.json"} </w:instrText>
+        <w:instrText xml:space="preserve"> ADDIN ZOTERO_ITEM CSL_CITATION {"citationID":"TZhmcgdn","properties":{"formattedCitation":"[13]","plainCitation":"[13]","noteIndex":0},"citationItems":[{"id":55,"uris":["http://zotero.org/users/local/40ttfIiH/items/SSP87YCU"],"itemData":{"id":55,"type":"article-journal","abstract":"In the current digital era, the demand for effective and efficient security systems is increasing. This research develops a room security system using ESP32CAM and motion sensors based on the Internet of Things (IoT). The system is designed to detect movement within a room and send real-time notifications to users via a mobile application. The ESP32CAM functions as a surveillance camera that captures images when the motion sensor detects activity. Data from the motion sensor and images from the ESP32CAM are sent to a cloud server for processing and storage. System testing shows that this solution can provide a quick response to movement, send notifications within seconds, and securely store data in the cloud. Thus, this system can significantly enhance room security and provide peace of mind to its users.","container-title":"Infotek: Jurnal Informatika dan Teknologi","DOI":"10.29408/jit.v7i2.26109","ISSN":"2614-8773","issue":"2","journalAbbreviation":"INFOTEK","language":"id","license":"https://creativecommons.org/licenses/by/4.0","page":"575-584","source":"DOI.org (Crossref)","title":"Sistem Keamanan Ruangan Menggunakan ESP32CAM dan Sensor Gerak Berbasis IoT","volume":"7","author":[{"family":"Humam","given":"Faris"},{"family":"Triawan","given":"Muhammad Agus"}],"issued":{"date-parts":[["2024",7,24]]}}}],"schema":"https://github.com/citation-style-language/schema/raw/master/csl-citation.json"} </w:instrText>
       </w:r>
       <w:r>
         <w:rPr>
@@ -8670,7 +9181,7 @@
         <w:fldChar w:fldCharType="separate"/>
       </w:r>
       <w:r>
-        <w:t>(Humam &amp; Triawan, 2024)</w:t>
+        <w:t>[13]</w:t>
       </w:r>
       <w:r>
         <w:rPr>
@@ -8706,6 +9217,7 @@
           <w:numId w:val="6"/>
         </w:numPr>
         <w:spacing w:line="480" w:lineRule="auto"/>
+        <w:ind w:left="709"/>
       </w:pPr>
       <w:bookmarkStart w:id="23" w:name="_Toc215384866"/>
       <w:r>
@@ -8755,7 +9267,7 @@
                     <pic:cNvPicPr/>
                   </pic:nvPicPr>
                   <pic:blipFill>
-                    <a:blip r:embed="rId11">
+                    <a:blip r:embed="rId12">
                       <a:extLst>
                         <a:ext uri="{28A0092B-C50C-407E-A947-70E740481C1C}">
                           <a14:useLocalDpi xmlns:a14="http://schemas.microsoft.com/office/drawing/2010/main" val="0"/>
@@ -8796,7 +9308,7 @@
       </w:pPr>
       <w:bookmarkStart w:id="24" w:name="_Toc215385146"/>
       <w:bookmarkStart w:id="25" w:name="_Toc215385232"/>
-      <w:bookmarkStart w:id="26" w:name="_Toc215385584"/>
+      <w:bookmarkStart w:id="26" w:name="_Toc216192559"/>
       <w:r>
         <w:rPr>
           <w:i w:val="0"/>
@@ -8877,7 +9389,18 @@
         <w:jc w:val="center"/>
       </w:pPr>
       <w:r>
-        <w:t>Sumber : techtronik.store (Google)</w:t>
+        <w:t>Sumber : techtronik.store (</w:t>
+      </w:r>
+      <w:hyperlink r:id="rId13" w:history="1">
+        <w:r>
+          <w:rPr>
+            <w:rStyle w:val="Hyperlink"/>
+          </w:rPr>
+          <w:t>Google</w:t>
+        </w:r>
+      </w:hyperlink>
+      <w:r>
+        <w:t>)</w:t>
       </w:r>
     </w:p>
     <w:p>
@@ -8915,7 +9438,7 @@
           <w:szCs w:val="24"/>
           <w:lang w:val="en-ID"/>
         </w:rPr>
-        <w:instrText xml:space="preserve"> ADDIN ZOTERO_ITEM CSL_CITATION {"citationID":"e7o0tD4Y","properties":{"formattedCitation":"(Saifanis et al., 2024)","plainCitation":"(Saifanis et al., 2024)","noteIndex":0},"citationItems":[{"id":90,"uris":["http://zotero.org/users/local/40ttfIiH/items/HAJGWLIH"],"itemData":{"id":90,"type":"article-journal","abstract":"Abstrak –Penelitian ini mengembangkan sistem GPS berbasis Internet of Things (IoT) yang efisien dan andal untuk pemantauan dan analisis data lokasi secara real-time, menawarkan solusi canggih yang dapat diintegrasikan dengan berbagai aplikasi industri. Sistem ini menggunakan modul GPS NEO-6M dan modul komunikasi SIMCOM SIM800L, yang dikendalikan oleh mikrokontroler Arduino Nano, untuk mengirimkan data lokasi melalui SMS ke server atau platform IoT untuk analisis lebih lanjut. Pengujian menunjukkan bahwa sistem ini mencapai akurasi koordinat yang tinggi, dengan tingkat keakuratan sekitar 95% dibandingkan dengan perangkat GPS manual seperti Garmin. Dari pengujian di 10 lokasi, rata-rata selisih pada titik longitude sebesar 0,000643° dan pada titik latitude sebesar 0,00163°, serta waktu deteksi lokasi sekitar 3 detik. Selain itu, fitur real-time tracking memungkinkan pengguna untuk memantau posisi kendaraan melalui pengiriman perintah SMS, menjadikannya sangat berguna dalam situasi darurat seperti pencurian. Dengan performa yang handal dan waktu respons cepat, sistem ini merupakan solusi yang efektif dan efisien untuk pengelolaan logistik, pemantauan armada, dan aplikasi navigasi lainnya, sehingga memberikan nilai tambah signifikan bagi perusahaan yang ingin meningkatkan efisiensi operasional mereka","container-title":"Jurnal TEKTRO","DOI":"10.30811/tektro.v8i2.6323","ISSN":"2581-2890","issue":"2","language":"id-ID","license":"##submission.copyrightStatement##","page":"286-290","source":"e-jurnal.pnl.ac.id","title":"RANCANG BANGUN GPS IoT DENGAN ARDUINO NANO DAN MODUL NEO-6M DALAM SISTEM PEMANTAUAN LOKASI OBJEK","volume":"8","author":[{"family":"Saifanis","given":"Rahmat"},{"family":"Hanafi","given":"Hanafi"},{"family":"Fauziah","given":"Anita"}],"issued":{"date-parts":[["2024"]]}}}],"schema":"https://github.com/citation-style-language/schema/raw/master/csl-citation.json"} </w:instrText>
+        <w:instrText xml:space="preserve"> ADDIN ZOTERO_ITEM CSL_CITATION {"citationID":"e7o0tD4Y","properties":{"formattedCitation":"[14]","plainCitation":"[14]","noteIndex":0},"citationItems":[{"id":90,"uris":["http://zotero.org/users/local/40ttfIiH/items/HAJGWLIH"],"itemData":{"id":90,"type":"article-journal","abstract":"Abstrak –Penelitian ini mengembangkan sistem GPS berbasis Internet of Things (IoT) yang efisien dan andal untuk pemantauan dan analisis data lokasi secara real-time, menawarkan solusi canggih yang dapat diintegrasikan dengan berbagai aplikasi industri. Sistem ini menggunakan modul GPS NEO-6M dan modul komunikasi SIMCOM SIM800L, yang dikendalikan oleh mikrokontroler Arduino Nano, untuk mengirimkan data lokasi melalui SMS ke server atau platform IoT untuk analisis lebih lanjut. Pengujian menunjukkan bahwa sistem ini mencapai akurasi koordinat yang tinggi, dengan tingkat keakuratan sekitar 95% dibandingkan dengan perangkat GPS manual seperti Garmin. Dari pengujian di 10 lokasi, rata-rata selisih pada titik longitude sebesar 0,000643° dan pada titik latitude sebesar 0,00163°, serta waktu deteksi lokasi sekitar 3 detik. Selain itu, fitur real-time tracking memungkinkan pengguna untuk memantau posisi kendaraan melalui pengiriman perintah SMS, menjadikannya sangat berguna dalam situasi darurat seperti pencurian. Dengan performa yang handal dan waktu respons cepat, sistem ini merupakan solusi yang efektif dan efisien untuk pengelolaan logistik, pemantauan armada, dan aplikasi navigasi lainnya, sehingga memberikan nilai tambah signifikan bagi perusahaan yang ingin meningkatkan efisiensi operasional mereka","container-title":"Jurnal TEKTRO","DOI":"10.30811/tektro.v8i2.6323","ISSN":"2581-2890","issue":"2","language":"id-ID","license":"##submission.copyrightStatement##","page":"286-290","source":"e-jurnal.pnl.ac.id","title":"RANCANG BANGUN GPS IoT DENGAN ARDUINO NANO DAN MODUL NEO-6M DALAM SISTEM PEMANTAUAN LOKASI OBJEK","volume":"8","author":[{"family":"Saifanis","given":"Rahmat"},{"family":"Hanafi","given":"Hanafi"},{"family":"Fauziah","given":"Anita"}],"issued":{"date-parts":[["2024"]]}}}],"schema":"https://github.com/citation-style-language/schema/raw/master/csl-citation.json"} </w:instrText>
       </w:r>
       <w:r>
         <w:rPr>
@@ -8925,7 +9448,7 @@
         <w:fldChar w:fldCharType="separate"/>
       </w:r>
       <w:r>
-        <w:t>(Saifanis et al., 2024)</w:t>
+        <w:t>[14]</w:t>
       </w:r>
       <w:r>
         <w:rPr>
@@ -8950,6 +9473,7 @@
           <w:numId w:val="6"/>
         </w:numPr>
         <w:spacing w:line="480" w:lineRule="auto"/>
+        <w:ind w:left="709"/>
         <w:jc w:val="left"/>
         <w:rPr>
           <w:b/>
@@ -9072,7 +9596,7 @@
                     <pic:cNvPicPr/>
                   </pic:nvPicPr>
                   <pic:blipFill>
-                    <a:blip r:embed="rId12">
+                    <a:blip r:embed="rId14">
                       <a:extLst>
                         <a:ext uri="{28A0092B-C50C-407E-A947-70E740481C1C}">
                           <a14:useLocalDpi xmlns:a14="http://schemas.microsoft.com/office/drawing/2010/main" val="0"/>
@@ -9111,6 +9635,7 @@
           <w:szCs w:val="24"/>
         </w:rPr>
       </w:pPr>
+      <w:bookmarkStart w:id="27" w:name="_Toc216192560"/>
       <w:r>
         <w:rPr>
           <w:i w:val="0"/>
@@ -9192,6 +9717,7 @@
         </w:rPr>
         <w:t>ESP32-CAM</w:t>
       </w:r>
+      <w:bookmarkEnd w:id="27"/>
     </w:p>
     <w:p>
       <w:pPr>
@@ -9233,20 +9759,20 @@
           <w:sz w:val="24"/>
           <w:szCs w:val="24"/>
         </w:rPr>
-        <w:t>programarfacil.com (Google)</w:t>
-      </w:r>
-    </w:p>
-    <w:p>
-      <w:pPr>
-        <w:pStyle w:val="Caption"/>
-        <w:spacing w:line="360" w:lineRule="auto"/>
-        <w:rPr>
-          <w:i w:val="0"/>
-          <w:iCs w:val="0"/>
-          <w:sz w:val="24"/>
-          <w:szCs w:val="24"/>
-        </w:rPr>
-      </w:pPr>
+        <w:t>programarfacil.com (</w:t>
+      </w:r>
+      <w:hyperlink r:id="rId15" w:history="1">
+        <w:r>
+          <w:rPr>
+            <w:rStyle w:val="Hyperlink"/>
+            <w:i w:val="0"/>
+            <w:iCs w:val="0"/>
+            <w:sz w:val="24"/>
+            <w:szCs w:val="24"/>
+          </w:rPr>
+          <w:t>Google</w:t>
+        </w:r>
+      </w:hyperlink>
       <w:r>
         <w:rPr>
           <w:i w:val="0"/>
@@ -9255,8 +9781,20 @@
           <w:sz w:val="24"/>
           <w:szCs w:val="24"/>
         </w:rPr>
-        <w:tab/>
-      </w:r>
+        <w:t>)</w:t>
+      </w:r>
+    </w:p>
+    <w:p>
+      <w:pPr>
+        <w:pStyle w:val="Caption"/>
+        <w:spacing w:line="360" w:lineRule="auto"/>
+        <w:rPr>
+          <w:i w:val="0"/>
+          <w:iCs w:val="0"/>
+          <w:sz w:val="24"/>
+          <w:szCs w:val="24"/>
+        </w:rPr>
+      </w:pPr>
       <w:r>
         <w:rPr>
           <w:i w:val="0"/>
@@ -9265,7 +9803,7 @@
           <w:sz w:val="24"/>
           <w:szCs w:val="24"/>
         </w:rPr>
-        <w:t>ESP32 CAM memiliki modul kamera ukuran kecil yang sangat kompetitif yang dapat beroperasi secara independen sebagai sistem minimum dengan ukuran hanya 27 * 40.5 * 4 5mm dan deep sleep current hingga 6mA. ESP 32CAM dapat digunakan secara luas di berbagai aplikasi IoT</w:t>
+        <w:tab/>
       </w:r>
       <w:r>
         <w:rPr>
@@ -9275,7 +9813,7 @@
           <w:sz w:val="24"/>
           <w:szCs w:val="24"/>
         </w:rPr>
-        <w:t xml:space="preserve"> </w:t>
+        <w:t>ESP32 CAM memiliki modul kamera ukuran kecil yang sangat kompetitif yang dapat beroperasi secara independen sebagai sistem minimum dengan ukuran hanya 27 * 40.5 * 4 5mm dan deep sleep current hingga 6mA. ESP 32CAM dapat digunakan secara luas di berbagai aplikasi IoT</w:t>
       </w:r>
       <w:r>
         <w:rPr>
@@ -9285,7 +9823,7 @@
           <w:sz w:val="24"/>
           <w:szCs w:val="24"/>
         </w:rPr>
-        <w:fldChar w:fldCharType="begin"/>
+        <w:t xml:space="preserve"> </w:t>
       </w:r>
       <w:r>
         <w:rPr>
@@ -9295,7 +9833,7 @@
           <w:sz w:val="24"/>
           <w:szCs w:val="24"/>
         </w:rPr>
-        <w:instrText xml:space="preserve"> ADDIN ZOTERO_ITEM CSL_CITATION {"citationID":"iuF8dsgR","properties":{"formattedCitation":"(Mukti et al., 2024)","plainCitation":"(Mukti et al., 2024)","noteIndex":0},"citationItems":[{"id":95,"uris":["http://zotero.org/users/local/40ttfIiH/items/TL6ACMC5"],"itemData":{"id":95,"type":"article-journal","abstract":"Seiring dengan berkembangnya ilmu pengetahuan dan teknologi, seringkali terjadi permasalahan yang mengancam keamanan rumah. Permasalahan tersebut bermula dari tingkat keamanan yang tidak memenuhi standar keamanan rumah. Oleh karena itu, teknologi yang mampu memberikan informasi mengenai kondisi rumah secara langsung sangat diperlukan. Pada penelitian ini penulis tertarik untuk membuat suatu alat yang dapat memantau kondisi rumah dan memberikan notifikasi kepada pemilik rumah jika ada orang yang masuk ke dalam rumah dan dapat mengontrol lampu menggunakan ponsel. Alat ini menggunakan mikrokontroler ESP32 CAM dan sonor PIR untuk mendeteksi pergerakan orang di dalam rumah, serta akan mengontrol 2 buah lampu yang dapat dikontrol menggunakan ponsel melalui aplikasi BLYNK. Pada aplikasi BLYNK pengguna dapat melihat kondisi rumah saat ini, dan akan diambil gambar kondisi rumah serta notifikasi jika ada yang masuk ke dalam rumah dan terdeteksi oleh sensor PIR.","container-title":"SIGMA TEKNIKA","DOI":"10.33373/sigmateknika.v7i2.6982","ISSN":"2599-0616, 2614-5979","issue":"2","journalAbbreviation":"SGTk","language":"id","page":"349-360","source":"DOI.org (Crossref)","title":"PERANCANGAN SECURITY SISTEM SMART HOME BERBASIS IOT MENGGUNAKAN ESP32 CAM DAN SENSOR PIR (PASSIVE INFRARED SENSOR) MELALUI APLIKASI BLYNK","volume":"7","author":[{"family":"Mukti","given":"M. Zulhelmi"},{"family":"Nandika","given":"Reza"},{"family":"Susanti","given":"Endang"}],"issued":{"date-parts":[["2024",11,26]]}}}],"schema":"https://github.com/citation-style-language/schema/raw/master/csl-citation.json"} </w:instrText>
+        <w:fldChar w:fldCharType="begin"/>
       </w:r>
       <w:r>
         <w:rPr>
@@ -9305,7 +9843,7 @@
           <w:sz w:val="24"/>
           <w:szCs w:val="24"/>
         </w:rPr>
-        <w:fldChar w:fldCharType="separate"/>
+        <w:instrText xml:space="preserve"> ADDIN ZOTERO_ITEM CSL_CITATION {"citationID":"iuF8dsgR","properties":{"formattedCitation":"[15]","plainCitation":"[15]","noteIndex":0},"citationItems":[{"id":95,"uris":["http://zotero.org/users/local/40ttfIiH/items/TL6ACMC5"],"itemData":{"id":95,"type":"article-journal","abstract":"Seiring dengan berkembangnya ilmu pengetahuan dan teknologi, seringkali terjadi permasalahan yang mengancam keamanan rumah. Permasalahan tersebut bermula dari tingkat keamanan yang tidak memenuhi standar keamanan rumah. Oleh karena itu, teknologi yang mampu memberikan informasi mengenai kondisi rumah secara langsung sangat diperlukan. Pada penelitian ini penulis tertarik untuk membuat suatu alat yang dapat memantau kondisi rumah dan memberikan notifikasi kepada pemilik rumah jika ada orang yang masuk ke dalam rumah dan dapat mengontrol lampu menggunakan ponsel. Alat ini menggunakan mikrokontroler ESP32 CAM dan sonor PIR untuk mendeteksi pergerakan orang di dalam rumah, serta akan mengontrol 2 buah lampu yang dapat dikontrol menggunakan ponsel melalui aplikasi BLYNK. Pada aplikasi BLYNK pengguna dapat melihat kondisi rumah saat ini, dan akan diambil gambar kondisi rumah serta notifikasi jika ada yang masuk ke dalam rumah dan terdeteksi oleh sensor PIR.","container-title":"SIGMA TEKNIKA","DOI":"10.33373/sigmateknika.v7i2.6982","ISSN":"2599-0616, 2614-5979","issue":"2","journalAbbreviation":"SGTk","language":"id","page":"349-360","source":"DOI.org (Crossref)","title":"PERANCANGAN SECURITY SISTEM SMART HOME BERBASIS IOT MENGGUNAKAN ESP32 CAM DAN SENSOR PIR (PASSIVE INFRARED SENSOR) MELALUI APLIKASI BLYNK","volume":"7","author":[{"family":"Mukti","given":"M. Zulhelmi"},{"family":"Nandika","given":"Reza"},{"family":"Susanti","given":"Endang"}],"issued":{"date-parts":[["2024",11,26]]}}}],"schema":"https://github.com/citation-style-language/schema/raw/master/csl-citation.json"} </w:instrText>
       </w:r>
       <w:r>
         <w:rPr>
@@ -9313,8 +9851,15 @@
           <w:iCs w:val="0"/>
           <w:color w:val="auto"/>
           <w:sz w:val="24"/>
-        </w:rPr>
-        <w:t>(Mukti et al., 2024)</w:t>
+          <w:szCs w:val="24"/>
+        </w:rPr>
+        <w:fldChar w:fldCharType="separate"/>
+      </w:r>
+      <w:r>
+        <w:rPr>
+          <w:sz w:val="24"/>
+        </w:rPr>
+        <w:t>[15]</w:t>
       </w:r>
       <w:r>
         <w:rPr>
@@ -9369,11 +9914,11 @@
         </w:numPr>
         <w:ind w:left="426"/>
       </w:pPr>
-      <w:bookmarkStart w:id="27" w:name="_Toc215384867"/>
+      <w:bookmarkStart w:id="28" w:name="_Toc215384867"/>
       <w:r>
         <w:t>Penelitian Sebelumnya</w:t>
       </w:r>
-      <w:bookmarkEnd w:id="27"/>
+      <w:bookmarkEnd w:id="28"/>
     </w:p>
     <w:p>
       <w:pPr>
@@ -9387,7 +9932,7 @@
           <w:szCs w:val="24"/>
         </w:rPr>
       </w:pPr>
-      <w:bookmarkStart w:id="28" w:name="_Toc215385242"/>
+      <w:bookmarkStart w:id="29" w:name="_Toc216192520"/>
       <w:r>
         <w:rPr>
           <w:i w:val="0"/>
@@ -9460,7 +10005,7 @@
         </w:rPr>
         <w:t>. Penelitian Sebelumnya</w:t>
       </w:r>
-      <w:bookmarkEnd w:id="28"/>
+      <w:bookmarkEnd w:id="29"/>
     </w:p>
     <w:tbl>
       <w:tblPr>
@@ -9630,7 +10175,7 @@
                 <w:szCs w:val="24"/>
                 <w:lang w:val="id-ID"/>
               </w:rPr>
-              <w:instrText xml:space="preserve"> ADDIN ZOTERO_ITEM CSL_CITATION {"citationID":"D78KMKp5","properties":{"formattedCitation":"(Wibowo et al., 2019)","plainCitation":"(Wibowo et al., 2019)","noteIndex":0},"citationItems":[{"id":47,"uris":["http://zotero.org/users/local/40ttfIiH/items/7H6GF88R"],"itemData":{"id":47,"type":"article-journal","abstract":"One of the common problems experienced by animal farmers is heat stress or cold stress caused by changes in the environment. This resulted in a decrease in the productivity of livestock, cattle. Early monitoring needs to be done to avoid problems through monitoring tools for temperature, heart rate, and internet-based location of things (IoT). The monitor receives the value through the paired sensor and is sent to the web server. Users or breeders get information about the condition of farm animals and observe changes in value through graphs through the android application. The system built is able to receive values in a short interval time (10 seconds) so that the value obtained is the most recent value. Based on observations on the graph, the user can identify drastic changes, both decreases or increases, in the temperature and heart rate of the animal's condition and take precautions as early as possible.","container-title":"JURNAL ELTEK","DOI":"10.33795/eltek.v17i2.188","ISSN":"2355-0740, 1693-4024","issue":"2","journalAbbreviation":"eltek","language":"id","license":"http://creativecommons.org/licenses/by-nc-nd/4.0","page":"18","source":"DOI.org (Crossref)","title":"SISTEM CERDAS PEMANTAU HEWAN TERNAK PADA ALAM BEBAS BERBASIS INTERNET OF THINGS (IOT)","volume":"17","author":[{"family":"Wibowo","given":"Galih Hendra"},{"family":"Ayatullah","given":"Mohamad Dimyati"},{"family":"Prasetyo","given":"Junaedi Adi"}],"issued":{"date-parts":[["2019",11,11]]}}}],"schema":"https://github.com/citation-style-language/schema/raw/master/csl-citation.json"} </w:instrText>
+              <w:instrText xml:space="preserve"> ADDIN ZOTERO_ITEM CSL_CITATION {"citationID":"D78KMKp5","properties":{"formattedCitation":"[1]","plainCitation":"[1]","noteIndex":0},"citationItems":[{"id":47,"uris":["http://zotero.org/users/local/40ttfIiH/items/7H6GF88R"],"itemData":{"id":47,"type":"article-journal","abstract":"One of the common problems experienced by animal farmers is heat stress or cold stress caused by changes in the environment. This resulted in a decrease in the productivity of livestock, cattle. Early monitoring needs to be done to avoid problems through monitoring tools for temperature, heart rate, and internet-based location of things (IoT). The monitor receives the value through the paired sensor and is sent to the web server. Users or breeders get information about the condition of farm animals and observe changes in value through graphs through the android application. The system built is able to receive values in a short interval time (10 seconds) so that the value obtained is the most recent value. Based on observations on the graph, the user can identify drastic changes, both decreases or increases, in the temperature and heart rate of the animal's condition and take precautions as early as possible.","container-title":"JURNAL ELTEK","DOI":"10.33795/eltek.v17i2.188","ISSN":"2355-0740, 1693-4024","issue":"2","journalAbbreviation":"eltek","language":"id","license":"http://creativecommons.org/licenses/by-nc-nd/4.0","page":"18","source":"DOI.org (Crossref)","title":"SISTEM CERDAS PEMANTAU HEWAN TERNAK PADA ALAM BEBAS BERBASIS INTERNET OF THINGS (IOT)","volume":"17","author":[{"family":"Wibowo","given":"Galih Hendra"},{"family":"Ayatullah","given":"Mohamad Dimyati"},{"family":"Prasetyo","given":"Junaedi Adi"}],"issued":{"date-parts":[["2019",11,11]]}}}],"schema":"https://github.com/citation-style-language/schema/raw/master/csl-citation.json"} </w:instrText>
             </w:r>
             <w:r>
               <w:rPr>
@@ -9640,7 +10185,7 @@
               <w:fldChar w:fldCharType="separate"/>
             </w:r>
             <w:r>
-              <w:t>(Wibowo et al., 2019)</w:t>
+              <w:t>[1]</w:t>
             </w:r>
             <w:r>
               <w:rPr>
@@ -9747,7 +10292,7 @@
                 <w:szCs w:val="24"/>
                 <w:lang w:val="id-ID"/>
               </w:rPr>
-              <w:instrText xml:space="preserve"> ADDIN ZOTERO_ITEM CSL_CITATION {"citationID":"sQEDKMha","properties":{"formattedCitation":"(Angriawan &amp; Anugraha, 2019)","plainCitation":"(Angriawan &amp; Anugraha, 2019)","noteIndex":0},"citationItems":[{"id":49,"uris":["http://zotero.org/users/local/40ttfIiH/items/RJBYXNBW"],"itemData":{"id":49,"type":"article-journal","abstract":"The development of communication technology is currently growing rapidly in the Internet of Things (IoT), it has developed in various aspects of human life. One of them is the efficiency of tracking mobile objects. There are many types of communication available. Cellular communication is one of the most common and widely used, but it has a problem like some locations are not covered by cellular networks. To overcome this problem, in this paper we proposed to use Lora for sending the location of the cow. LoRa sending data from Node to the Gateway and forwarded to the internet. The implementation results of sending data from Node to Gateway shows that the distance is directly proportional to the loss of data and signal strength (RSSI). For example, a distance of 1 km with the RSSI -98 the number of lost packages is around 2 and the furthest distance is 2.5 km with RSSI -128 the number of lost packages is about 19.","container-title":"Inspiration: Jurnal Teknologi Informasi dan Komunikasi","DOI":"10.35585/inspir.v9i1.2494","ISSN":"2621-5608, 2088-6705","issue":"1","journalAbbreviation":"j. inspir.","language":"id","page":"33","source":"DOI.org (Crossref)","title":"Sistem Pelacak Lokasi Sapi dengan Sistem Komunikasi LoRa","volume":"9","author":[{"family":"Angriawan","given":"Randy"},{"family":"Anugraha","given":"Nurhajar"}],"issued":{"date-parts":[["2019",6,15]]}}}],"schema":"https://github.com/citation-style-language/schema/raw/master/csl-citation.json"} </w:instrText>
+              <w:instrText xml:space="preserve"> ADDIN ZOTERO_ITEM CSL_CITATION {"citationID":"sQEDKMha","properties":{"formattedCitation":"[7]","plainCitation":"[7]","noteIndex":0},"citationItems":[{"id":49,"uris":["http://zotero.org/users/local/40ttfIiH/items/RJBYXNBW"],"itemData":{"id":49,"type":"article-journal","abstract":"The development of communication technology is currently growing rapidly in the Internet of Things (IoT), it has developed in various aspects of human life. One of them is the efficiency of tracking mobile objects. There are many types of communication available. Cellular communication is one of the most common and widely used, but it has a problem like some locations are not covered by cellular networks. To overcome this problem, in this paper we proposed to use Lora for sending the location of the cow. LoRa sending data from Node to the Gateway and forwarded to the internet. The implementation results of sending data from Node to Gateway shows that the distance is directly proportional to the loss of data and signal strength (RSSI). For example, a distance of 1 km with the RSSI -98 the number of lost packages is around 2 and the furthest distance is 2.5 km with RSSI -128 the number of lost packages is about 19.","container-title":"Inspiration: Jurnal Teknologi Informasi dan Komunikasi","DOI":"10.35585/inspir.v9i1.2494","ISSN":"2621-5608, 2088-6705","issue":"1","journalAbbreviation":"j. inspir.","language":"id","page":"33","source":"DOI.org (Crossref)","title":"Sistem Pelacak Lokasi Sapi dengan Sistem Komunikasi LoRa","volume":"9","author":[{"family":"Angriawan","given":"Randy"},{"family":"Anugraha","given":"Nurhajar"}],"issued":{"date-parts":[["2019",6,15]]}}}],"schema":"https://github.com/citation-style-language/schema/raw/master/csl-citation.json"} </w:instrText>
             </w:r>
             <w:r>
               <w:rPr>
@@ -9757,7 +10302,7 @@
               <w:fldChar w:fldCharType="separate"/>
             </w:r>
             <w:r>
-              <w:t>(Angriawan &amp; Anugraha, 2019)</w:t>
+              <w:t>[7]</w:t>
             </w:r>
             <w:r>
               <w:rPr>
@@ -9873,7 +10418,7 @@
                 <w:szCs w:val="24"/>
                 <w:lang w:val="id-ID"/>
               </w:rPr>
-              <w:instrText xml:space="preserve"> ADDIN ZOTERO_ITEM CSL_CITATION {"citationID":"f8446XIb","properties":{"formattedCitation":"(Tambunan &amp; Putra, 2019)","plainCitation":"(Tambunan &amp; Putra, 2019)","noteIndex":0},"citationItems":[{"id":51,"uris":["http://zotero.org/users/local/40ttfIiH/items/5GJEVCRZ"],"itemData":{"id":51,"type":"article-journal","abstract":"Vehicle tracking system based on GPS (Global Positioning System) by using SMS gateway communication is a system where the position of a vehicle can be known with certainty. This tracking system uses Arduino Nano as a microcontroller, GPS module technology to determine the position of the vehicle and the SMS gateway device to communicate via Smartphone. With the Google maps application on the Smartphone, it is easy to track the position of the vehicle. The vehicle can be controlled by turning off and turning on remotely with the SMS gateway device via text message media on the Smartphone.","container-title":"JSR : Jaringan Sistem Informasi Robotik","DOI":"10.58486/jsr.v3i1.41","ISSN":"2579-373X, 2356-2137","issue":"1","journalAbbreviation":"JSR","language":"id","page":"152-160","source":"DOI.org (Crossref)","title":"SISTEM KONTROL KENDARAAN BERBASIS IOT","volume":"3","author":[{"family":"Tambunan","given":"Leonard"},{"family":"Putra","given":"Diki Dwi"}],"issued":{"date-parts":[["2019",7,29]]}}}],"schema":"https://github.com/citation-style-language/schema/raw/master/csl-citation.json"} </w:instrText>
+              <w:instrText xml:space="preserve"> ADDIN ZOTERO_ITEM CSL_CITATION {"citationID":"f8446XIb","properties":{"formattedCitation":"[5]","plainCitation":"[5]","noteIndex":0},"citationItems":[{"id":51,"uris":["http://zotero.org/users/local/40ttfIiH/items/5GJEVCRZ"],"itemData":{"id":51,"type":"article-journal","abstract":"Vehicle tracking system based on GPS (Global Positioning System) by using SMS gateway communication is a system where the position of a vehicle can be known with certainty. This tracking system uses Arduino Nano as a microcontroller, GPS module technology to determine the position of the vehicle and the SMS gateway device to communicate via Smartphone. With the Google maps application on the Smartphone, it is easy to track the position of the vehicle. The vehicle can be controlled by turning off and turning on remotely with the SMS gateway device via text message media on the Smartphone.","container-title":"JSR : Jaringan Sistem Informasi Robotik","DOI":"10.58486/jsr.v3i1.41","ISSN":"2579-373X, 2356-2137","issue":"1","journalAbbreviation":"JSR","language":"id","page":"152-160","source":"DOI.org (Crossref)","title":"SISTEM KONTROL KENDARAAN BERBASIS IOT","volume":"3","author":[{"family":"Tambunan","given":"Leonard"},{"family":"Putra","given":"Diki Dwi"}],"issued":{"date-parts":[["2019",7,29]]}}}],"schema":"https://github.com/citation-style-language/schema/raw/master/csl-citation.json"} </w:instrText>
             </w:r>
             <w:r>
               <w:rPr>
@@ -9883,7 +10428,7 @@
               <w:fldChar w:fldCharType="separate"/>
             </w:r>
             <w:r>
-              <w:t>(Tambunan &amp; Putra, 2019)</w:t>
+              <w:t>[5]</w:t>
             </w:r>
             <w:r>
               <w:rPr>
@@ -10009,7 +10554,7 @@
                 <w:szCs w:val="24"/>
                 <w:lang w:val="id-ID"/>
               </w:rPr>
-              <w:instrText xml:space="preserve"> ADDIN ZOTERO_ITEM CSL_CITATION {"citationID":"yC6uhTe9","properties":{"formattedCitation":"(Arta et al., 2022)","plainCitation":"(Arta et al., 2022)","noteIndex":0},"citationItems":[{"id":45,"uris":["http://zotero.org/users/local/40ttfIiH/items/EGIV2T4F"],"itemData":{"id":45,"type":"article-journal","abstract":"Animal husbandry is an activity of breeding and rearing carried out with a cage or a loose system. Loose livestock systems are commonly found in the Nusa Tenggara region, and some areas in Bali. This type of farm is difficult to monitor so it is vulnerable to theft. In addition to the possibility of theft, this livestock grazing system also has many other risks, one of which is the loss of cows either because they are lost or trapped in some places. Therefore, it is necessary to develop a tracking device that is able to monitor the presence of these livestock. This research aims to implement internet of things (IoT) for monitoring livestock or pets using GPS, NodeMCU ESP 8266, Firebase and Kodular. Data in the form of latitude and longitude values obtained by the GPS module will be sent to Firebase via a WiFi network. That data is then displayed in the Kodular application in latitude, longitude coordinates, and markers on maps. In addition, this tracking device that can be worn around the neck of the animal is equipped with an LED light that aims to monitor the position of livestock at night so that the position of them can be seen when it is dark.","container-title":"Majalah Ilmiah Teknologi Elektro","DOI":"10.24843/MITE.2022.v21i01.P02","ISSN":"2503-2372, 1693-2951","issue":"1","journalAbbreviation":"JTE","language":"id","license":"http://creativecommons.org/licenses/by-nc-nd/4.0","page":"7","source":"DOI.org (Crossref)","title":"Animal Tracking Berbasis Internet of Things","volume":"21","author":[{"family":"Arta","given":"I Kadek Cahyadi"},{"family":"Febriyanto","given":"Andrian"},{"family":"Nugraha","given":"Ida Bagus Made Harisanjaya Adi"},{"family":"Widharma","given":"I Gede Suputra"},{"family":"Purnama","given":"Ida Bagus Irawan"}],"issued":{"date-parts":[["2022",7,8]]}}}],"schema":"https://github.com/citation-style-language/schema/raw/master/csl-citation.json"} </w:instrText>
+              <w:instrText xml:space="preserve"> ADDIN ZOTERO_ITEM CSL_CITATION {"citationID":"yC6uhTe9","properties":{"formattedCitation":"[16]","plainCitation":"[16]","noteIndex":0},"citationItems":[{"id":45,"uris":["http://zotero.org/users/local/40ttfIiH/items/EGIV2T4F"],"itemData":{"id":45,"type":"article-journal","abstract":"Animal husbandry is an activity of breeding and rearing carried out with a cage or a loose system. Loose livestock systems are commonly found in the Nusa Tenggara region, and some areas in Bali. This type of farm is difficult to monitor so it is vulnerable to theft. In addition to the possibility of theft, this livestock grazing system also has many other risks, one of which is the loss of cows either because they are lost or trapped in some places. Therefore, it is necessary to develop a tracking device that is able to monitor the presence of these livestock. This research aims to implement internet of things (IoT) for monitoring livestock or pets using GPS, NodeMCU ESP 8266, Firebase and Kodular. Data in the form of latitude and longitude values obtained by the GPS module will be sent to Firebase via a WiFi network. That data is then displayed in the Kodular application in latitude, longitude coordinates, and markers on maps. In addition, this tracking device that can be worn around the neck of the animal is equipped with an LED light that aims to monitor the position of livestock at night so that the position of them can be seen when it is dark.","container-title":"Majalah Ilmiah Teknologi Elektro","DOI":"10.24843/MITE.2022.v21i01.P02","ISSN":"2503-2372, 1693-2951","issue":"1","journalAbbreviation":"JTE","language":"id","license":"http://creativecommons.org/licenses/by-nc-nd/4.0","page":"7","source":"DOI.org (Crossref)","title":"Animal Tracking Berbasis Internet of Things","volume":"21","author":[{"family":"Arta","given":"I Kadek Cahyadi"},{"family":"Febriyanto","given":"Andrian"},{"family":"Nugraha","given":"Ida Bagus Made Harisanjaya Adi"},{"family":"Widharma","given":"I Gede Suputra"},{"family":"Purnama","given":"Ida Bagus Irawan"}],"issued":{"date-parts":[["2022",7,8]]}}}],"schema":"https://github.com/citation-style-language/schema/raw/master/csl-citation.json"} </w:instrText>
             </w:r>
             <w:r>
               <w:rPr>
@@ -10019,7 +10564,7 @@
               <w:fldChar w:fldCharType="separate"/>
             </w:r>
             <w:r>
-              <w:t>(Arta et al., 2022)</w:t>
+              <w:t>[16]</w:t>
             </w:r>
             <w:r>
               <w:rPr>
@@ -10211,7 +10756,7 @@
                 <w:szCs w:val="24"/>
                 <w:lang w:val="id-ID"/>
               </w:rPr>
-              <w:instrText xml:space="preserve"> ADDIN ZOTERO_ITEM CSL_CITATION {"citationID":"UZmYO3eR","properties":{"formattedCitation":"(Humam &amp; Triawan, 2024)","plainCitation":"(Humam &amp; Triawan, 2024)","noteIndex":0},"citationItems":[{"id":55,"uris":["http://zotero.org/users/local/40ttfIiH/items/SSP87YCU"],"itemData":{"id":55,"type":"article-journal","abstract":"In the current digital era, the demand for effective and efficient security systems is increasing. This research develops a room security system using ESP32CAM and motion sensors based on the Internet of Things (IoT). The system is designed to detect movement within a room and send real-time notifications to users via a mobile application. The ESP32CAM functions as a surveillance camera that captures images when the motion sensor detects activity. Data from the motion sensor and images from the ESP32CAM are sent to a cloud server for processing and storage. System testing shows that this solution can provide a quick response to movement, send notifications within seconds, and securely store data in the cloud. Thus, this system can significantly enhance room security and provide peace of mind to its users.","container-title":"Infotek: Jurnal Informatika dan Teknologi","DOI":"10.29408/jit.v7i2.26109","ISSN":"2614-8773","issue":"2","journalAbbreviation":"INFOTEK","language":"id","license":"https://creativecommons.org/licenses/by/4.0","page":"575-584","source":"DOI.org (Crossref)","title":"Sistem Keamanan Ruangan Menggunakan ESP32CAM dan Sensor Gerak Berbasis IoT","volume":"7","author":[{"family":"Humam","given":"Faris"},{"family":"Triawan","given":"Muhammad Agus"}],"issued":{"date-parts":[["2024",7,24]]}}}],"schema":"https://github.com/citation-style-language/schema/raw/master/csl-citation.json"} </w:instrText>
+              <w:instrText xml:space="preserve"> ADDIN ZOTERO_ITEM CSL_CITATION {"citationID":"UZmYO3eR","properties":{"formattedCitation":"[13]","plainCitation":"[13]","noteIndex":0},"citationItems":[{"id":55,"uris":["http://zotero.org/users/local/40ttfIiH/items/SSP87YCU"],"itemData":{"id":55,"type":"article-journal","abstract":"In the current digital era, the demand for effective and efficient security systems is increasing. This research develops a room security system using ESP32CAM and motion sensors based on the Internet of Things (IoT). The system is designed to detect movement within a room and send real-time notifications to users via a mobile application. The ESP32CAM functions as a surveillance camera that captures images when the motion sensor detects activity. Data from the motion sensor and images from the ESP32CAM are sent to a cloud server for processing and storage. System testing shows that this solution can provide a quick response to movement, send notifications within seconds, and securely store data in the cloud. Thus, this system can significantly enhance room security and provide peace of mind to its users.","container-title":"Infotek: Jurnal Informatika dan Teknologi","DOI":"10.29408/jit.v7i2.26109","ISSN":"2614-8773","issue":"2","journalAbbreviation":"INFOTEK","language":"id","license":"https://creativecommons.org/licenses/by/4.0","page":"575-584","source":"DOI.org (Crossref)","title":"Sistem Keamanan Ruangan Menggunakan ESP32CAM dan Sensor Gerak Berbasis IoT","volume":"7","author":[{"family":"Humam","given":"Faris"},{"family":"Triawan","given":"Muhammad Agus"}],"issued":{"date-parts":[["2024",7,24]]}}}],"schema":"https://github.com/citation-style-language/schema/raw/master/csl-citation.json"} </w:instrText>
             </w:r>
             <w:r>
               <w:rPr>
@@ -10221,7 +10766,7 @@
               <w:fldChar w:fldCharType="separate"/>
             </w:r>
             <w:r>
-              <w:t>(Humam &amp; Triawan, 2024)</w:t>
+              <w:t>[13]</w:t>
             </w:r>
             <w:r>
               <w:rPr>
@@ -10340,7 +10885,7 @@
                 <w:szCs w:val="24"/>
                 <w:lang w:val="id-ID"/>
               </w:rPr>
-              <w:instrText xml:space="preserve"> ADDIN ZOTERO_ITEM CSL_CITATION {"citationID":"A5ONMDYU","properties":{"formattedCitation":"(Nuryadi et al., 2025)","plainCitation":"(Nuryadi et al., 2025)","noteIndex":0},"citationItems":[{"id":53,"uris":["http://zotero.org/users/local/40ttfIiH/items/9I7AV3H8"],"itemData":{"id":53,"type":"article-journal","abstract":"This study aims to develop an IoT-based soil monitoring system using the ESP32 platform, equipped with WiFi and Bluetooth connectivity. The system is designed to monitor soil conditions in real-time, including moisture, pH, and temperature, which significantly affect agricultural productivity. The study also focuses on developing a client-server application that enables farmers to efficiently monitor soil conditions through a website and receive automatic notifications via the Telegram app when soil conditions exceed the predefined thresholds. The Research and Development (R&amp;D) method was used to develop the prototype, and field tests were conducted. The results show that this system is effective in monitoring soil conditions in real-time and improving water usage efficiency and land management in agriculture. This system is expected to provide a practical and efficient solution for farmers to enhance agricultural productivity and sustainability.","container-title":"Semnas Ristek (Seminar Nasional Riset dan Inovasi Teknologi)","DOI":"10.30998/semnasristek.v9i1.7550","ISSN":"2527-5941, 2527-5321","issue":"1","journalAbbreviation":"semnasristek","language":"id","page":"79-86","source":"DOI.org (Crossref)","title":"Implementasi ESP32 Untuk Sistem Pemantauan Kesuburan Tanah Berbasis IoT","volume":"9","author":[{"family":"Nuryadi","given":"Farhan"},{"family":"Septiani","given":"Ni Wayan Parwati"},{"family":"Lestari","given":"Mei"}],"issued":{"date-parts":[["2025",1,23]]}}}],"schema":"https://github.com/citation-style-language/schema/raw/master/csl-citation.json"} </w:instrText>
+              <w:instrText xml:space="preserve"> ADDIN ZOTERO_ITEM CSL_CITATION {"citationID":"A5ONMDYU","properties":{"formattedCitation":"[17]","plainCitation":"[17]","noteIndex":0},"citationItems":[{"id":53,"uris":["http://zotero.org/users/local/40ttfIiH/items/9I7AV3H8"],"itemData":{"id":53,"type":"article-journal","abstract":"This study aims to develop an IoT-based soil monitoring system using the ESP32 platform, equipped with WiFi and Bluetooth connectivity. The system is designed to monitor soil conditions in real-time, including moisture, pH, and temperature, which significantly affect agricultural productivity. The study also focuses on developing a client-server application that enables farmers to efficiently monitor soil conditions through a website and receive automatic notifications via the Telegram app when soil conditions exceed the predefined thresholds. The Research and Development (R&amp;D) method was used to develop the prototype, and field tests were conducted. The results show that this system is effective in monitoring soil conditions in real-time and improving water usage efficiency and land management in agriculture. This system is expected to provide a practical and efficient solution for farmers to enhance agricultural productivity and sustainability.","container-title":"Semnas Ristek (Seminar Nasional Riset dan Inovasi Teknologi)","DOI":"10.30998/semnasristek.v9i1.7550","ISSN":"2527-5941, 2527-5321","issue":"1","journalAbbreviation":"semnasristek","language":"id","page":"79-86","source":"DOI.org (Crossref)","title":"Implementasi ESP32 Untuk Sistem Pemantauan Kesuburan Tanah Berbasis IoT","volume":"9","author":[{"family":"Nuryadi","given":"Farhan"},{"family":"Septiani","given":"Ni Wayan Parwati"},{"family":"Lestari","given":"Mei"}],"issued":{"date-parts":[["2025",1,23]]}}}],"schema":"https://github.com/citation-style-language/schema/raw/master/csl-citation.json"} </w:instrText>
             </w:r>
             <w:r>
               <w:rPr>
@@ -10350,7 +10895,7 @@
               <w:fldChar w:fldCharType="separate"/>
             </w:r>
             <w:r>
-              <w:t>(Nuryadi et al., 2025)</w:t>
+              <w:t>[17]</w:t>
             </w:r>
             <w:r>
               <w:rPr>
@@ -10614,7 +11159,7 @@
                 <w:szCs w:val="24"/>
                 <w:lang w:val="id-ID"/>
               </w:rPr>
-              <w:instrText xml:space="preserve"> ADDIN ZOTERO_ITEM CSL_CITATION {"citationID":"Mvjv9SDB","properties":{"formattedCitation":"(Muchtar &amp; Ulhaq, n.d.)","plainCitation":"(Muchtar &amp; Ulhaq, n.d.)","noteIndex":0},"citationItems":[{"id":63,"uris":["http://zotero.org/users/local/40ttfIiH/items/5PFYUNBH"],"itemData":{"id":63,"type":"article-journal","abstract":"The agricultural sector is important in every country, especially in Indonesia, where the majority of the population is farmers. The problem we are facing in this modern era is that the traditional agricultural system is still inefficient. The research method carried out on the proposed system detects water content in the soil, water pH level, temperature and humidity and detects the weather in the fields, using humidity sensors, pH sensors, DHT22 temperature sensors and rain sensors. The level of soil moisture is also adjusted by irrigation using a waterpump. If the humidity level is below the threshold, the humidity sensor sends information data to the ESP32 module and the data is sent to the Thingspeak IoT platform. Compared to other systems, this system provides better efficiency for increasing agricultural production. ESP32 collects data from all sensors and connects the data with the cloud and then displays it on the webpage. The main advantage of this system is that farm owners can monitor their fields remotely as long as they are connected to the internet. The system response from this tool with the Thingspeak webpage is a minimum of 15 seconds while the average percentage of error from the DHT22 sensor generated based on testing is 10.66% for air humidity, 1.73% for air temperature. While the average error for the pH sensor in the category of reading acid (pH 4.00) is 5.28%, neutral (pH 6.86) is 3.20%, and alkaline (pH 9.18) is 3.44%, for the main purpose of this research is to make agriculture smart and increase the efficiency of agricultural production using automation and IoT technology.","issue":"2","language":"id","source":"Zotero","title":"Rancang Bangun Smart Monitoring Farming pada Media Tanah Menggunakan Sistem IoT (Internet of Things)","volume":"6","author":[{"family":"Muchtar","given":"Husnibes"},{"family":"Ulhaq","given":"Muhammad Zulfikar Hafizh"}]}}],"schema":"https://github.com/citation-style-language/schema/raw/master/csl-citation.json"} </w:instrText>
+              <w:instrText xml:space="preserve"> ADDIN ZOTERO_ITEM CSL_CITATION {"citationID":"Mvjv9SDB","properties":{"formattedCitation":"[19]","plainCitation":"[19]","noteIndex":0},"citationItems":[{"id":63,"uris":["http://zotero.org/users/local/40ttfIiH/items/5PFYUNBH"],"itemData":{"id":63,"type":"article-journal","abstract":"The agricultural sector is important in every country, especially in Indonesia, where the majority of the population is farmers. The problem we are facing in this modern era is that the traditional agricultural system is still inefficient. The research method carried out on the proposed system detects water content in the soil, water pH level, temperature and humidity and detects the weather in the fields, using humidity sensors, pH sensors, DHT22 temperature sensors and rain sensors. The level of soil moisture is also adjusted by irrigation using a waterpump. If the humidity level is below the threshold, the humidity sensor sends information data to the ESP32 module and the data is sent to the Thingspeak IoT platform. Compared to other systems, this system provides better efficiency for increasing agricultural production. ESP32 collects data from all sensors and connects the data with the cloud and then displays it on the webpage. The main advantage of this system is that farm owners can monitor their fields remotely as long as they are connected to the internet. The system response from this tool with the Thingspeak webpage is a minimum of 15 seconds while the average percentage of error from the DHT22 sensor generated based on testing is 10.66% for air humidity, 1.73% for air temperature. While the average error for the pH sensor in the category of reading acid (pH 4.00) is 5.28%, neutral (pH 6.86) is 3.20%, and alkaline (pH 9.18) is 3.44%, for the main purpose of this research is to make agriculture smart and increase the efficiency of agricultural production using automation and IoT technology.","issue":"2","language":"id","source":"Zotero","title":"Rancang Bangun Smart Monitoring Farming pada Media Tanah Menggunakan Sistem IoT (Internet of Things)","volume":"6","author":[{"family":"Muchtar","given":"Husnibes"},{"family":"Ulhaq","given":"Muhammad Zulfikar Hafizh"}]}}],"schema":"https://github.com/citation-style-language/schema/raw/master/csl-citation.json"} </w:instrText>
             </w:r>
             <w:r>
               <w:rPr>
@@ -10624,7 +11169,7 @@
               <w:fldChar w:fldCharType="separate"/>
             </w:r>
             <w:r>
-              <w:t>(Muchtar &amp; Ulhaq, n.d.)</w:t>
+              <w:t>[19]</w:t>
             </w:r>
             <w:r>
               <w:rPr>
@@ -10768,7 +11313,7 @@
                 <w:szCs w:val="24"/>
                 <w:lang w:val="id-ID"/>
               </w:rPr>
-              <w:instrText xml:space="preserve"> ADDIN ZOTERO_ITEM CSL_CITATION {"citationID":"F15POsF1","properties":{"formattedCitation":"(Widodo, n.d.)","plainCitation":"(Widodo, n.d.)","noteIndex":0},"citationItems":[{"id":65,"uris":["http://zotero.org/users/local/40ttfIiH/items/ELLBRIVE"],"itemData":{"id":65,"type":"article-journal","language":"id","source":"Zotero","title":"Rancang Bangun Sistem Deteksi Posisi Sapi berbasis Smartphone","author":[{"family":"Widodo","given":"Latif"}]}}],"schema":"https://github.com/citation-style-language/schema/raw/master/csl-citation.json"} </w:instrText>
+              <w:instrText xml:space="preserve"> ADDIN ZOTERO_ITEM CSL_CITATION {"citationID":"F15POsF1","properties":{"formattedCitation":"[20]","plainCitation":"[20]","noteIndex":0},"citationItems":[{"id":65,"uris":["http://zotero.org/users/local/40ttfIiH/items/ELLBRIVE"],"itemData":{"id":65,"type":"article-journal","language":"id","source":"Zotero","title":"Rancang Bangun Sistem Deteksi Posisi Sapi berbasis Smartphone","author":[{"family":"Widodo","given":"Latif"}]}}],"schema":"https://github.com/citation-style-language/schema/raw/master/csl-citation.json"} </w:instrText>
             </w:r>
             <w:r>
               <w:rPr>
@@ -10778,7 +11323,7 @@
               <w:fldChar w:fldCharType="separate"/>
             </w:r>
             <w:r>
-              <w:t>(Widodo, n.d.)</w:t>
+              <w:t>[20]</w:t>
             </w:r>
             <w:r>
               <w:rPr>
@@ -10861,7 +11406,6 @@
                 <w:szCs w:val="24"/>
                 <w:lang w:val="id-ID"/>
               </w:rPr>
-              <w:lastRenderedPageBreak/>
               <w:t>10</w:t>
             </w:r>
           </w:p>
@@ -10904,7 +11448,7 @@
                 <w:szCs w:val="24"/>
                 <w:lang w:val="id-ID"/>
               </w:rPr>
-              <w:instrText xml:space="preserve"> ADDIN ZOTERO_ITEM CSL_CITATION {"citationID":"t5BSkwtz","properties":{"formattedCitation":"(Muta\\uc0\\u8217{}affif et al., 2017)","plainCitation":"(Muta’affif et al., 2017)","noteIndex":0},"citationItems":[{"id":67,"uris":["http://zotero.org/users/local/40ttfIiH/items/2CRGJ33Q"],"itemData":{"id":67,"type":"article-journal","language":"id","source":"Zotero","title":"Sistem Kendali Peternakan Jarak Jauh Berbasis Internet of Things (IoT)","author":[{"family":"Muta’affif","given":"Muhammad Farish"},{"family":"Mujtahid","given":"Muhammad"},{"family":"Bari","given":"Bilal El"},{"family":"Evita","given":"Maria"}],"issued":{"date-parts":[["2017"]]}}}],"schema":"https://github.com/citation-style-language/schema/raw/master/csl-citation.json"} </w:instrText>
+              <w:instrText xml:space="preserve"> ADDIN ZOTERO_ITEM CSL_CITATION {"citationID":"t5BSkwtz","properties":{"formattedCitation":"[3]","plainCitation":"[3]","noteIndex":0},"citationItems":[{"id":67,"uris":["http://zotero.org/users/local/40ttfIiH/items/2CRGJ33Q"],"itemData":{"id":67,"type":"article-journal","language":"id","source":"Zotero","title":"Sistem Kendali Peternakan Jarak Jauh Berbasis Internet of Things (IoT)","author":[{"family":"Muta’affif","given":"Muhammad Farish"},{"family":"Mujtahid","given":"Muhammad"},{"family":"Bari","given":"Bilal El"},{"family":"Evita","given":"Maria"}],"issued":{"date-parts":[["2017"]]}}}],"schema":"https://github.com/citation-style-language/schema/raw/master/csl-citation.json"} </w:instrText>
             </w:r>
             <w:r>
               <w:rPr>
@@ -10914,7 +11458,7 @@
               <w:fldChar w:fldCharType="separate"/>
             </w:r>
             <w:r>
-              <w:t>(Muta’affif et al., 2017)</w:t>
+              <w:t>[3]</w:t>
             </w:r>
             <w:r>
               <w:rPr>
@@ -10992,7 +11536,10 @@
         <w:tab/>
       </w:r>
       <w:r>
-        <w:t>penelitian terdahulu telah banyak mengembangkan sistem berbasis Internet of Things (IoT) untuk pemantauan hewan ternak maupun monitoring kondisi lingkungan. Beberapa studi berfokus pada pemantauan kesehatan ternak dengan sensor suhu dan detak jantung</w:t>
+        <w:t>P</w:t>
+      </w:r>
+      <w:r>
+        <w:t>enelitian terdahulu telah banyak mengembangkan sistem berbasis Internet of Things (IoT) untuk pemantauan hewan ternak maupun monitoring kondisi lingkungan. Beberapa studi berfokus pada pemantauan kesehatan ternak dengan sensor suhu dan detak jantung</w:t>
       </w:r>
       <w:r>
         <w:t xml:space="preserve"> </w:t>
@@ -11001,13 +11548,13 @@
         <w:fldChar w:fldCharType="begin"/>
       </w:r>
       <w:r>
-        <w:instrText xml:space="preserve"> ADDIN ZOTERO_ITEM CSL_CITATION {"citationID":"cynMDmRm","properties":{"formattedCitation":"(Wibowo et al., 2019)","plainCitation":"(Wibowo et al., 2019)","noteIndex":0},"citationItems":[{"id":47,"uris":["http://zotero.org/users/local/40ttfIiH/items/7H6GF88R"],"itemData":{"id":47,"type":"article-journal","abstract":"One of the common problems experienced by animal farmers is heat stress or cold stress caused by changes in the environment. This resulted in a decrease in the productivity of livestock, cattle. Early monitoring needs to be done to avoid problems through monitoring tools for temperature, heart rate, and internet-based location of things (IoT). The monitor receives the value through the paired sensor and is sent to the web server. Users or breeders get information about the condition of farm animals and observe changes in value through graphs through the android application. The system built is able to receive values in a short interval time (10 seconds) so that the value obtained is the most recent value. Based on observations on the graph, the user can identify drastic changes, both decreases or increases, in the temperature and heart rate of the animal's condition and take precautions as early as possible.","container-title":"JURNAL ELTEK","DOI":"10.33795/eltek.v17i2.188","ISSN":"2355-0740, 1693-4024","issue":"2","journalAbbreviation":"eltek","language":"id","license":"http://creativecommons.org/licenses/by-nc-nd/4.0","page":"18","source":"DOI.org (Crossref)","title":"SISTEM CERDAS PEMANTAU HEWAN TERNAK PADA ALAM BEBAS BERBASIS INTERNET OF THINGS (IOT)","volume":"17","author":[{"family":"Wibowo","given":"Galih Hendra"},{"family":"Ayatullah","given":"Mohamad Dimyati"},{"family":"Prasetyo","given":"Junaedi Adi"}],"issued":{"date-parts":[["2019",11,11]]}}}],"schema":"https://github.com/citation-style-language/schema/raw/master/csl-citation.json"} </w:instrText>
+        <w:instrText xml:space="preserve"> ADDIN ZOTERO_ITEM CSL_CITATION {"citationID":"cynMDmRm","properties":{"formattedCitation":"[1]","plainCitation":"[1]","noteIndex":0},"citationItems":[{"id":47,"uris":["http://zotero.org/users/local/40ttfIiH/items/7H6GF88R"],"itemData":{"id":47,"type":"article-journal","abstract":"One of the common problems experienced by animal farmers is heat stress or cold stress caused by changes in the environment. This resulted in a decrease in the productivity of livestock, cattle. Early monitoring needs to be done to avoid problems through monitoring tools for temperature, heart rate, and internet-based location of things (IoT). The monitor receives the value through the paired sensor and is sent to the web server. Users or breeders get information about the condition of farm animals and observe changes in value through graphs through the android application. The system built is able to receive values in a short interval time (10 seconds) so that the value obtained is the most recent value. Based on observations on the graph, the user can identify drastic changes, both decreases or increases, in the temperature and heart rate of the animal's condition and take precautions as early as possible.","container-title":"JURNAL ELTEK","DOI":"10.33795/eltek.v17i2.188","ISSN":"2355-0740, 1693-4024","issue":"2","journalAbbreviation":"eltek","language":"id","license":"http://creativecommons.org/licenses/by-nc-nd/4.0","page":"18","source":"DOI.org (Crossref)","title":"SISTEM CERDAS PEMANTAU HEWAN TERNAK PADA ALAM BEBAS BERBASIS INTERNET OF THINGS (IOT)","volume":"17","author":[{"family":"Wibowo","given":"Galih Hendra"},{"family":"Ayatullah","given":"Mohamad Dimyati"},{"family":"Prasetyo","given":"Junaedi Adi"}],"issued":{"date-parts":[["2019",11,11]]}}}],"schema":"https://github.com/citation-style-language/schema/raw/master/csl-citation.json"} </w:instrText>
       </w:r>
       <w:r>
         <w:fldChar w:fldCharType="separate"/>
       </w:r>
       <w:r>
-        <w:t>(Wibowo et al., 2019)</w:t>
+        <w:t>[1]</w:t>
       </w:r>
       <w:r>
         <w:fldChar w:fldCharType="end"/>
@@ -11025,13 +11572,13 @@
         <w:fldChar w:fldCharType="begin"/>
       </w:r>
       <w:r>
-        <w:instrText xml:space="preserve"> ADDIN ZOTERO_ITEM CSL_CITATION {"citationID":"QNUZwSi5","properties":{"formattedCitation":"(Angriawan &amp; Anugraha, 2019)","plainCitation":"(Angriawan &amp; Anugraha, 2019)","noteIndex":0},"citationItems":[{"id":49,"uris":["http://zotero.org/users/local/40ttfIiH/items/RJBYXNBW"],"itemData":{"id":49,"type":"article-journal","abstract":"The development of communication technology is currently growing rapidly in the Internet of Things (IoT), it has developed in various aspects of human life. One of them is the efficiency of tracking mobile objects. There are many types of communication available. Cellular communication is one of the most common and widely used, but it has a problem like some locations are not covered by cellular networks. To overcome this problem, in this paper we proposed to use Lora for sending the location of the cow. LoRa sending data from Node to the Gateway and forwarded to the internet. The implementation results of sending data from Node to Gateway shows that the distance is directly proportional to the loss of data and signal strength (RSSI). For example, a distance of 1 km with the RSSI -98 the number of lost packages is around 2 and the furthest distance is 2.5 km with RSSI -128 the number of lost packages is about 19.","container-title":"Inspiration: Jurnal Teknologi Informasi dan Komunikasi","DOI":"10.35585/inspir.v9i1.2494","ISSN":"2621-5608, 2088-6705","issue":"1","journalAbbreviation":"j. inspir.","language":"id","page":"33","source":"DOI.org (Crossref)","title":"Sistem Pelacak Lokasi Sapi dengan Sistem Komunikasi LoRa","volume":"9","author":[{"family":"Angriawan","given":"Randy"},{"family":"Anugraha","given":"Nurhajar"}],"issued":{"date-parts":[["2019",6,15]]}}}],"schema":"https://github.com/citation-style-language/schema/raw/master/csl-citation.json"} </w:instrText>
+        <w:instrText xml:space="preserve"> ADDIN ZOTERO_ITEM CSL_CITATION {"citationID":"QNUZwSi5","properties":{"formattedCitation":"[7]","plainCitation":"[7]","noteIndex":0},"citationItems":[{"id":49,"uris":["http://zotero.org/users/local/40ttfIiH/items/RJBYXNBW"],"itemData":{"id":49,"type":"article-journal","abstract":"The development of communication technology is currently growing rapidly in the Internet of Things (IoT), it has developed in various aspects of human life. One of them is the efficiency of tracking mobile objects. There are many types of communication available. Cellular communication is one of the most common and widely used, but it has a problem like some locations are not covered by cellular networks. To overcome this problem, in this paper we proposed to use Lora for sending the location of the cow. LoRa sending data from Node to the Gateway and forwarded to the internet. The implementation results of sending data from Node to Gateway shows that the distance is directly proportional to the loss of data and signal strength (RSSI). For example, a distance of 1 km with the RSSI -98 the number of lost packages is around 2 and the furthest distance is 2.5 km with RSSI -128 the number of lost packages is about 19.","container-title":"Inspiration: Jurnal Teknologi Informasi dan Komunikasi","DOI":"10.35585/inspir.v9i1.2494","ISSN":"2621-5608, 2088-6705","issue":"1","journalAbbreviation":"j. inspir.","language":"id","page":"33","source":"DOI.org (Crossref)","title":"Sistem Pelacak Lokasi Sapi dengan Sistem Komunikasi LoRa","volume":"9","author":[{"family":"Angriawan","given":"Randy"},{"family":"Anugraha","given":"Nurhajar"}],"issued":{"date-parts":[["2019",6,15]]}}}],"schema":"https://github.com/citation-style-language/schema/raw/master/csl-citation.json"} </w:instrText>
       </w:r>
       <w:r>
         <w:fldChar w:fldCharType="separate"/>
       </w:r>
       <w:r>
-        <w:t>(Angriawan &amp; Anugraha, 2019)</w:t>
+        <w:t>[7]</w:t>
       </w:r>
       <w:r>
         <w:fldChar w:fldCharType="end"/>
@@ -11049,13 +11596,13 @@
         <w:fldChar w:fldCharType="begin"/>
       </w:r>
       <w:r>
-        <w:instrText xml:space="preserve"> ADDIN ZOTERO_ITEM CSL_CITATION {"citationID":"ngQtHqcU","properties":{"formattedCitation":"(Tambunan &amp; Putra, 2019)","plainCitation":"(Tambunan &amp; Putra, 2019)","noteIndex":0},"citationItems":[{"id":51,"uris":["http://zotero.org/users/local/40ttfIiH/items/5GJEVCRZ"],"itemData":{"id":51,"type":"article-journal","abstract":"Vehicle tracking system based on GPS (Global Positioning System) by using SMS gateway communication is a system where the position of a vehicle can be known with certainty. This tracking system uses Arduino Nano as a microcontroller, GPS module technology to determine the position of the vehicle and the SMS gateway device to communicate via Smartphone. With the Google maps application on the Smartphone, it is easy to track the position of the vehicle. The vehicle can be controlled by turning off and turning on remotely with the SMS gateway device via text message media on the Smartphone.","container-title":"JSR : Jaringan Sistem Informasi Robotik","DOI":"10.58486/jsr.v3i1.41","ISSN":"2579-373X, 2356-2137","issue":"1","journalAbbreviation":"JSR","language":"id","page":"152-160","source":"DOI.org (Crossref)","title":"SISTEM KONTROL KENDARAAN BERBASIS IOT","volume":"3","author":[{"family":"Tambunan","given":"Leonard"},{"family":"Putra","given":"Diki Dwi"}],"issued":{"date-parts":[["2019",7,29]]}}}],"schema":"https://github.com/citation-style-language/schema/raw/master/csl-citation.json"} </w:instrText>
+        <w:instrText xml:space="preserve"> ADDIN ZOTERO_ITEM CSL_CITATION {"citationID":"ngQtHqcU","properties":{"formattedCitation":"[5]","plainCitation":"[5]","noteIndex":0},"citationItems":[{"id":51,"uris":["http://zotero.org/users/local/40ttfIiH/items/5GJEVCRZ"],"itemData":{"id":51,"type":"article-journal","abstract":"Vehicle tracking system based on GPS (Global Positioning System) by using SMS gateway communication is a system where the position of a vehicle can be known with certainty. This tracking system uses Arduino Nano as a microcontroller, GPS module technology to determine the position of the vehicle and the SMS gateway device to communicate via Smartphone. With the Google maps application on the Smartphone, it is easy to track the position of the vehicle. The vehicle can be controlled by turning off and turning on remotely with the SMS gateway device via text message media on the Smartphone.","container-title":"JSR : Jaringan Sistem Informasi Robotik","DOI":"10.58486/jsr.v3i1.41","ISSN":"2579-373X, 2356-2137","issue":"1","journalAbbreviation":"JSR","language":"id","page":"152-160","source":"DOI.org (Crossref)","title":"SISTEM KONTROL KENDARAAN BERBASIS IOT","volume":"3","author":[{"family":"Tambunan","given":"Leonard"},{"family":"Putra","given":"Diki Dwi"}],"issued":{"date-parts":[["2019",7,29]]}}}],"schema":"https://github.com/citation-style-language/schema/raw/master/csl-citation.json"} </w:instrText>
       </w:r>
       <w:r>
         <w:fldChar w:fldCharType="separate"/>
       </w:r>
       <w:r>
-        <w:t>(Tambunan &amp; Putra, 2019)</w:t>
+        <w:t>[5]</w:t>
       </w:r>
       <w:r>
         <w:fldChar w:fldCharType="end"/>
@@ -11073,13 +11620,13 @@
         <w:fldChar w:fldCharType="begin"/>
       </w:r>
       <w:r>
-        <w:instrText xml:space="preserve"> ADDIN ZOTERO_ITEM CSL_CITATION {"citationID":"kIaWxE4L","properties":{"formattedCitation":"(Arta et al., 2022; Widodo, n.d.)","plainCitation":"(Arta et al., 2022; Widodo, n.d.)","noteIndex":0},"citationItems":[{"id":45,"uris":["http://zotero.org/users/local/40ttfIiH/items/EGIV2T4F"],"itemData":{"id":45,"type":"article-journal","abstract":"Animal husbandry is an activity of breeding and rearing carried out with a cage or a loose system. Loose livestock systems are commonly found in the Nusa Tenggara region, and some areas in Bali. This type of farm is difficult to monitor so it is vulnerable to theft. In addition to the possibility of theft, this livestock grazing system also has many other risks, one of which is the loss of cows either because they are lost or trapped in some places. Therefore, it is necessary to develop a tracking device that is able to monitor the presence of these livestock. This research aims to implement internet of things (IoT) for monitoring livestock or pets using GPS, NodeMCU ESP 8266, Firebase and Kodular. Data in the form of latitude and longitude values obtained by the GPS module will be sent to Firebase via a WiFi network. That data is then displayed in the Kodular application in latitude, longitude coordinates, and markers on maps. In addition, this tracking device that can be worn around the neck of the animal is equipped with an LED light that aims to monitor the position of livestock at night so that the position of them can be seen when it is dark.","container-title":"Majalah Ilmiah Teknologi Elektro","DOI":"10.24843/MITE.2022.v21i01.P02","ISSN":"2503-2372, 1693-2951","issue":"1","journalAbbreviation":"JTE","language":"id","license":"http://creativecommons.org/licenses/by-nc-nd/4.0","page":"7","source":"DOI.org (Crossref)","title":"Animal Tracking Berbasis Internet of Things","volume":"21","author":[{"family":"Arta","given":"I Kadek Cahyadi"},{"family":"Febriyanto","given":"Andrian"},{"family":"Nugraha","given":"Ida Bagus Made Harisanjaya Adi"},{"family":"Widharma","given":"I Gede Suputra"},{"family":"Purnama","given":"Ida Bagus Irawan"}],"issued":{"date-parts":[["2022",7,8]]}}},{"id":65,"uris":["http://zotero.org/users/local/40ttfIiH/items/ELLBRIVE"],"itemData":{"id":65,"type":"article-journal","language":"id","source":"Zotero","title":"Rancang Bangun Sistem Deteksi Posisi Sapi berbasis Smartphone","author":[{"family":"Widodo","given":"Latif"}]}}],"schema":"https://github.com/citation-style-language/schema/raw/master/csl-citation.json"} </w:instrText>
+        <w:instrText xml:space="preserve"> ADDIN ZOTERO_ITEM CSL_CITATION {"citationID":"kIaWxE4L","properties":{"formattedCitation":"[16], [20]","plainCitation":"[16], [20]","noteIndex":0},"citationItems":[{"id":45,"uris":["http://zotero.org/users/local/40ttfIiH/items/EGIV2T4F"],"itemData":{"id":45,"type":"article-journal","abstract":"Animal husbandry is an activity of breeding and rearing carried out with a cage or a loose system. Loose livestock systems are commonly found in the Nusa Tenggara region, and some areas in Bali. This type of farm is difficult to monitor so it is vulnerable to theft. In addition to the possibility of theft, this livestock grazing system also has many other risks, one of which is the loss of cows either because they are lost or trapped in some places. Therefore, it is necessary to develop a tracking device that is able to monitor the presence of these livestock. This research aims to implement internet of things (IoT) for monitoring livestock or pets using GPS, NodeMCU ESP 8266, Firebase and Kodular. Data in the form of latitude and longitude values obtained by the GPS module will be sent to Firebase via a WiFi network. That data is then displayed in the Kodular application in latitude, longitude coordinates, and markers on maps. In addition, this tracking device that can be worn around the neck of the animal is equipped with an LED light that aims to monitor the position of livestock at night so that the position of them can be seen when it is dark.","container-title":"Majalah Ilmiah Teknologi Elektro","DOI":"10.24843/MITE.2022.v21i01.P02","ISSN":"2503-2372, 1693-2951","issue":"1","journalAbbreviation":"JTE","language":"id","license":"http://creativecommons.org/licenses/by-nc-nd/4.0","page":"7","source":"DOI.org (Crossref)","title":"Animal Tracking Berbasis Internet of Things","volume":"21","author":[{"family":"Arta","given":"I Kadek Cahyadi"},{"family":"Febriyanto","given":"Andrian"},{"family":"Nugraha","given":"Ida Bagus Made Harisanjaya Adi"},{"family":"Widharma","given":"I Gede Suputra"},{"family":"Purnama","given":"Ida Bagus Irawan"}],"issued":{"date-parts":[["2022",7,8]]}}},{"id":65,"uris":["http://zotero.org/users/local/40ttfIiH/items/ELLBRIVE"],"itemData":{"id":65,"type":"article-journal","language":"id","source":"Zotero","title":"Rancang Bangun Sistem Deteksi Posisi Sapi berbasis Smartphone","author":[{"family":"Widodo","given":"Latif"}]}}],"schema":"https://github.com/citation-style-language/schema/raw/master/csl-citation.json"} </w:instrText>
       </w:r>
       <w:r>
         <w:fldChar w:fldCharType="separate"/>
       </w:r>
       <w:r>
-        <w:t>(Arta et al., 2022; Widodo, n.d.)</w:t>
+        <w:t>[16], [20]</w:t>
       </w:r>
       <w:r>
         <w:fldChar w:fldCharType="end"/>
@@ -11100,13 +11647,13 @@
         <w:fldChar w:fldCharType="begin"/>
       </w:r>
       <w:r>
-        <w:instrText xml:space="preserve"> ADDIN ZOTERO_ITEM CSL_CITATION {"citationID":"LwegR9lS","properties":{"formattedCitation":"(Humam &amp; Triawan, 2024)","plainCitation":"(Humam &amp; Triawan, 2024)","noteIndex":0},"citationItems":[{"id":55,"uris":["http://zotero.org/users/local/40ttfIiH/items/SSP87YCU"],"itemData":{"id":55,"type":"article-journal","abstract":"In the current digital era, the demand for effective and efficient security systems is increasing. This research develops a room security system using ESP32CAM and motion sensors based on the Internet of Things (IoT). The system is designed to detect movement within a room and send real-time notifications to users via a mobile application. The ESP32CAM functions as a surveillance camera that captures images when the motion sensor detects activity. Data from the motion sensor and images from the ESP32CAM are sent to a cloud server for processing and storage. System testing shows that this solution can provide a quick response to movement, send notifications within seconds, and securely store data in the cloud. Thus, this system can significantly enhance room security and provide peace of mind to its users.","container-title":"Infotek: Jurnal Informatika dan Teknologi","DOI":"10.29408/jit.v7i2.26109","ISSN":"2614-8773","issue":"2","journalAbbreviation":"INFOTEK","language":"id","license":"https://creativecommons.org/licenses/by/4.0","page":"575-584","source":"DOI.org (Crossref)","title":"Sistem Keamanan Ruangan Menggunakan ESP32CAM dan Sensor Gerak Berbasis IoT","volume":"7","author":[{"family":"Humam","given":"Faris"},{"family":"Triawan","given":"Muhammad Agus"}],"issued":{"date-parts":[["2024",7,24]]}}}],"schema":"https://github.com/citation-style-language/schema/raw/master/csl-citation.json"} </w:instrText>
+        <w:instrText xml:space="preserve"> ADDIN ZOTERO_ITEM CSL_CITATION {"citationID":"LwegR9lS","properties":{"formattedCitation":"[13]","plainCitation":"[13]","noteIndex":0},"citationItems":[{"id":55,"uris":["http://zotero.org/users/local/40ttfIiH/items/SSP87YCU"],"itemData":{"id":55,"type":"article-journal","abstract":"In the current digital era, the demand for effective and efficient security systems is increasing. This research develops a room security system using ESP32CAM and motion sensors based on the Internet of Things (IoT). The system is designed to detect movement within a room and send real-time notifications to users via a mobile application. The ESP32CAM functions as a surveillance camera that captures images when the motion sensor detects activity. Data from the motion sensor and images from the ESP32CAM are sent to a cloud server for processing and storage. System testing shows that this solution can provide a quick response to movement, send notifications within seconds, and securely store data in the cloud. Thus, this system can significantly enhance room security and provide peace of mind to its users.","container-title":"Infotek: Jurnal Informatika dan Teknologi","DOI":"10.29408/jit.v7i2.26109","ISSN":"2614-8773","issue":"2","journalAbbreviation":"INFOTEK","language":"id","license":"https://creativecommons.org/licenses/by/4.0","page":"575-584","source":"DOI.org (Crossref)","title":"Sistem Keamanan Ruangan Menggunakan ESP32CAM dan Sensor Gerak Berbasis IoT","volume":"7","author":[{"family":"Humam","given":"Faris"},{"family":"Triawan","given":"Muhammad Agus"}],"issued":{"date-parts":[["2024",7,24]]}}}],"schema":"https://github.com/citation-style-language/schema/raw/master/csl-citation.json"} </w:instrText>
       </w:r>
       <w:r>
         <w:fldChar w:fldCharType="separate"/>
       </w:r>
       <w:r>
-        <w:t>(Humam &amp; Triawan, 2024)</w:t>
+        <w:t>[13]</w:t>
       </w:r>
       <w:r>
         <w:fldChar w:fldCharType="end"/>
@@ -11124,13 +11671,13 @@
         <w:fldChar w:fldCharType="begin"/>
       </w:r>
       <w:r>
-        <w:instrText xml:space="preserve"> ADDIN ZOTERO_ITEM CSL_CITATION {"citationID":"RHK8Tg6V","properties":{"formattedCitation":"(Annisa et al., n.d.; Muchtar &amp; Ulhaq, n.d.; Muta\\uc0\\u8217{}affif et al., 2017; Nuryadi et al., 2025)","plainCitation":"(Annisa et al., n.d.; Muchtar &amp; Ulhaq, n.d.; Muta’affif et al., 2017; Nuryadi et al., 2025)","noteIndex":0},"citationItems":[{"id":59,"uris":["http://zotero.org/users/local/40ttfIiH/items/IQUF88Q9"],"itemData":{"id":59,"type":"article-journal","abstract":"This research develops an Internet of Things (IoT)-based control system for making silage animal feed using ESP32. This system is designed to monitor temperature, humidity and pH in real-time by utilizing the DHT21 sensor and soil pH sensor connected to Firebase as a database. The system is equipped with a webbased interface and LCD, making it easier for farmers to monitor feed conditions remotely. The silage production process was carried out for 19 days with the grade results measured based on the pH value, indicating the production success level was at Grade C (low). Functional testing, usability testing and black box testing ensure the system works as required with an average usability score of 88.2% in the “Very Good” category. Test results show that this system is able to provide accurate and stable data even though it requires periodic calibration. The 12V motorbike battery voltage was successfully reduced to 5V using a stepdown module to maintain device reliability. This system also offers automatic notifications if abnormal conditions occur, so that corrective action can be taken immediately. This system has proven effective in helping farmers monitor the silage fermentation process and reduce the risk of production failure. However, improving sensor stability, optimizing feed composition, and stronger internet connections are needed to increase production yields and feed quality. Thus, this system provides an innovative solution for farmers in producing animal feed efficiently, reliably and sustainably.","language":"id","source":"Zotero","title":"Sistem Controlling Pembuatan Pakan Ternak Silase Menggunakan ESP32 Berbasis IoT","author":[{"family":"Annisa","given":"Fera"},{"family":"Farida","given":"Intan Nur"},{"family":"Sahertian","given":"Julian"},{"family":"Yahya","given":"Nisaa’ Husnia"},{"family":"Septiawan","given":"Indra"},{"family":"Salsabila","given":"Adinda Meylia"},{"family":"Setiawan","given":"Bima"}]}},{"id":63,"uris":["http://zotero.org/users/local/40ttfIiH/items/5PFYUNBH"],"itemData":{"id":63,"type":"article-journal","abstract":"The agricultural sector is important in every country, especially in Indonesia, where the majority of the population is farmers. The problem we are facing in this modern era is that the traditional agricultural system is still inefficient. The research method carried out on the proposed system detects water content in the soil, water pH level, temperature and humidity and detects the weather in the fields, using humidity sensors, pH sensors, DHT22 temperature sensors and rain sensors. The level of soil moisture is also adjusted by irrigation using a waterpump. If the humidity level is below the threshold, the humidity sensor sends information data to the ESP32 module and the data is sent to the Thingspeak IoT platform. Compared to other systems, this system provides better efficiency for increasing agricultural production. ESP32 collects data from all sensors and connects the data with the cloud and then displays it on the webpage. The main advantage of this system is that farm owners can monitor their fields remotely as long as they are connected to the internet. The system response from this tool with the Thingspeak webpage is a minimum of 15 seconds while the average percentage of error from the DHT22 sensor generated based on testing is 10.66% for air humidity, 1.73% for air temperature. While the average error for the pH sensor in the category of reading acid (pH 4.00) is 5.28%, neutral (pH 6.86) is 3.20%, and alkaline (pH 9.18) is 3.44%, for the main purpose of this research is to make agriculture smart and increase the efficiency of agricultural production using automation and IoT technology.","issue":"2","language":"id","source":"Zotero","title":"Rancang Bangun Smart Monitoring Farming pada Media Tanah Menggunakan Sistem IoT (Internet of Things)","volume":"6","author":[{"family":"Muchtar","given":"Husnibes"},{"family":"Ulhaq","given":"Muhammad Zulfikar Hafizh"}]}},{"id":67,"uris":["http://zotero.org/users/local/40ttfIiH/items/2CRGJ33Q"],"itemData":{"id":67,"type":"article-journal","language":"id","source":"Zotero","title":"Sistem Kendali Peternakan Jarak Jauh Berbasis Internet of Things (IoT)","author":[{"family":"Muta’affif","given":"Muhammad Farish"},{"family":"Mujtahid","given":"Muhammad"},{"family":"Bari","given":"Bilal El"},{"family":"Evita","given":"Maria"}],"issued":{"date-parts":[["2017"]]}}},{"id":53,"uris":["http://zotero.org/users/local/40ttfIiH/items/9I7AV3H8"],"itemData":{"id":53,"type":"article-journal","abstract":"This study aims to develop an IoT-based soil monitoring system using the ESP32 platform, equipped with WiFi and Bluetooth connectivity. The system is designed to monitor soil conditions in real-time, including moisture, pH, and temperature, which significantly affect agricultural productivity. The study also focuses on developing a client-server application that enables farmers to efficiently monitor soil conditions through a website and receive automatic notifications via the Telegram app when soil conditions exceed the predefined thresholds. The Research and Development (R&amp;D) method was used to develop the prototype, and field tests were conducted. The results show that this system is effective in monitoring soil conditions in real-time and improving water usage efficiency and land management in agriculture. This system is expected to provide a practical and efficient solution for farmers to enhance agricultural productivity and sustainability.","container-title":"Semnas Ristek (Seminar Nasional Riset dan Inovasi Teknologi)","DOI":"10.30998/semnasristek.v9i1.7550","ISSN":"2527-5941, 2527-5321","issue":"1","journalAbbreviation":"semnasristek","language":"id","page":"79-86","source":"DOI.org (Crossref)","title":"Implementasi ESP32 Untuk Sistem Pemantauan Kesuburan Tanah Berbasis IoT","volume":"9","author":[{"family":"Nuryadi","given":"Farhan"},{"family":"Septiani","given":"Ni Wayan Parwati"},{"family":"Lestari","given":"Mei"}],"issued":{"date-parts":[["2025",1,23]]}}}],"schema":"https://github.com/citation-style-language/schema/raw/master/csl-citation.json"} </w:instrText>
+        <w:instrText xml:space="preserve"> ADDIN ZOTERO_ITEM CSL_CITATION {"citationID":"RHK8Tg6V","properties":{"formattedCitation":"[3], [17], [18], [19]","plainCitation":"[3], [17], [18], [19]","noteIndex":0},"citationItems":[{"id":59,"uris":["http://zotero.org/users/local/40ttfIiH/items/IQUF88Q9"],"itemData":{"id":59,"type":"article-journal","abstract":"This research develops an Internet of Things (IoT)-based control system for making silage animal feed using ESP32. This system is designed to monitor temperature, humidity and pH in real-time by utilizing the DHT21 sensor and soil pH sensor connected to Firebase as a database. The system is equipped with a webbased interface and LCD, making it easier for farmers to monitor feed conditions remotely. The silage production process was carried out for 19 days with the grade results measured based on the pH value, indicating the production success level was at Grade C (low). Functional testing, usability testing and black box testing ensure the system works as required with an average usability score of 88.2% in the “Very Good” category. Test results show that this system is able to provide accurate and stable data even though it requires periodic calibration. The 12V motorbike battery voltage was successfully reduced to 5V using a stepdown module to maintain device reliability. This system also offers automatic notifications if abnormal conditions occur, so that corrective action can be taken immediately. This system has proven effective in helping farmers monitor the silage fermentation process and reduce the risk of production failure. However, improving sensor stability, optimizing feed composition, and stronger internet connections are needed to increase production yields and feed quality. Thus, this system provides an innovative solution for farmers in producing animal feed efficiently, reliably and sustainably.","language":"id","source":"Zotero","title":"Sistem Controlling Pembuatan Pakan Ternak Silase Menggunakan ESP32 Berbasis IoT","author":[{"family":"Annisa","given":"Fera"},{"family":"Farida","given":"Intan Nur"},{"family":"Sahertian","given":"Julian"},{"family":"Yahya","given":"Nisaa’ Husnia"},{"family":"Septiawan","given":"Indra"},{"family":"Salsabila","given":"Adinda Meylia"},{"family":"Setiawan","given":"Bima"}]}},{"id":63,"uris":["http://zotero.org/users/local/40ttfIiH/items/5PFYUNBH"],"itemData":{"id":63,"type":"article-journal","abstract":"The agricultural sector is important in every country, especially in Indonesia, where the majority of the population is farmers. The problem we are facing in this modern era is that the traditional agricultural system is still inefficient. The research method carried out on the proposed system detects water content in the soil, water pH level, temperature and humidity and detects the weather in the fields, using humidity sensors, pH sensors, DHT22 temperature sensors and rain sensors. The level of soil moisture is also adjusted by irrigation using a waterpump. If the humidity level is below the threshold, the humidity sensor sends information data to the ESP32 module and the data is sent to the Thingspeak IoT platform. Compared to other systems, this system provides better efficiency for increasing agricultural production. ESP32 collects data from all sensors and connects the data with the cloud and then displays it on the webpage. The main advantage of this system is that farm owners can monitor their fields remotely as long as they are connected to the internet. The system response from this tool with the Thingspeak webpage is a minimum of 15 seconds while the average percentage of error from the DHT22 sensor generated based on testing is 10.66% for air humidity, 1.73% for air temperature. While the average error for the pH sensor in the category of reading acid (pH 4.00) is 5.28%, neutral (pH 6.86) is 3.20%, and alkaline (pH 9.18) is 3.44%, for the main purpose of this research is to make agriculture smart and increase the efficiency of agricultural production using automation and IoT technology.","issue":"2","language":"id","source":"Zotero","title":"Rancang Bangun Smart Monitoring Farming pada Media Tanah Menggunakan Sistem IoT (Internet of Things)","volume":"6","author":[{"family":"Muchtar","given":"Husnibes"},{"family":"Ulhaq","given":"Muhammad Zulfikar Hafizh"}]}},{"id":67,"uris":["http://zotero.org/users/local/40ttfIiH/items/2CRGJ33Q"],"itemData":{"id":67,"type":"article-journal","language":"id","source":"Zotero","title":"Sistem Kendali Peternakan Jarak Jauh Berbasis Internet of Things (IoT)","author":[{"family":"Muta’affif","given":"Muhammad Farish"},{"family":"Mujtahid","given":"Muhammad"},{"family":"Bari","given":"Bilal El"},{"family":"Evita","given":"Maria"}],"issued":{"date-parts":[["2017"]]}}},{"id":53,"uris":["http://zotero.org/users/local/40ttfIiH/items/9I7AV3H8"],"itemData":{"id":53,"type":"article-journal","abstract":"This study aims to develop an IoT-based soil monitoring system using the ESP32 platform, equipped with WiFi and Bluetooth connectivity. The system is designed to monitor soil conditions in real-time, including moisture, pH, and temperature, which significantly affect agricultural productivity. The study also focuses on developing a client-server application that enables farmers to efficiently monitor soil conditions through a website and receive automatic notifications via the Telegram app when soil conditions exceed the predefined thresholds. The Research and Development (R&amp;D) method was used to develop the prototype, and field tests were conducted. The results show that this system is effective in monitoring soil conditions in real-time and improving water usage efficiency and land management in agriculture. This system is expected to provide a practical and efficient solution for farmers to enhance agricultural productivity and sustainability.","container-title":"Semnas Ristek (Seminar Nasional Riset dan Inovasi Teknologi)","DOI":"10.30998/semnasristek.v9i1.7550","ISSN":"2527-5941, 2527-5321","issue":"1","journalAbbreviation":"semnasristek","language":"id","page":"79-86","source":"DOI.org (Crossref)","title":"Implementasi ESP32 Untuk Sistem Pemantauan Kesuburan Tanah Berbasis IoT","volume":"9","author":[{"family":"Nuryadi","given":"Farhan"},{"family":"Septiani","given":"Ni Wayan Parwati"},{"family":"Lestari","given":"Mei"}],"issued":{"date-parts":[["2025",1,23]]}}}],"schema":"https://github.com/citation-style-language/schema/raw/master/csl-citation.json"} </w:instrText>
       </w:r>
       <w:r>
         <w:fldChar w:fldCharType="separate"/>
       </w:r>
       <w:r>
-        <w:t>(Annisa et al., n.d.; Muchtar &amp; Ulhaq, n.d.; Muta’affif et al., 2017; Nuryadi et al., 2025)</w:t>
+        <w:t>[3], [17], [18], [19]</w:t>
       </w:r>
       <w:r>
         <w:fldChar w:fldCharType="end"/>
@@ -11163,12 +11710,11 @@
           <w:lang w:val="id-ID"/>
         </w:rPr>
       </w:pPr>
-      <w:bookmarkStart w:id="29" w:name="_Toc215384868"/>
-      <w:r>
-        <w:rPr>
-          <w:lang w:val="id-ID"/>
-        </w:rPr>
-        <w:lastRenderedPageBreak/>
+      <w:bookmarkStart w:id="30" w:name="_Toc215384868"/>
+      <w:r>
+        <w:rPr>
+          <w:lang w:val="id-ID"/>
+        </w:rPr>
         <w:t xml:space="preserve">BAB III </w:t>
       </w:r>
       <w:r>
@@ -11195,7 +11741,7 @@
         </w:rPr>
         <w:t xml:space="preserve"> PENELITIAN</w:t>
       </w:r>
-      <w:bookmarkEnd w:id="29"/>
+      <w:bookmarkEnd w:id="30"/>
     </w:p>
     <w:p>
       <w:pPr>
@@ -11231,9 +11777,9 @@
           <w:noProof/>
         </w:rPr>
         <w:drawing>
-          <wp:inline distT="0" distB="0" distL="0" distR="0" wp14:anchorId="39DA31AD" wp14:editId="61698130">
-            <wp:extent cx="3672559" cy="3648075"/>
-            <wp:effectExtent l="0" t="0" r="4445" b="0"/>
+          <wp:inline distT="0" distB="0" distL="0" distR="0" wp14:anchorId="39DA31AD" wp14:editId="3B3C87BB">
+            <wp:extent cx="4765697" cy="4733925"/>
+            <wp:effectExtent l="0" t="0" r="0" b="0"/>
             <wp:docPr id="936210316" name="Picture 1"/>
             <wp:cNvGraphicFramePr>
               <a:graphicFrameLocks xmlns:a="http://schemas.openxmlformats.org/drawingml/2006/main" noChangeAspect="1"/>
@@ -11246,7 +11792,7 @@
                     <pic:cNvPicPr/>
                   </pic:nvPicPr>
                   <pic:blipFill rotWithShape="1">
-                    <a:blip r:embed="rId13"/>
+                    <a:blip r:embed="rId16"/>
                     <a:srcRect l="23040" t="27912" r="46372" b="18076"/>
                     <a:stretch>
                       <a:fillRect/>
@@ -11255,7 +11801,7 @@
                   <pic:spPr bwMode="auto">
                     <a:xfrm>
                       <a:off x="0" y="0"/>
-                      <a:ext cx="3678601" cy="3654076"/>
+                      <a:ext cx="4788396" cy="4756473"/>
                     </a:xfrm>
                     <a:prstGeom prst="rect">
                       <a:avLst/>
@@ -11286,8 +11832,8 @@
           <w:lang w:val="id-ID"/>
         </w:rPr>
       </w:pPr>
-      <w:bookmarkStart w:id="30" w:name="_Toc215385069"/>
-      <w:bookmarkStart w:id="31" w:name="_Toc215385579"/>
+      <w:bookmarkStart w:id="31" w:name="_Toc215385069"/>
+      <w:bookmarkStart w:id="32" w:name="_Toc216192579"/>
       <w:r>
         <w:rPr>
           <w:i w:val="0"/>
@@ -11365,8 +11911,8 @@
         </w:rPr>
         <w:t>Tahapan Pengerjaan Penelitian</w:t>
       </w:r>
-      <w:bookmarkEnd w:id="30"/>
       <w:bookmarkEnd w:id="31"/>
+      <w:bookmarkEnd w:id="32"/>
     </w:p>
     <w:p>
       <w:pPr>
@@ -11380,11 +11926,11 @@
           <w:lang w:val="id-ID"/>
         </w:rPr>
       </w:pPr>
-      <w:bookmarkStart w:id="32" w:name="_Toc215384869"/>
+      <w:bookmarkStart w:id="33" w:name="_Toc215384869"/>
       <w:r>
         <w:t>Analisi Kebutuhan</w:t>
       </w:r>
-      <w:bookmarkEnd w:id="32"/>
+      <w:bookmarkEnd w:id="33"/>
     </w:p>
     <w:p>
       <w:pPr>
@@ -11409,7 +11955,6 @@
         <w:t xml:space="preserve"> berbasis IoT, keberhasilan implementasi sangat bergantung pada pemahaman mendalam terhadap dinamika lingkungan </w:t>
       </w:r>
       <w:r>
-        <w:lastRenderedPageBreak/>
         <w:t>peternakan</w:t>
       </w:r>
       <w:r>
@@ -11435,93 +11980,782 @@
           <w:lang w:val="id-ID"/>
         </w:rPr>
       </w:pPr>
-      <w:bookmarkStart w:id="33" w:name="_Toc215384870"/>
-      <w:r>
-        <w:rPr>
-          <w:lang w:val="id-ID"/>
+      <w:bookmarkStart w:id="34" w:name="_Toc215384872"/>
+      <w:r>
+        <w:rPr>
+          <w:lang w:val="id-ID"/>
+        </w:rPr>
+        <w:t>Hardware</w:t>
+      </w:r>
+      <w:bookmarkEnd w:id="34"/>
+    </w:p>
+    <w:p>
+      <w:pPr>
+        <w:spacing w:line="360" w:lineRule="auto"/>
+      </w:pPr>
+      <w:r>
+        <w:t>kebutuhan hardware atau perangkat keras yang digunakan dalam penerapan Internet of Things (IoT) pada sektor pertanian. Setiap perangkat memiliki fungsi spesifik untuk mendukung proses pengumpulan data</w:t>
+      </w:r>
+      <w:r>
+        <w:t xml:space="preserve"> </w:t>
+      </w:r>
+      <w:r>
+        <w:t>antar modul dalam sistem IoT</w:t>
+      </w:r>
+      <w:r>
+        <w:t>, ditunjukan pada tabel 3.1</w:t>
+      </w:r>
+    </w:p>
+    <w:p>
+      <w:pPr>
+        <w:pStyle w:val="Caption"/>
+        <w:rPr>
+          <w:i w:val="0"/>
+          <w:iCs w:val="0"/>
+          <w:color w:val="auto"/>
+          <w:sz w:val="24"/>
+          <w:szCs w:val="24"/>
+          <w:lang w:val="id-ID"/>
+        </w:rPr>
+      </w:pPr>
+      <w:bookmarkStart w:id="35" w:name="_Toc216192526"/>
+      <w:r>
+        <w:rPr>
+          <w:i w:val="0"/>
+          <w:iCs w:val="0"/>
+          <w:color w:val="auto"/>
+          <w:sz w:val="24"/>
+          <w:szCs w:val="24"/>
+        </w:rPr>
+        <w:t xml:space="preserve">Tabel 3. </w:t>
+      </w:r>
+      <w:r>
+        <w:rPr>
+          <w:i w:val="0"/>
+          <w:iCs w:val="0"/>
+          <w:color w:val="auto"/>
+          <w:sz w:val="24"/>
+          <w:szCs w:val="24"/>
+        </w:rPr>
+        <w:fldChar w:fldCharType="begin"/>
+      </w:r>
+      <w:r>
+        <w:rPr>
+          <w:i w:val="0"/>
+          <w:iCs w:val="0"/>
+          <w:color w:val="auto"/>
+          <w:sz w:val="24"/>
+          <w:szCs w:val="24"/>
+        </w:rPr>
+        <w:instrText xml:space="preserve"> SEQ Tabel_3. \* ARABIC </w:instrText>
+      </w:r>
+      <w:r>
+        <w:rPr>
+          <w:i w:val="0"/>
+          <w:iCs w:val="0"/>
+          <w:color w:val="auto"/>
+          <w:sz w:val="24"/>
+          <w:szCs w:val="24"/>
+        </w:rPr>
+        <w:fldChar w:fldCharType="separate"/>
+      </w:r>
+      <w:r>
+        <w:rPr>
+          <w:i w:val="0"/>
+          <w:iCs w:val="0"/>
+          <w:noProof/>
+          <w:color w:val="auto"/>
+          <w:sz w:val="24"/>
+          <w:szCs w:val="24"/>
+        </w:rPr>
+        <w:t>1</w:t>
+      </w:r>
+      <w:r>
+        <w:rPr>
+          <w:i w:val="0"/>
+          <w:iCs w:val="0"/>
+          <w:color w:val="auto"/>
+          <w:sz w:val="24"/>
+          <w:szCs w:val="24"/>
+        </w:rPr>
+        <w:fldChar w:fldCharType="end"/>
+      </w:r>
+      <w:r>
+        <w:rPr>
+          <w:i w:val="0"/>
+          <w:iCs w:val="0"/>
+          <w:color w:val="auto"/>
+          <w:sz w:val="24"/>
+          <w:szCs w:val="24"/>
+        </w:rPr>
+        <w:t xml:space="preserve"> </w:t>
+      </w:r>
+      <w:r>
+        <w:rPr>
+          <w:i w:val="0"/>
+          <w:iCs w:val="0"/>
+          <w:color w:val="auto"/>
+          <w:sz w:val="24"/>
+          <w:szCs w:val="24"/>
         </w:rPr>
         <w:t xml:space="preserve">Kebutuhan </w:t>
       </w:r>
       <w:r>
+        <w:rPr>
+          <w:color w:val="auto"/>
+          <w:sz w:val="24"/>
+          <w:szCs w:val="24"/>
+        </w:rPr>
+        <w:t>hardware</w:t>
+      </w:r>
+      <w:bookmarkEnd w:id="35"/>
+    </w:p>
+    <w:tbl>
+      <w:tblPr>
+        <w:tblStyle w:val="TableGrid0"/>
+        <w:tblW w:w="0" w:type="auto"/>
+        <w:jc w:val="center"/>
+        <w:tblLook w:val="04A0" w:firstRow="1" w:lastRow="0" w:firstColumn="1" w:lastColumn="0" w:noHBand="0" w:noVBand="1"/>
+      </w:tblPr>
+      <w:tblGrid>
+        <w:gridCol w:w="704"/>
+        <w:gridCol w:w="3260"/>
+        <w:gridCol w:w="3382"/>
+      </w:tblGrid>
+      <w:tr>
+        <w:trPr>
+          <w:jc w:val="center"/>
+        </w:trPr>
+        <w:tc>
+          <w:tcPr>
+            <w:tcW w:w="704" w:type="dxa"/>
+          </w:tcPr>
+          <w:p>
+            <w:pPr>
+              <w:spacing w:line="360" w:lineRule="auto"/>
+              <w:jc w:val="center"/>
+              <w:rPr>
+                <w:szCs w:val="24"/>
+                <w:lang w:val="id-ID"/>
+              </w:rPr>
+            </w:pPr>
+            <w:r>
+              <w:rPr>
+                <w:szCs w:val="24"/>
+                <w:lang w:val="id-ID"/>
+              </w:rPr>
+              <w:t>No</w:t>
+            </w:r>
+          </w:p>
+        </w:tc>
+        <w:tc>
+          <w:tcPr>
+            <w:tcW w:w="3260" w:type="dxa"/>
+          </w:tcPr>
+          <w:p>
+            <w:pPr>
+              <w:spacing w:line="360" w:lineRule="auto"/>
+              <w:jc w:val="center"/>
+              <w:rPr>
+                <w:szCs w:val="24"/>
+                <w:lang w:val="id-ID"/>
+              </w:rPr>
+            </w:pPr>
+            <w:r>
+              <w:rPr>
+                <w:szCs w:val="24"/>
+                <w:lang w:val="id-ID"/>
+              </w:rPr>
+              <w:t xml:space="preserve">Komponen </w:t>
+            </w:r>
+            <w:r>
+              <w:rPr>
+                <w:i/>
+                <w:iCs/>
+                <w:szCs w:val="24"/>
+                <w:lang w:val="id-ID"/>
+              </w:rPr>
+              <w:t>H</w:t>
+            </w:r>
+            <w:r>
+              <w:rPr>
+                <w:i/>
+                <w:iCs/>
+                <w:szCs w:val="24"/>
+                <w:lang w:val="id-ID"/>
+              </w:rPr>
+              <w:t>ar</w:t>
+            </w:r>
+            <w:r>
+              <w:rPr>
+                <w:i/>
+                <w:iCs/>
+                <w:szCs w:val="24"/>
+                <w:lang w:val="id-ID"/>
+              </w:rPr>
+              <w:t>dware</w:t>
+            </w:r>
+          </w:p>
+        </w:tc>
+        <w:tc>
+          <w:tcPr>
+            <w:tcW w:w="3382" w:type="dxa"/>
+          </w:tcPr>
+          <w:p>
+            <w:pPr>
+              <w:spacing w:line="360" w:lineRule="auto"/>
+              <w:jc w:val="center"/>
+              <w:rPr>
+                <w:szCs w:val="24"/>
+                <w:lang w:val="id-ID"/>
+              </w:rPr>
+            </w:pPr>
+            <w:r>
+              <w:rPr>
+                <w:szCs w:val="24"/>
+                <w:lang w:val="id-ID"/>
+              </w:rPr>
+              <w:t>Fungsi</w:t>
+            </w:r>
+          </w:p>
+        </w:tc>
+      </w:tr>
+      <w:tr>
+        <w:trPr>
+          <w:jc w:val="center"/>
+        </w:trPr>
+        <w:tc>
+          <w:tcPr>
+            <w:tcW w:w="704" w:type="dxa"/>
+          </w:tcPr>
+          <w:p>
+            <w:pPr>
+              <w:spacing w:line="360" w:lineRule="auto"/>
+              <w:rPr>
+                <w:szCs w:val="24"/>
+                <w:lang w:val="id-ID"/>
+              </w:rPr>
+            </w:pPr>
+            <w:r>
+              <w:rPr>
+                <w:szCs w:val="24"/>
+                <w:lang w:val="id-ID"/>
+              </w:rPr>
+              <w:t>1</w:t>
+            </w:r>
+          </w:p>
+        </w:tc>
+        <w:tc>
+          <w:tcPr>
+            <w:tcW w:w="3260" w:type="dxa"/>
+          </w:tcPr>
+          <w:p>
+            <w:pPr>
+              <w:spacing w:line="360" w:lineRule="auto"/>
+              <w:rPr>
+                <w:szCs w:val="24"/>
+                <w:lang w:val="id-ID"/>
+              </w:rPr>
+            </w:pPr>
+            <w:r>
+              <w:rPr>
+                <w:szCs w:val="24"/>
+                <w:lang w:val="id-ID"/>
+              </w:rPr>
+              <w:t>ESP32 (Mikrokontroler Utama)</w:t>
+            </w:r>
+          </w:p>
+        </w:tc>
+        <w:tc>
+          <w:tcPr>
+            <w:tcW w:w="3382" w:type="dxa"/>
+          </w:tcPr>
+          <w:p>
+            <w:pPr>
+              <w:spacing w:line="360" w:lineRule="auto"/>
+              <w:rPr>
+                <w:szCs w:val="24"/>
+                <w:lang w:val="id-ID"/>
+              </w:rPr>
+            </w:pPr>
+            <w:r>
+              <w:rPr>
+                <w:szCs w:val="24"/>
+              </w:rPr>
+              <w:t xml:space="preserve">Berfungsi sebagai otak sistem IoT yang mengolah data dari sensor, mengirimkan data ke </w:t>
+            </w:r>
+            <w:r>
+              <w:rPr>
+                <w:szCs w:val="24"/>
+              </w:rPr>
+              <w:t>aplikasi</w:t>
+            </w:r>
+            <w:r>
+              <w:rPr>
+                <w:szCs w:val="24"/>
+              </w:rPr>
+              <w:t xml:space="preserve"> telegram</w:t>
+            </w:r>
+            <w:r>
+              <w:rPr>
+                <w:szCs w:val="24"/>
+              </w:rPr>
+              <w:t>, dan mengontrol modul lain. Memiliki konektivitas WiFi &amp; Bluetooth bawaan.</w:t>
+            </w:r>
+          </w:p>
+        </w:tc>
+      </w:tr>
+      <w:tr>
+        <w:trPr>
+          <w:jc w:val="center"/>
+        </w:trPr>
+        <w:tc>
+          <w:tcPr>
+            <w:tcW w:w="704" w:type="dxa"/>
+          </w:tcPr>
+          <w:p>
+            <w:pPr>
+              <w:spacing w:line="360" w:lineRule="auto"/>
+              <w:rPr>
+                <w:szCs w:val="24"/>
+                <w:lang w:val="id-ID"/>
+              </w:rPr>
+            </w:pPr>
+            <w:r>
+              <w:rPr>
+                <w:szCs w:val="24"/>
+                <w:lang w:val="id-ID"/>
+              </w:rPr>
+              <w:t>2</w:t>
+            </w:r>
+          </w:p>
+        </w:tc>
+        <w:tc>
+          <w:tcPr>
+            <w:tcW w:w="3260" w:type="dxa"/>
+          </w:tcPr>
+          <w:p>
+            <w:pPr>
+              <w:spacing w:line="360" w:lineRule="auto"/>
+              <w:rPr>
+                <w:szCs w:val="24"/>
+                <w:lang w:val="id-ID"/>
+              </w:rPr>
+            </w:pPr>
+            <w:r>
+              <w:rPr>
+                <w:szCs w:val="24"/>
+                <w:lang w:val="id-ID"/>
+              </w:rPr>
+              <w:t>GPS Neo-6M</w:t>
+            </w:r>
+          </w:p>
+        </w:tc>
+        <w:tc>
+          <w:tcPr>
+            <w:tcW w:w="3382" w:type="dxa"/>
+          </w:tcPr>
+          <w:p>
+            <w:pPr>
+              <w:spacing w:line="360" w:lineRule="auto"/>
+              <w:rPr>
+                <w:szCs w:val="24"/>
+                <w:lang w:val="id-ID"/>
+              </w:rPr>
+            </w:pPr>
+            <w:r>
+              <w:rPr>
+                <w:szCs w:val="24"/>
+              </w:rPr>
+              <w:t xml:space="preserve">Modul GPS yang digunakan untuk mendapatkan informasi lokasi berupa </w:t>
+            </w:r>
+            <w:r>
+              <w:rPr>
+                <w:b/>
+                <w:bCs/>
+                <w:szCs w:val="24"/>
+              </w:rPr>
+              <w:t>koordinat longitude dan latitude</w:t>
+            </w:r>
+            <w:r>
+              <w:rPr>
+                <w:szCs w:val="24"/>
+              </w:rPr>
+              <w:t xml:space="preserve"> dalam sistem monitoring posisi atau tracking </w:t>
+            </w:r>
+            <w:r>
+              <w:rPr>
+                <w:szCs w:val="24"/>
+              </w:rPr>
+              <w:t>posisi hewan</w:t>
+            </w:r>
+          </w:p>
+        </w:tc>
+      </w:tr>
+      <w:tr>
+        <w:trPr>
+          <w:jc w:val="center"/>
+        </w:trPr>
+        <w:tc>
+          <w:tcPr>
+            <w:tcW w:w="704" w:type="dxa"/>
+          </w:tcPr>
+          <w:p>
+            <w:pPr>
+              <w:spacing w:line="360" w:lineRule="auto"/>
+              <w:rPr>
+                <w:szCs w:val="24"/>
+                <w:lang w:val="id-ID"/>
+              </w:rPr>
+            </w:pPr>
+            <w:r>
+              <w:rPr>
+                <w:szCs w:val="24"/>
+                <w:lang w:val="id-ID"/>
+              </w:rPr>
+              <w:t>3</w:t>
+            </w:r>
+          </w:p>
+        </w:tc>
+        <w:tc>
+          <w:tcPr>
+            <w:tcW w:w="3260" w:type="dxa"/>
+          </w:tcPr>
+          <w:p>
+            <w:pPr>
+              <w:spacing w:line="360" w:lineRule="auto"/>
+              <w:rPr>
+                <w:szCs w:val="24"/>
+                <w:lang w:val="id-ID"/>
+              </w:rPr>
+            </w:pPr>
+            <w:r>
+              <w:rPr>
+                <w:szCs w:val="24"/>
+                <w:lang w:val="id-ID"/>
+              </w:rPr>
+              <w:t>ESP32-Cam</w:t>
+            </w:r>
+          </w:p>
+        </w:tc>
+        <w:tc>
+          <w:tcPr>
+            <w:tcW w:w="3382" w:type="dxa"/>
+          </w:tcPr>
+          <w:p>
+            <w:pPr>
+              <w:spacing w:line="360" w:lineRule="auto"/>
+              <w:rPr>
+                <w:szCs w:val="24"/>
+                <w:lang w:val="id-ID"/>
+              </w:rPr>
+            </w:pPr>
+            <w:r>
+              <w:rPr>
+                <w:szCs w:val="24"/>
+              </w:rPr>
+              <w:t>Modul kamera berbasis ESP32 yang mampu mengambil gambar. Digunakan sebagai sensor visualisasi lapangan</w:t>
+            </w:r>
+            <w:r>
+              <w:rPr>
+                <w:szCs w:val="24"/>
+              </w:rPr>
+              <w:t>.</w:t>
+            </w:r>
+          </w:p>
+        </w:tc>
+      </w:tr>
+      <w:tr>
+        <w:trPr>
+          <w:jc w:val="center"/>
+        </w:trPr>
+        <w:tc>
+          <w:tcPr>
+            <w:tcW w:w="704" w:type="dxa"/>
+          </w:tcPr>
+          <w:p>
+            <w:pPr>
+              <w:spacing w:line="360" w:lineRule="auto"/>
+              <w:rPr>
+                <w:szCs w:val="24"/>
+                <w:lang w:val="id-ID"/>
+              </w:rPr>
+            </w:pPr>
+            <w:r>
+              <w:rPr>
+                <w:szCs w:val="24"/>
+                <w:lang w:val="id-ID"/>
+              </w:rPr>
+              <w:t>4</w:t>
+            </w:r>
+          </w:p>
+        </w:tc>
+        <w:tc>
+          <w:tcPr>
+            <w:tcW w:w="3260" w:type="dxa"/>
+          </w:tcPr>
+          <w:p>
+            <w:pPr>
+              <w:spacing w:line="360" w:lineRule="auto"/>
+              <w:rPr>
+                <w:szCs w:val="24"/>
+                <w:lang w:val="id-ID"/>
+              </w:rPr>
+            </w:pPr>
+            <w:r>
+              <w:rPr>
+                <w:szCs w:val="24"/>
+                <w:lang w:val="id-ID"/>
+              </w:rPr>
+              <w:t>Power Supply</w:t>
+            </w:r>
+          </w:p>
+        </w:tc>
+        <w:tc>
+          <w:tcPr>
+            <w:tcW w:w="3382" w:type="dxa"/>
+          </w:tcPr>
+          <w:p>
+            <w:pPr>
+              <w:spacing w:line="360" w:lineRule="auto"/>
+              <w:rPr>
+                <w:szCs w:val="24"/>
+                <w:lang w:val="id-ID"/>
+              </w:rPr>
+            </w:pPr>
+            <w:r>
+              <w:rPr>
+                <w:szCs w:val="24"/>
+              </w:rPr>
+              <w:t>Sumber tegangan untuk memberi daya ke ESP32, ESP32-CAM, dan GPS Neo-6M.</w:t>
+            </w:r>
+          </w:p>
+        </w:tc>
+      </w:tr>
+      <w:tr>
+        <w:trPr>
+          <w:jc w:val="center"/>
+        </w:trPr>
+        <w:tc>
+          <w:tcPr>
+            <w:tcW w:w="704" w:type="dxa"/>
+          </w:tcPr>
+          <w:p>
+            <w:pPr>
+              <w:spacing w:line="360" w:lineRule="auto"/>
+              <w:rPr>
+                <w:szCs w:val="24"/>
+                <w:lang w:val="id-ID"/>
+              </w:rPr>
+            </w:pPr>
+            <w:r>
+              <w:rPr>
+                <w:szCs w:val="24"/>
+                <w:lang w:val="id-ID"/>
+              </w:rPr>
+              <w:t>5</w:t>
+            </w:r>
+          </w:p>
+        </w:tc>
+        <w:tc>
+          <w:tcPr>
+            <w:tcW w:w="3260" w:type="dxa"/>
+          </w:tcPr>
+          <w:p>
+            <w:pPr>
+              <w:spacing w:line="360" w:lineRule="auto"/>
+              <w:rPr>
+                <w:szCs w:val="24"/>
+                <w:lang w:val="id-ID"/>
+              </w:rPr>
+            </w:pPr>
+            <w:r>
+              <w:rPr>
+                <w:szCs w:val="24"/>
+                <w:lang w:val="id-ID"/>
+              </w:rPr>
+              <w:t>Breadboard</w:t>
+            </w:r>
+          </w:p>
+        </w:tc>
+        <w:tc>
+          <w:tcPr>
+            <w:tcW w:w="3382" w:type="dxa"/>
+          </w:tcPr>
+          <w:p>
+            <w:pPr>
+              <w:spacing w:line="360" w:lineRule="auto"/>
+              <w:rPr>
+                <w:szCs w:val="24"/>
+                <w:lang w:val="id-ID"/>
+              </w:rPr>
+            </w:pPr>
+            <w:r>
+              <w:rPr>
+                <w:szCs w:val="24"/>
+              </w:rPr>
+              <w:t>Media untuk merangkai rangkaian elektronik tanpa solder.</w:t>
+            </w:r>
+          </w:p>
+        </w:tc>
+      </w:tr>
+      <w:tr>
+        <w:trPr>
+          <w:jc w:val="center"/>
+        </w:trPr>
+        <w:tc>
+          <w:tcPr>
+            <w:tcW w:w="704" w:type="dxa"/>
+          </w:tcPr>
+          <w:p>
+            <w:pPr>
+              <w:spacing w:line="360" w:lineRule="auto"/>
+              <w:rPr>
+                <w:szCs w:val="24"/>
+                <w:lang w:val="id-ID"/>
+              </w:rPr>
+            </w:pPr>
+            <w:r>
+              <w:rPr>
+                <w:szCs w:val="24"/>
+                <w:lang w:val="id-ID"/>
+              </w:rPr>
+              <w:t>6</w:t>
+            </w:r>
+          </w:p>
+        </w:tc>
+        <w:tc>
+          <w:tcPr>
+            <w:tcW w:w="3260" w:type="dxa"/>
+          </w:tcPr>
+          <w:p>
+            <w:pPr>
+              <w:spacing w:line="360" w:lineRule="auto"/>
+              <w:rPr>
+                <w:szCs w:val="24"/>
+                <w:lang w:val="id-ID"/>
+              </w:rPr>
+            </w:pPr>
+            <w:r>
+              <w:rPr>
+                <w:szCs w:val="24"/>
+                <w:lang w:val="id-ID"/>
+              </w:rPr>
+              <w:t>Kabel Jumper</w:t>
+            </w:r>
+          </w:p>
+        </w:tc>
+        <w:tc>
+          <w:tcPr>
+            <w:tcW w:w="3382" w:type="dxa"/>
+          </w:tcPr>
+          <w:p>
+            <w:pPr>
+              <w:spacing w:line="360" w:lineRule="auto"/>
+              <w:rPr>
+                <w:szCs w:val="24"/>
+                <w:lang w:val="id-ID"/>
+              </w:rPr>
+            </w:pPr>
+            <w:r>
+              <w:rPr>
+                <w:szCs w:val="24"/>
+              </w:rPr>
+              <w:t>Digunakan sebagai penghubung antar modul</w:t>
+            </w:r>
+            <w:r>
+              <w:rPr>
+                <w:szCs w:val="24"/>
+              </w:rPr>
+              <w:t>.</w:t>
+            </w:r>
+          </w:p>
+        </w:tc>
+      </w:tr>
+      <w:tr>
+        <w:trPr>
+          <w:jc w:val="center"/>
+        </w:trPr>
+        <w:tc>
+          <w:tcPr>
+            <w:tcW w:w="704" w:type="dxa"/>
+          </w:tcPr>
+          <w:p>
+            <w:pPr>
+              <w:spacing w:line="360" w:lineRule="auto"/>
+              <w:rPr>
+                <w:szCs w:val="24"/>
+                <w:lang w:val="id-ID"/>
+              </w:rPr>
+            </w:pPr>
+            <w:r>
+              <w:rPr>
+                <w:szCs w:val="24"/>
+                <w:lang w:val="id-ID"/>
+              </w:rPr>
+              <w:t>7</w:t>
+            </w:r>
+          </w:p>
+        </w:tc>
+        <w:tc>
+          <w:tcPr>
+            <w:tcW w:w="3260" w:type="dxa"/>
+          </w:tcPr>
+          <w:p>
+            <w:pPr>
+              <w:spacing w:line="360" w:lineRule="auto"/>
+              <w:rPr>
+                <w:szCs w:val="24"/>
+                <w:lang w:val="id-ID"/>
+              </w:rPr>
+            </w:pPr>
+            <w:r>
+              <w:rPr>
+                <w:szCs w:val="24"/>
+                <w:lang w:val="id-ID"/>
+              </w:rPr>
+              <w:t>Resistor 4.7k</w:t>
+            </w:r>
+          </w:p>
+        </w:tc>
+        <w:tc>
+          <w:tcPr>
+            <w:tcW w:w="3382" w:type="dxa"/>
+          </w:tcPr>
+          <w:p>
+            <w:pPr>
+              <w:spacing w:line="360" w:lineRule="auto"/>
+              <w:rPr>
+                <w:szCs w:val="24"/>
+                <w:lang w:val="id-ID"/>
+              </w:rPr>
+            </w:pPr>
+            <w:r>
+              <w:rPr>
+                <w:szCs w:val="24"/>
+              </w:rPr>
+              <w:t>Biasanya digunakan sebagai resistor pull-up terutama pada jalur komunikasi</w:t>
+            </w:r>
+            <w:r>
+              <w:rPr>
+                <w:szCs w:val="24"/>
+              </w:rPr>
+              <w:t>.</w:t>
+            </w:r>
+          </w:p>
+        </w:tc>
+      </w:tr>
+    </w:tbl>
+    <w:p>
+      <w:pPr>
+        <w:spacing w:line="360" w:lineRule="auto"/>
         <w:rPr>
           <w:i/>
           <w:iCs/>
-          <w:lang w:val="id-ID"/>
-        </w:rPr>
-        <w:t>Input</w:t>
-      </w:r>
-      <w:bookmarkEnd w:id="33"/>
-    </w:p>
-    <w:p>
-      <w:pPr>
-        <w:spacing w:line="360" w:lineRule="auto"/>
-        <w:rPr>
-          <w:lang w:val="en-ID"/>
-        </w:rPr>
-      </w:pPr>
-      <w:r>
-        <w:tab/>
-      </w:r>
-      <w:r>
-        <w:rPr>
-          <w:lang w:val="en-ID"/>
-        </w:rPr>
-        <w:t>P</w:t>
-      </w:r>
-      <w:r>
-        <w:rPr>
-          <w:lang w:val="en-ID"/>
-        </w:rPr>
-        <w:t xml:space="preserve">enerapan Internet of Things (IoT) pada sektor </w:t>
-      </w:r>
-      <w:r>
-        <w:rPr>
-          <w:lang w:val="en-ID"/>
-        </w:rPr>
-        <w:t>peternakan</w:t>
-      </w:r>
-      <w:r>
-        <w:rPr>
-          <w:lang w:val="en-ID"/>
-        </w:rPr>
-        <w:t xml:space="preserve">, diperlukan beberapa input utama yang berfungsi sebagai sumber data untuk proses monitoring dan pengambilan keputusan. Di antaranya adalah </w:t>
-      </w:r>
-      <w:r>
-        <w:rPr>
-          <w:b/>
-          <w:bCs/>
-          <w:lang w:val="en-ID"/>
-        </w:rPr>
-        <w:t>data sensor GPS Neo-6M</w:t>
-      </w:r>
-      <w:r>
-        <w:rPr>
-          <w:lang w:val="en-ID"/>
-        </w:rPr>
-        <w:t xml:space="preserve">, yang digunakan untuk memperoleh informasi koordinat lokasi secara akurat sehingga posisi objek seperti hewan ternak dapat terlacak dengan jelas. Selain itu, dibutuhkan pula </w:t>
-      </w:r>
-      <w:r>
-        <w:rPr>
-          <w:b/>
-          <w:bCs/>
-          <w:lang w:val="en-ID"/>
-        </w:rPr>
-        <w:t>data visualisasi dari ESP32-</w:t>
-      </w:r>
-      <w:r>
-        <w:rPr>
-          <w:b/>
-          <w:bCs/>
-          <w:lang w:val="en-ID"/>
-        </w:rPr>
-        <w:t>Cam</w:t>
-      </w:r>
-      <w:r>
-        <w:rPr>
-          <w:lang w:val="en-ID"/>
-        </w:rPr>
-        <w:t>, yang berperan dalam memberikan tampilan gambar atau kondisi visual secara real-time di lapangan. Kombinasi kedua jenis data ini memungkinkan sistem IoT bekerja lebih efektif, karena mampu menampilkan informasi lokasi sekaligus visualisasi kondisi objek yang dipantau dalam satu platform.</w:t>
-      </w:r>
+          <w:szCs w:val="24"/>
+          <w:lang w:val="id-ID"/>
+        </w:rPr>
+      </w:pPr>
     </w:p>
     <w:p>
       <w:pPr>
@@ -11536,301 +12770,12 @@
           <w:lang w:val="id-ID"/>
         </w:rPr>
       </w:pPr>
-      <w:bookmarkStart w:id="34" w:name="_Toc215384871"/>
-      <w:r>
-        <w:rPr>
-          <w:lang w:val="id-ID"/>
-        </w:rPr>
-        <w:t xml:space="preserve">Kebutuhan </w:t>
-      </w:r>
-      <w:r>
-        <w:rPr>
-          <w:i/>
-          <w:iCs/>
-          <w:lang w:val="id-ID"/>
-        </w:rPr>
-        <w:t>Output</w:t>
-      </w:r>
-      <w:bookmarkEnd w:id="34"/>
-    </w:p>
-    <w:p>
-      <w:pPr>
-        <w:spacing w:line="360" w:lineRule="auto"/>
-        <w:rPr>
-          <w:lang w:val="en-ID"/>
-        </w:rPr>
-      </w:pPr>
-      <w:r>
-        <w:tab/>
-      </w:r>
-      <w:r>
-        <w:rPr>
-          <w:lang w:val="en-ID"/>
-        </w:rPr>
-        <w:t>P</w:t>
-      </w:r>
-      <w:r>
-        <w:rPr>
-          <w:lang w:val="en-ID"/>
-        </w:rPr>
-        <w:t xml:space="preserve">enerapan Internet of Things (IoT) pada sektor </w:t>
-      </w:r>
-      <w:r>
-        <w:rPr>
-          <w:lang w:val="en-ID"/>
-        </w:rPr>
-        <w:t>peternakan</w:t>
-      </w:r>
-      <w:r>
-        <w:rPr>
-          <w:lang w:val="en-ID"/>
-        </w:rPr>
-        <w:t xml:space="preserve">, sistem memerlukan beberapa keluaran utama yang menjadi hasil akhir dari proses monitoring dan pengolahan data. Output tersebut meliputi </w:t>
-      </w:r>
-      <w:r>
-        <w:rPr>
-          <w:b/>
-          <w:bCs/>
-          <w:lang w:val="en-ID"/>
-        </w:rPr>
-        <w:t>informasi nilai longitude dan latitude dari sensor GPS Neo-6M</w:t>
-      </w:r>
-      <w:r>
-        <w:rPr>
-          <w:lang w:val="en-ID"/>
-        </w:rPr>
-        <w:t xml:space="preserve">, yang memberikan data koordinat akurat untuk mengetahui posisi objek seperti hewan ternak di lapangan. Selain itu, sistem juga menghasilkan </w:t>
-      </w:r>
-      <w:r>
-        <w:rPr>
-          <w:b/>
-          <w:bCs/>
-          <w:lang w:val="en-ID"/>
-        </w:rPr>
-        <w:t>tampilan visualisasi dari sensor ESP32-CAM</w:t>
-      </w:r>
-      <w:r>
-        <w:rPr>
-          <w:lang w:val="en-ID"/>
-        </w:rPr>
-        <w:t>, yang menyediakan gambaran kondisi lingkungan atau objek secara real-time. Kedua keluaran ini memungkinkan petani atau peternak memperoleh informasi lokasi dan visual secara bersamaan, sehingga pengambilan keputusan dapat dilakukan dengan lebih cepat, tepat, dan efisien.</w:t>
-      </w:r>
-    </w:p>
-    <w:p>
-      <w:pPr>
-        <w:pStyle w:val="Heading3"/>
-        <w:numPr>
-          <w:ilvl w:val="2"/>
-          <w:numId w:val="7"/>
-        </w:numPr>
-        <w:spacing w:line="480" w:lineRule="auto"/>
-        <w:ind w:left="709" w:hanging="709"/>
-        <w:rPr>
-          <w:sz w:val="28"/>
-          <w:szCs w:val="32"/>
-          <w:lang w:val="id-ID"/>
-        </w:rPr>
-      </w:pPr>
-      <w:bookmarkStart w:id="35" w:name="_Toc215384872"/>
-      <w:r>
-        <w:rPr>
-          <w:lang w:val="id-ID"/>
-        </w:rPr>
-        <w:t>Kebutuhan Hardware</w:t>
-      </w:r>
-      <w:bookmarkEnd w:id="35"/>
-    </w:p>
-    <w:p>
-      <w:pPr>
-        <w:spacing w:line="360" w:lineRule="auto"/>
-      </w:pPr>
-      <w:r>
-        <w:tab/>
-      </w:r>
-      <w:r>
-        <w:t>Berikut adalah daftar kebutuhan hardware atau perangkat keras yang diperlukan dalam penerapan Internet of Things pada sektor pertanian:</w:t>
-      </w:r>
-    </w:p>
-    <w:p>
-      <w:pPr>
-        <w:pStyle w:val="ListParagraph"/>
-        <w:numPr>
-          <w:ilvl w:val="0"/>
-          <w:numId w:val="22"/>
-        </w:numPr>
-        <w:rPr>
-          <w:szCs w:val="24"/>
-          <w:lang w:val="id-ID"/>
-        </w:rPr>
-      </w:pPr>
-      <w:r>
-        <w:rPr>
-          <w:szCs w:val="24"/>
-          <w:lang w:val="id-ID"/>
-        </w:rPr>
-        <w:t>ESP32</w:t>
-      </w:r>
-    </w:p>
-    <w:p>
-      <w:pPr>
-        <w:pStyle w:val="ListParagraph"/>
-        <w:numPr>
-          <w:ilvl w:val="0"/>
-          <w:numId w:val="22"/>
-        </w:numPr>
-        <w:rPr>
-          <w:szCs w:val="24"/>
-          <w:lang w:val="id-ID"/>
-        </w:rPr>
-      </w:pPr>
-      <w:r>
-        <w:rPr>
-          <w:szCs w:val="24"/>
-          <w:lang w:val="id-ID"/>
-        </w:rPr>
-        <w:t>GPS Neo-6M</w:t>
-      </w:r>
-    </w:p>
-    <w:p>
-      <w:pPr>
-        <w:pStyle w:val="ListParagraph"/>
-        <w:numPr>
-          <w:ilvl w:val="0"/>
-          <w:numId w:val="22"/>
-        </w:numPr>
-        <w:rPr>
-          <w:szCs w:val="24"/>
-          <w:lang w:val="id-ID"/>
-        </w:rPr>
-      </w:pPr>
-      <w:r>
-        <w:rPr>
-          <w:szCs w:val="24"/>
-          <w:lang w:val="id-ID"/>
-        </w:rPr>
-        <w:t>ESP32-CAM</w:t>
-      </w:r>
-    </w:p>
-    <w:p>
-      <w:pPr>
-        <w:pStyle w:val="ListParagraph"/>
-        <w:numPr>
-          <w:ilvl w:val="0"/>
-          <w:numId w:val="22"/>
-        </w:numPr>
-        <w:rPr>
-          <w:i/>
-          <w:iCs/>
-          <w:szCs w:val="24"/>
-          <w:lang w:val="id-ID"/>
-        </w:rPr>
-      </w:pPr>
-      <w:r>
-        <w:rPr>
-          <w:i/>
-          <w:iCs/>
-          <w:szCs w:val="24"/>
-          <w:lang w:val="id-ID"/>
-        </w:rPr>
-        <w:t>Power Supply</w:t>
-      </w:r>
-    </w:p>
-    <w:p>
-      <w:pPr>
-        <w:pStyle w:val="ListParagraph"/>
-        <w:numPr>
-          <w:ilvl w:val="0"/>
-          <w:numId w:val="22"/>
-        </w:numPr>
-        <w:rPr>
-          <w:i/>
-          <w:iCs/>
-          <w:szCs w:val="24"/>
-          <w:lang w:val="id-ID"/>
-        </w:rPr>
-      </w:pPr>
-      <w:r>
-        <w:rPr>
-          <w:i/>
-          <w:iCs/>
-          <w:szCs w:val="24"/>
-          <w:lang w:val="id-ID"/>
-        </w:rPr>
-        <w:t>BreadBoard</w:t>
-      </w:r>
-    </w:p>
-    <w:p>
-      <w:pPr>
-        <w:pStyle w:val="ListParagraph"/>
-        <w:numPr>
-          <w:ilvl w:val="0"/>
-          <w:numId w:val="22"/>
-        </w:numPr>
-        <w:rPr>
-          <w:i/>
-          <w:iCs/>
-          <w:szCs w:val="24"/>
-          <w:lang w:val="id-ID"/>
-        </w:rPr>
-      </w:pPr>
-      <w:r>
-        <w:rPr>
-          <w:szCs w:val="24"/>
-          <w:lang w:val="id-ID"/>
-        </w:rPr>
-        <w:t xml:space="preserve">Kabel </w:t>
-      </w:r>
-      <w:r>
-        <w:rPr>
-          <w:i/>
-          <w:iCs/>
-          <w:szCs w:val="24"/>
-          <w:lang w:val="id-ID"/>
-        </w:rPr>
-        <w:t>Jumper</w:t>
-      </w:r>
-    </w:p>
-    <w:p>
-      <w:pPr>
-        <w:pStyle w:val="ListParagraph"/>
-        <w:numPr>
-          <w:ilvl w:val="0"/>
-          <w:numId w:val="22"/>
-        </w:numPr>
-        <w:rPr>
-          <w:i/>
-          <w:iCs/>
-          <w:szCs w:val="24"/>
-          <w:lang w:val="id-ID"/>
-        </w:rPr>
-      </w:pPr>
-      <w:r>
-        <w:rPr>
-          <w:szCs w:val="24"/>
-          <w:lang w:val="id-ID"/>
-        </w:rPr>
-        <w:t>Resistor 4.7k</w:t>
-      </w:r>
-    </w:p>
-    <w:p>
-      <w:pPr>
-        <w:pStyle w:val="Heading3"/>
-        <w:numPr>
-          <w:ilvl w:val="2"/>
-          <w:numId w:val="7"/>
-        </w:numPr>
-        <w:spacing w:line="480" w:lineRule="auto"/>
-        <w:ind w:left="709" w:hanging="709"/>
-        <w:rPr>
-          <w:lang w:val="id-ID"/>
-        </w:rPr>
-      </w:pPr>
       <w:bookmarkStart w:id="36" w:name="_Toc215384873"/>
       <w:r>
         <w:rPr>
           <w:lang w:val="id-ID"/>
         </w:rPr>
-        <w:t>Kebutuhan Software</w:t>
+        <w:t>Software</w:t>
       </w:r>
       <w:bookmarkEnd w:id="36"/>
     </w:p>
@@ -12235,7 +13180,7 @@
                     <pic:cNvPicPr/>
                   </pic:nvPicPr>
                   <pic:blipFill rotWithShape="1">
-                    <a:blip r:embed="rId14"/>
+                    <a:blip r:embed="rId17"/>
                     <a:srcRect l="31215" t="38761" r="33516" b="10353"/>
                     <a:stretch>
                       <a:fillRect/>
@@ -12278,7 +13223,7 @@
         </w:rPr>
       </w:pPr>
       <w:bookmarkStart w:id="39" w:name="_Toc215385070"/>
-      <w:bookmarkStart w:id="40" w:name="_Toc215385580"/>
+      <w:bookmarkStart w:id="40" w:name="_Toc216192580"/>
       <w:r>
         <w:rPr>
           <w:i w:val="0"/>
@@ -12409,6 +13354,38 @@
       </w:pPr>
       <w:r>
         <w:t>Sumber : Dokumentasi pribadi</w:t>
+      </w:r>
+      <w:r>
+        <w:t xml:space="preserve"> (Desain menggunakan </w:t>
+      </w:r>
+      <w:hyperlink r:id="rId18" w:history="1">
+        <w:r>
+          <w:rPr>
+            <w:rStyle w:val="Hyperlink"/>
+          </w:rPr>
+          <w:t>D</w:t>
+        </w:r>
+        <w:r>
+          <w:rPr>
+            <w:rStyle w:val="Hyperlink"/>
+          </w:rPr>
+          <w:t>raw</w:t>
+        </w:r>
+        <w:r>
+          <w:rPr>
+            <w:rStyle w:val="Hyperlink"/>
+          </w:rPr>
+          <w:t>.</w:t>
+        </w:r>
+        <w:r>
+          <w:rPr>
+            <w:rStyle w:val="Hyperlink"/>
+          </w:rPr>
+          <w:t>io</w:t>
+        </w:r>
+      </w:hyperlink>
+      <w:r>
+        <w:t>)</w:t>
       </w:r>
     </w:p>
     <w:p>
@@ -12558,8 +13535,8 @@
           <w:noProof/>
         </w:rPr>
         <w:drawing>
-          <wp:inline distT="0" distB="0" distL="0" distR="0" wp14:anchorId="6222161A" wp14:editId="057631E8">
-            <wp:extent cx="3319942" cy="3667125"/>
+          <wp:inline distT="0" distB="0" distL="0" distR="0" wp14:anchorId="6222161A" wp14:editId="3884B9F2">
+            <wp:extent cx="4044292" cy="4467225"/>
             <wp:effectExtent l="0" t="0" r="0" b="0"/>
             <wp:docPr id="612585546" name="Picture 1"/>
             <wp:cNvGraphicFramePr>
@@ -12573,7 +13550,7 @@
                     <pic:cNvPicPr/>
                   </pic:nvPicPr>
                   <pic:blipFill rotWithShape="1">
-                    <a:blip r:embed="rId15"/>
+                    <a:blip r:embed="rId19"/>
                     <a:srcRect l="33646" t="26462" r="35155" b="12276"/>
                     <a:stretch>
                       <a:fillRect/>
@@ -12582,7 +13559,7 @@
                   <pic:spPr bwMode="auto">
                     <a:xfrm>
                       <a:off x="0" y="0"/>
-                      <a:ext cx="3328778" cy="3676886"/>
+                      <a:ext cx="4064149" cy="4489159"/>
                     </a:xfrm>
                     <a:prstGeom prst="rect">
                       <a:avLst/>
@@ -12616,7 +13593,7 @@
         </w:rPr>
       </w:pPr>
       <w:bookmarkStart w:id="42" w:name="_Toc215385071"/>
-      <w:bookmarkStart w:id="43" w:name="_Toc215385581"/>
+      <w:bookmarkStart w:id="43" w:name="_Toc216192581"/>
       <w:r>
         <w:rPr>
           <w:i w:val="0"/>
@@ -12698,6 +13675,20 @@
       </w:pPr>
       <w:r>
         <w:t>Sumber : Dokumentasi pribadi</w:t>
+      </w:r>
+      <w:r>
+        <w:t xml:space="preserve"> (desain menggunakan </w:t>
+      </w:r>
+      <w:hyperlink r:id="rId20" w:history="1">
+        <w:r>
+          <w:rPr>
+            <w:rStyle w:val="Hyperlink"/>
+          </w:rPr>
+          <w:t>Draw.io</w:t>
+        </w:r>
+      </w:hyperlink>
+      <w:r>
+        <w:t>)</w:t>
       </w:r>
     </w:p>
     <w:p>
@@ -12791,10 +13782,6 @@
         <w:pStyle w:val="ListParagraph"/>
         <w:spacing w:line="360" w:lineRule="auto"/>
         <w:ind w:left="0"/>
-        <w:jc w:val="center"/>
-        <w:rPr>
-          <w:noProof/>
-        </w:rPr>
       </w:pPr>
     </w:p>
     <w:p>
@@ -12809,10 +13796,10 @@
           <w:noProof/>
         </w:rPr>
         <w:drawing>
-          <wp:inline distT="0" distB="0" distL="0" distR="0" wp14:anchorId="2B7622FB" wp14:editId="40EFD83E">
-            <wp:extent cx="2846717" cy="2132828"/>
-            <wp:effectExtent l="0" t="0" r="0" b="1270"/>
-            <wp:docPr id="1897134509" name="Picture 1"/>
+          <wp:inline distT="0" distB="0" distL="0" distR="0" wp14:anchorId="7C1B07A0" wp14:editId="5B152C61">
+            <wp:extent cx="3923915" cy="3248025"/>
+            <wp:effectExtent l="0" t="0" r="635" b="0"/>
+            <wp:docPr id="62149507" name="Picture 1"/>
             <wp:cNvGraphicFramePr>
               <a:graphicFrameLocks xmlns:a="http://schemas.openxmlformats.org/drawingml/2006/main" noChangeAspect="1"/>
             </wp:cNvGraphicFramePr>
@@ -12820,12 +13807,12 @@
               <a:graphicData uri="http://schemas.openxmlformats.org/drawingml/2006/picture">
                 <pic:pic xmlns:pic="http://schemas.openxmlformats.org/drawingml/2006/picture">
                   <pic:nvPicPr>
-                    <pic:cNvPr id="1897134509" name=""/>
+                    <pic:cNvPr id="62149507" name=""/>
                     <pic:cNvPicPr/>
                   </pic:nvPicPr>
                   <pic:blipFill rotWithShape="1">
-                    <a:blip r:embed="rId16"/>
-                    <a:srcRect l="29918" t="28235" r="21501" b="7062"/>
+                    <a:blip r:embed="rId21"/>
+                    <a:srcRect l="27528" t="27187" r="29853" b="10102"/>
                     <a:stretch>
                       <a:fillRect/>
                     </a:stretch>
@@ -12833,7 +13820,7 @@
                   <pic:spPr bwMode="auto">
                     <a:xfrm>
                       <a:off x="0" y="0"/>
-                      <a:ext cx="2860523" cy="2143171"/>
+                      <a:ext cx="3942289" cy="3263234"/>
                     </a:xfrm>
                     <a:prstGeom prst="rect">
                       <a:avLst/>
@@ -12866,6 +13853,7 @@
           <w:szCs w:val="24"/>
         </w:rPr>
       </w:pPr>
+      <w:bookmarkStart w:id="45" w:name="_Toc216192582"/>
       <w:r>
         <w:rPr>
           <w:i w:val="0"/>
@@ -12947,6 +13935,7 @@
         </w:rPr>
         <w:t>Rancangan Hardware</w:t>
       </w:r>
+      <w:bookmarkEnd w:id="45"/>
     </w:p>
     <w:p>
       <w:pPr>
@@ -12954,6 +13943,20 @@
       </w:pPr>
       <w:r>
         <w:t>Sumber : Dokumentasi pribadi</w:t>
+      </w:r>
+      <w:r>
+        <w:t xml:space="preserve"> (desain menggunakan </w:t>
+      </w:r>
+      <w:hyperlink r:id="rId22" w:history="1">
+        <w:r>
+          <w:rPr>
+            <w:rStyle w:val="Hyperlink"/>
+          </w:rPr>
+          <w:t>cirkitdesigner</w:t>
+        </w:r>
+      </w:hyperlink>
+      <w:r>
+        <w:t>)</w:t>
       </w:r>
     </w:p>
     <w:p>
@@ -12967,7 +13970,7 @@
           <w:lang w:val="id-ID"/>
         </w:rPr>
       </w:pPr>
-      <w:bookmarkStart w:id="45" w:name="_Toc215384878"/>
+      <w:bookmarkStart w:id="46" w:name="_Toc215384878"/>
       <w:r>
         <w:rPr>
           <w:lang w:val="id-ID"/>
@@ -12994,7 +13997,7 @@
         </w:rPr>
         <w:t>Konfigurasi ESP32</w:t>
       </w:r>
-      <w:bookmarkEnd w:id="45"/>
+      <w:bookmarkEnd w:id="46"/>
     </w:p>
     <w:p>
       <w:pPr>
@@ -13050,10 +14053,10 @@
           <w:noProof/>
         </w:rPr>
         <w:drawing>
-          <wp:inline distT="0" distB="0" distL="0" distR="0" wp14:anchorId="7DEF2167" wp14:editId="6FA79FD0">
-            <wp:extent cx="2976257" cy="2475781"/>
-            <wp:effectExtent l="0" t="0" r="0" b="1270"/>
-            <wp:docPr id="1379683375" name="Picture 1"/>
+          <wp:inline distT="0" distB="0" distL="0" distR="0" wp14:anchorId="3EDD4541" wp14:editId="096579C6">
+            <wp:extent cx="3331666" cy="2600325"/>
+            <wp:effectExtent l="0" t="0" r="2540" b="0"/>
+            <wp:docPr id="378045610" name="Picture 1"/>
             <wp:cNvGraphicFramePr>
               <a:graphicFrameLocks xmlns:a="http://schemas.openxmlformats.org/drawingml/2006/main" noChangeAspect="1"/>
             </wp:cNvGraphicFramePr>
@@ -13061,12 +14064,12 @@
               <a:graphicData uri="http://schemas.openxmlformats.org/drawingml/2006/picture">
                 <pic:pic xmlns:pic="http://schemas.openxmlformats.org/drawingml/2006/picture">
                   <pic:nvPicPr>
-                    <pic:cNvPr id="1379683375" name=""/>
+                    <pic:cNvPr id="378045610" name=""/>
                     <pic:cNvPicPr/>
                   </pic:nvPicPr>
                   <pic:blipFill rotWithShape="1">
-                    <a:blip r:embed="rId17"/>
-                    <a:srcRect l="49678" t="37106" r="17443" b="14275"/>
+                    <a:blip r:embed="rId23"/>
+                    <a:srcRect l="27936" t="34800" r="38622" b="18801"/>
                     <a:stretch>
                       <a:fillRect/>
                     </a:stretch>
@@ -13074,7 +14077,7 @@
                   <pic:spPr bwMode="auto">
                     <a:xfrm>
                       <a:off x="0" y="0"/>
-                      <a:ext cx="3011988" cy="2505504"/>
+                      <a:ext cx="3342729" cy="2608959"/>
                     </a:xfrm>
                     <a:prstGeom prst="rect">
                       <a:avLst/>
@@ -13107,6 +14110,7 @@
           <w:szCs w:val="24"/>
         </w:rPr>
       </w:pPr>
+      <w:bookmarkStart w:id="47" w:name="_Toc216192583"/>
       <w:r>
         <w:rPr>
           <w:i w:val="0"/>
@@ -13178,6 +14182,7 @@
         </w:rPr>
         <w:t xml:space="preserve"> Konfigurasi ESP32</w:t>
       </w:r>
+      <w:bookmarkEnd w:id="47"/>
     </w:p>
     <w:p>
       <w:pPr>
@@ -13191,6 +14196,23 @@
       </w:r>
       <w:r>
         <w:t>ribadi</w:t>
+      </w:r>
+      <w:r>
+        <w:t xml:space="preserve"> </w:t>
+      </w:r>
+      <w:r>
+        <w:t xml:space="preserve">(desain menggunakan </w:t>
+      </w:r>
+      <w:hyperlink r:id="rId24" w:history="1">
+        <w:r>
+          <w:rPr>
+            <w:rStyle w:val="Hyperlink"/>
+          </w:rPr>
+          <w:t>cirkitdesigner</w:t>
+        </w:r>
+      </w:hyperlink>
+      <w:r>
+        <w:t>)</w:t>
       </w:r>
     </w:p>
     <w:p>
@@ -13204,7 +14226,7 @@
           <w:lang w:val="id-ID"/>
         </w:rPr>
       </w:pPr>
-      <w:bookmarkStart w:id="46" w:name="_Toc215384879"/>
+      <w:bookmarkStart w:id="48" w:name="_Toc215384879"/>
       <w:r>
         <w:rPr>
           <w:lang w:val="id-ID"/>
@@ -13261,7 +14283,7 @@
         </w:rPr>
         <w:t>M</w:t>
       </w:r>
-      <w:bookmarkEnd w:id="46"/>
+      <w:bookmarkEnd w:id="48"/>
     </w:p>
     <w:p>
       <w:pPr>
@@ -13341,10 +14363,10 @@
           <w:noProof/>
         </w:rPr>
         <w:drawing>
-          <wp:inline distT="0" distB="0" distL="0" distR="0" wp14:anchorId="50DF654B" wp14:editId="5D206C34">
-            <wp:extent cx="2770371" cy="2855344"/>
-            <wp:effectExtent l="0" t="0" r="0" b="2540"/>
-            <wp:docPr id="1767555048" name="Picture 1"/>
+          <wp:inline distT="0" distB="0" distL="0" distR="0" wp14:anchorId="4F81F0EE" wp14:editId="32398814">
+            <wp:extent cx="4139565" cy="2819400"/>
+            <wp:effectExtent l="0" t="0" r="0" b="0"/>
+            <wp:docPr id="686112904" name="Picture 1"/>
             <wp:cNvGraphicFramePr>
               <a:graphicFrameLocks xmlns:a="http://schemas.openxmlformats.org/drawingml/2006/main" noChangeAspect="1"/>
             </wp:cNvGraphicFramePr>
@@ -13352,12 +14374,12 @@
               <a:graphicData uri="http://schemas.openxmlformats.org/drawingml/2006/picture">
                 <pic:pic xmlns:pic="http://schemas.openxmlformats.org/drawingml/2006/picture">
                   <pic:nvPicPr>
-                    <pic:cNvPr id="1767555048" name=""/>
+                    <pic:cNvPr id="686112904" name=""/>
                     <pic:cNvPicPr/>
                   </pic:nvPicPr>
                   <pic:blipFill rotWithShape="1">
-                    <a:blip r:embed="rId18"/>
-                    <a:srcRect l="36015" t="29233" r="32962" b="13926"/>
+                    <a:blip r:embed="rId25"/>
+                    <a:srcRect l="27325" t="27187" r="29038" b="26051"/>
                     <a:stretch>
                       <a:fillRect/>
                     </a:stretch>
@@ -13365,7 +14387,7 @@
                   <pic:spPr bwMode="auto">
                     <a:xfrm>
                       <a:off x="0" y="0"/>
-                      <a:ext cx="2783819" cy="2869205"/>
+                      <a:ext cx="4152608" cy="2828283"/>
                     </a:xfrm>
                     <a:prstGeom prst="rect">
                       <a:avLst/>
@@ -13398,6 +14420,7 @@
           <w:szCs w:val="24"/>
         </w:rPr>
       </w:pPr>
+      <w:bookmarkStart w:id="49" w:name="_Toc216192584"/>
       <w:r>
         <w:rPr>
           <w:i w:val="0"/>
@@ -13479,6 +14502,7 @@
         </w:rPr>
         <w:t>-6M</w:t>
       </w:r>
+      <w:bookmarkEnd w:id="49"/>
     </w:p>
     <w:p>
       <w:pPr>
@@ -13486,6 +14510,23 @@
       </w:pPr>
       <w:r>
         <w:t>Sumber : Dokumentasi pribadi</w:t>
+      </w:r>
+      <w:r>
+        <w:t xml:space="preserve"> </w:t>
+      </w:r>
+      <w:r>
+        <w:t xml:space="preserve">(desain menggunakan </w:t>
+      </w:r>
+      <w:hyperlink r:id="rId26" w:history="1">
+        <w:r>
+          <w:rPr>
+            <w:rStyle w:val="Hyperlink"/>
+          </w:rPr>
+          <w:t>cirkitdesigner</w:t>
+        </w:r>
+      </w:hyperlink>
+      <w:r>
+        <w:t>)</w:t>
       </w:r>
     </w:p>
     <w:p>
@@ -13499,7 +14540,7 @@
           <w:lang w:val="id-ID"/>
         </w:rPr>
       </w:pPr>
-      <w:bookmarkStart w:id="47" w:name="_Toc215384880"/>
+      <w:bookmarkStart w:id="50" w:name="_Toc215384880"/>
       <w:r>
         <w:rPr>
           <w:lang w:val="id-ID"/>
@@ -13526,7 +14567,7 @@
         </w:rPr>
         <w:t>Konfigurasi ESP32-CAM</w:t>
       </w:r>
-      <w:bookmarkEnd w:id="47"/>
+      <w:bookmarkEnd w:id="50"/>
     </w:p>
     <w:p>
       <w:pPr>
@@ -13599,10 +14640,10 @@
           <w:noProof/>
         </w:rPr>
         <w:drawing>
-          <wp:inline distT="0" distB="0" distL="0" distR="0" wp14:anchorId="661FEE0F" wp14:editId="32A66766">
-            <wp:extent cx="3165894" cy="2087245"/>
-            <wp:effectExtent l="0" t="0" r="0" b="8255"/>
-            <wp:docPr id="1328236582" name="Picture 1"/>
+          <wp:inline distT="0" distB="0" distL="0" distR="0" wp14:anchorId="4762D96E" wp14:editId="69669788">
+            <wp:extent cx="3521143" cy="2990850"/>
+            <wp:effectExtent l="0" t="0" r="3175" b="0"/>
+            <wp:docPr id="990980859" name="Picture 1"/>
             <wp:cNvGraphicFramePr>
               <a:graphicFrameLocks xmlns:a="http://schemas.openxmlformats.org/drawingml/2006/main" noChangeAspect="1"/>
             </wp:cNvGraphicFramePr>
@@ -13610,12 +14651,12 @@
               <a:graphicData uri="http://schemas.openxmlformats.org/drawingml/2006/picture">
                 <pic:pic xmlns:pic="http://schemas.openxmlformats.org/drawingml/2006/picture">
                   <pic:nvPicPr>
-                    <pic:cNvPr id="1328236582" name=""/>
+                    <pic:cNvPr id="990980859" name=""/>
                     <pic:cNvPicPr/>
                   </pic:nvPicPr>
                   <pic:blipFill rotWithShape="1">
-                    <a:blip r:embed="rId19"/>
-                    <a:srcRect l="41558" t="40713" r="26223" b="21526"/>
+                    <a:blip r:embed="rId27"/>
+                    <a:srcRect l="29160" t="34799" r="36990" b="14089"/>
                     <a:stretch>
                       <a:fillRect/>
                     </a:stretch>
@@ -13623,7 +14664,7 @@
                   <pic:spPr bwMode="auto">
                     <a:xfrm>
                       <a:off x="0" y="0"/>
-                      <a:ext cx="3173660" cy="2092365"/>
+                      <a:ext cx="3528094" cy="2996754"/>
                     </a:xfrm>
                     <a:prstGeom prst="rect">
                       <a:avLst/>
@@ -13656,6 +14697,7 @@
           <w:szCs w:val="24"/>
         </w:rPr>
       </w:pPr>
+      <w:bookmarkStart w:id="51" w:name="_Toc216192585"/>
       <w:r>
         <w:rPr>
           <w:i w:val="0"/>
@@ -13737,6 +14779,7 @@
         </w:rPr>
         <w:t>-Cam</w:t>
       </w:r>
+      <w:bookmarkEnd w:id="51"/>
     </w:p>
     <w:p>
       <w:pPr>
@@ -13744,6 +14787,23 @@
       </w:pPr>
       <w:r>
         <w:t>Sumber : Dokumentasi pribadi</w:t>
+      </w:r>
+      <w:r>
+        <w:t xml:space="preserve"> </w:t>
+      </w:r>
+      <w:r>
+        <w:t xml:space="preserve">(desain menggunakan </w:t>
+      </w:r>
+      <w:hyperlink r:id="rId28" w:history="1">
+        <w:r>
+          <w:rPr>
+            <w:rStyle w:val="Hyperlink"/>
+          </w:rPr>
+          <w:t>cirkitdesigner</w:t>
+        </w:r>
+      </w:hyperlink>
+      <w:r>
+        <w:t>)</w:t>
       </w:r>
     </w:p>
     <w:p>
@@ -13757,7 +14817,7 @@
           <w:lang w:val="id-ID"/>
         </w:rPr>
       </w:pPr>
-      <w:bookmarkStart w:id="48" w:name="_Toc215384881"/>
+      <w:bookmarkStart w:id="52" w:name="_Toc215384881"/>
       <w:r>
         <w:rPr>
           <w:lang w:val="id-ID"/>
@@ -13783,7 +14843,7 @@
         </w:rPr>
         <w:t>Perancangan Pengujian Sistem</w:t>
       </w:r>
-      <w:bookmarkEnd w:id="48"/>
+      <w:bookmarkEnd w:id="52"/>
     </w:p>
     <w:p>
       <w:pPr>
@@ -13923,8 +14983,8 @@
           <w:szCs w:val="24"/>
         </w:rPr>
       </w:pPr>
-      <w:bookmarkStart w:id="49" w:name="_Toc215385251"/>
-      <w:bookmarkStart w:id="50" w:name="_Toc215385274"/>
+      <w:bookmarkStart w:id="53" w:name="_Toc215385251"/>
+      <w:bookmarkStart w:id="54" w:name="_Toc216192527"/>
       <w:r>
         <w:rPr>
           <w:i w:val="0"/>
@@ -13974,7 +15034,7 @@
           <w:sz w:val="24"/>
           <w:szCs w:val="24"/>
         </w:rPr>
-        <w:t>1</w:t>
+        <w:t>2</w:t>
       </w:r>
       <w:r>
         <w:rPr>
@@ -13996,8 +15056,8 @@
         </w:rPr>
         <w:t xml:space="preserve"> Perancangan pengujian sistem</w:t>
       </w:r>
-      <w:bookmarkEnd w:id="49"/>
-      <w:bookmarkEnd w:id="50"/>
+      <w:bookmarkEnd w:id="53"/>
+      <w:bookmarkEnd w:id="54"/>
     </w:p>
     <w:tbl>
       <w:tblPr>
@@ -14315,14 +15375,6 @@
     </w:tbl>
     <w:p>
       <w:pPr>
-        <w:pStyle w:val="Heading1"/>
-        <w:rPr>
-          <w:lang w:val="id-ID"/>
-        </w:rPr>
-      </w:pPr>
-    </w:p>
-    <w:p>
-      <w:pPr>
         <w:spacing w:line="259" w:lineRule="auto"/>
         <w:jc w:val="left"/>
         <w:rPr>
@@ -14333,6 +15385,20 @@
           <w:lang w:val="id-ID"/>
         </w:rPr>
       </w:pPr>
+    </w:p>
+    <w:p>
+      <w:pPr>
+        <w:spacing w:line="259" w:lineRule="auto"/>
+        <w:jc w:val="left"/>
+        <w:rPr>
+          <w:rFonts w:eastAsiaTheme="majorEastAsia" w:cstheme="majorBidi"/>
+          <w:b/>
+          <w:sz w:val="28"/>
+          <w:szCs w:val="32"/>
+          <w:lang w:val="id-ID"/>
+        </w:rPr>
+      </w:pPr>
+      <w:bookmarkStart w:id="55" w:name="_Toc215384882"/>
       <w:r>
         <w:rPr>
           <w:lang w:val="id-ID"/>
@@ -14347,14 +15413,13 @@
           <w:lang w:val="id-ID"/>
         </w:rPr>
       </w:pPr>
-      <w:bookmarkStart w:id="51" w:name="_Toc215384882"/>
       <w:r>
         <w:rPr>
           <w:lang w:val="id-ID"/>
         </w:rPr>
         <w:t>Daftar Pustaka</w:t>
       </w:r>
-      <w:bookmarkEnd w:id="51"/>
+      <w:bookmarkEnd w:id="55"/>
     </w:p>
     <w:p>
       <w:pPr>
@@ -14402,7 +15467,21 @@
         <w:fldChar w:fldCharType="separate"/>
       </w:r>
       <w:r>
-        <w:t>Al-Fajri, S. (n.d.). Rancang Bangun Alat Pengering Ikan dengan Memonitoring Suhu dan Kelembapan Berbasis Internet of Things (IoT).</w:t>
+        <w:t>[1]</w:t>
+      </w:r>
+      <w:r>
+        <w:tab/>
+        <w:t xml:space="preserve">G. H. Wibowo, M. D. Ayatullah, and J. A. Prasetyo, “SISTEM CERDAS PEMANTAU HEWAN TERNAK PADA ALAM BEBAS BERBASIS INTERNET OF THINGS (IOT),” </w:t>
+      </w:r>
+      <w:r>
+        <w:rPr>
+          <w:i/>
+          <w:iCs/>
+        </w:rPr>
+        <w:t>J. ELTEK</w:t>
+      </w:r>
+      <w:r>
+        <w:t>, vol. 17, no. 2, p. 18, Nov. 2019, doi: 10.33795/eltek.v17i2.188.</w:t>
       </w:r>
     </w:p>
     <w:p>
@@ -14410,7 +15489,11 @@
         <w:pStyle w:val="Bibliography"/>
       </w:pPr>
       <w:r>
-        <w:t>Angriawan, R., &amp; Anugraha, N. (2019). Sistem Pelacak Lokasi Sapi dengan Sistem Komunikasi LoRa. Inspiration: Jurnal Teknologi Informasi dan Komunikasi, 9(1), 33. https://doi.org/10.35585/inspir.v9i1.2494</w:t>
+        <w:t>[2]</w:t>
+      </w:r>
+      <w:r>
+        <w:tab/>
+        <w:t>kahaba.net, “Kota Bima Masih Jorok, Ternak Liar dan Pemerintah Terus Berbenah - Kabar Harian Bima,” https://kahaba.net. Accessed: Nov. 27, 2025. [Online]. Available: https://kahaba.net/kota-bima-masih-jorok-ternak-liar-dan-pemerintah-terus-berbenah</w:t>
       </w:r>
     </w:p>
     <w:p>
@@ -14418,7 +15501,11 @@
         <w:pStyle w:val="Bibliography"/>
       </w:pPr>
       <w:r>
-        <w:t>Annisa, F., Farida, I. N., Sahertian, J., Yahya, N. H., Septiawan, I., Salsabila, A. M., &amp; Setiawan, B. (n.d.). Sistem Controlling Pembuatan Pakan Ternak Silase Menggunakan ESP32 Berbasis IoT.</w:t>
+        <w:t>[3]</w:t>
+      </w:r>
+      <w:r>
+        <w:tab/>
+        <w:t>M. F. Muta’affif, M. Mujtahid, B. E. Bari, and M. Evita, “Sistem Kendali Peternakan Jarak Jauh Berbasis Internet of Things (IoT),” 2017.</w:t>
       </w:r>
     </w:p>
     <w:p>
@@ -14426,7 +15513,11 @@
         <w:pStyle w:val="Bibliography"/>
       </w:pPr>
       <w:r>
-        <w:t>Arta, I. K. C., Febriyanto, A., Nugraha, I. B. M. H. A., Widharma, I. G. S., &amp; Purnama, I. B. I. (2022). Animal Tracking Berbasis Internet of Things. Majalah Ilmiah Teknologi Elektro, 21(1), 7. https://doi.org/10.24843/MITE.2022.v21i01.P02</w:t>
+        <w:t>[4]</w:t>
+      </w:r>
+      <w:r>
+        <w:tab/>
+        <w:t>S. Al-Fajri, “Rancang Bangun Alat Pengering Ikan dengan Memonitoring Suhu dan Kelembapan Berbasis Internet of Things (IoT)”.</w:t>
       </w:r>
     </w:p>
     <w:p>
@@ -14434,7 +15525,21 @@
         <w:pStyle w:val="Bibliography"/>
       </w:pPr>
       <w:r>
-        <w:t>Gunadi, I. G. A. (2022). Wahana Matematika dan Sains: Jurnal Matematika, Sains, dan Pembelajarannya, Vol. 16  No 3,  Desember  2022                                                                                        e-ISSN: 2549-6727 ,  p-ISSN: 1858-0629. Jurnal Matematika, 16(3).</w:t>
+        <w:t>[5]</w:t>
+      </w:r>
+      <w:r>
+        <w:tab/>
+        <w:t xml:space="preserve">L. Tambunan and D. D. Putra, “SISTEM KONTROL KENDARAAN BERBASIS IOT,” </w:t>
+      </w:r>
+      <w:r>
+        <w:rPr>
+          <w:i/>
+          <w:iCs/>
+        </w:rPr>
+        <w:t>JSR Jar. Sist. Inf. Robot.</w:t>
+      </w:r>
+      <w:r>
+        <w:t>, vol. 3, no. 1, pp. 152–160, July 2019, doi: 10.58486/jsr.v3i1.41.</w:t>
       </w:r>
     </w:p>
     <w:p>
@@ -14442,7 +15547,21 @@
         <w:pStyle w:val="Bibliography"/>
       </w:pPr>
       <w:r>
-        <w:t>Humam, F., &amp; Triawan, M. A. (2024). Sistem Keamanan Ruangan Menggunakan ESP32CAM dan Sensor Gerak Berbasis IoT. Infotek: Jurnal Informatika dan Teknologi, 7(2), 575–584. https://doi.org/10.29408/jit.v7i2.26109</w:t>
+        <w:t>[6]</w:t>
+      </w:r>
+      <w:r>
+        <w:tab/>
+        <w:t xml:space="preserve">A. Rifaini, S. Sintaro, and A. Surahman, “ALAT PERANGKAP DAN KAMERA PENGAWAS DENGAN MENGGUNAKAN ESP32-CAM SEBAGAI SISTEM KEAMANAN KANDANG AYAM,” </w:t>
+      </w:r>
+      <w:r>
+        <w:rPr>
+          <w:i/>
+          <w:iCs/>
+        </w:rPr>
+        <w:t>J. Tek. Dan Sist. Komput.</w:t>
+      </w:r>
+      <w:r>
+        <w:t>, vol. 2, no. 2, pp. 52–63, Jan. 2022, doi: 10.33365/jtikom.v2i2.1486.</w:t>
       </w:r>
     </w:p>
     <w:p>
@@ -14450,7 +15569,21 @@
         <w:pStyle w:val="Bibliography"/>
       </w:pPr>
       <w:r>
-        <w:t>kahaba.net. (2024, March 5). Kota Bima Masih Jorok, Ternak Liar dan Pemerintah Terus Berbenah—Kabar Harian Bima. https://kahaba.net. https://kahaba.net/kota-bima-masih-jorok-ternak-liar-dan-pemerintah-terus-berbenah</w:t>
+        <w:t>[7]</w:t>
+      </w:r>
+      <w:r>
+        <w:tab/>
+        <w:t xml:space="preserve">R. Angriawan and N. Anugraha, “Sistem Pelacak Lokasi Sapi dengan Sistem Komunikasi LoRa,” </w:t>
+      </w:r>
+      <w:r>
+        <w:rPr>
+          <w:i/>
+          <w:iCs/>
+        </w:rPr>
+        <w:t>Inspir. J. Teknol. Inf. Dan Komun.</w:t>
+      </w:r>
+      <w:r>
+        <w:t>, vol. 9, no. 1, p. 33, June 2019, doi: 10.35585/inspir.v9i1.2494.</w:t>
       </w:r>
     </w:p>
     <w:p>
@@ -14458,7 +15591,11 @@
         <w:pStyle w:val="Bibliography"/>
       </w:pPr>
       <w:r>
-        <w:t>M Rif’an. (2024). PENERAPAN IOT DALAM PERTANIAN PRESISI UNTUK PENINGKATAN PRODUKSI DAN EFISIENSI PENGGUNAAN SUMBER DAYA.</w:t>
+        <w:t>[8]</w:t>
+      </w:r>
+      <w:r>
+        <w:tab/>
+        <w:t>N. P. Sukanteri, P. K. Suparyana, I. M. Suryana, and I. M. D. Setyawan, “TEKNOLOGI PERTANIAN TERPADU BERBASIS FILOSOFI TRI HITA KARANA DALAM USAHATANI MENUJU PERTANIAN ORGANIK”.</w:t>
       </w:r>
     </w:p>
     <w:p>
@@ -14466,7 +15603,21 @@
         <w:pStyle w:val="Bibliography"/>
       </w:pPr>
       <w:r>
-        <w:t>Muchtar, H., &amp; Ulhaq, M. Z. H. (n.d.). Rancang Bangun Smart Monitoring Farming pada Media Tanah Menggunakan Sistem IoT (Internet of Things). 6(2).</w:t>
+        <w:t>[9]</w:t>
+      </w:r>
+      <w:r>
+        <w:tab/>
+        <w:t xml:space="preserve">S. Wolfert, L. Ge, C. Verdouw, and M.-J. Bogaardt, “Big Data in Smart Farming – A review,” </w:t>
+      </w:r>
+      <w:r>
+        <w:rPr>
+          <w:i/>
+          <w:iCs/>
+        </w:rPr>
+        <w:t>Agric. Syst.</w:t>
+      </w:r>
+      <w:r>
+        <w:t>, vol. 153, pp. 69–80, May 2017, doi: 10.1016/j.agsy.2017.01.023.</w:t>
       </w:r>
     </w:p>
     <w:p>
@@ -14474,7 +15625,11 @@
         <w:pStyle w:val="Bibliography"/>
       </w:pPr>
       <w:r>
-        <w:t>Mukti, M. Z., Nandika, R., &amp; Susanti, E. (2024). PERANCANGAN SECURITY SISTEM SMART HOME BERBASIS IOT MENGGUNAKAN ESP32 CAM DAN SENSOR PIR (PASSIVE INFRARED SENSOR) MELALUI APLIKASI BLYNK. SIGMA TEKNIKA, 7(2), 349–360. https://doi.org/10.33373/sigmateknika.v7i2.6982</w:t>
+        <w:t>[10]</w:t>
+      </w:r>
+      <w:r>
+        <w:tab/>
+        <w:t>M Rif’an, “PENERAPAN IOT DALAM PERTANIAN PRESISI UNTUK PENINGKATAN PRODUKSI DAN EFISIENSI PENGGUNAAN SUMBER DAYA,” 2024.</w:t>
       </w:r>
     </w:p>
     <w:p>
@@ -14482,7 +15637,21 @@
         <w:pStyle w:val="Bibliography"/>
       </w:pPr>
       <w:r>
-        <w:t>Muta’affif, M. F., Mujtahid, M., Bari, B. E., &amp; Evita, M. (2017). Sistem Kendali Peternakan Jarak Jauh Berbasis Internet of Things (IoT).</w:t>
+        <w:t>[11]</w:t>
+      </w:r>
+      <w:r>
+        <w:tab/>
+        <w:t xml:space="preserve">A. Wijaya and M. Rivai, “Monitoring dan Kontrol Sistem irigasi Berbasis IoT Menggunakan Banana PI,” </w:t>
+      </w:r>
+      <w:r>
+        <w:rPr>
+          <w:i/>
+          <w:iCs/>
+        </w:rPr>
+        <w:t>J. Tek. ITS</w:t>
+      </w:r>
+      <w:r>
+        <w:t>, vol. 7, no. 2, pp. 288–292, Dec. 2018, doi: 10.12962/j23373539.v7i2.31113.</w:t>
       </w:r>
     </w:p>
     <w:p>
@@ -14490,7 +15659,21 @@
         <w:pStyle w:val="Bibliography"/>
       </w:pPr>
       <w:r>
-        <w:t>Nuryadi, F., Septiani, N. W. P., &amp; Lestari, M. (2025). Implementasi ESP32 Untuk Sistem Pemantauan Kesuburan Tanah Berbasis IoT. Semnas Ristek (Seminar Nasional Riset dan Inovasi Teknologi), 9(1), 79–86. https://doi.org/10.30998/semnasristek.v9i1.7550</w:t>
+        <w:t>[12]</w:t>
+      </w:r>
+      <w:r>
+        <w:tab/>
+        <w:t xml:space="preserve">I. G. A. Gunadi, “Wahana Matematika dan Sains: Jurnal Matematika, Sains, dan Pembelajarannya, Vol. 16  No 3,  Desember  2022                                                                                        e-ISSN: 2549-6727 ,  p-ISSN: 1858-0629,” </w:t>
+      </w:r>
+      <w:r>
+        <w:rPr>
+          <w:i/>
+          <w:iCs/>
+        </w:rPr>
+        <w:t>J. Mat.</w:t>
+      </w:r>
+      <w:r>
+        <w:t>, vol. 16, no. 3, 2022.</w:t>
       </w:r>
     </w:p>
     <w:p>
@@ -14498,7 +15681,21 @@
         <w:pStyle w:val="Bibliography"/>
       </w:pPr>
       <w:r>
-        <w:t>Rifaini, A., Sintaro, S., &amp; Surahman, A. (2022). ALAT PERANGKAP DAN KAMERA PENGAWAS DENGAN MENGGUNAKAN ESP32-CAM SEBAGAI SISTEM KEAMANAN KANDANG AYAM. Jurnal Teknik dan Sistem Komputer, 2(2), 52–63. https://doi.org/10.33365/jtikom.v2i2.1486</w:t>
+        <w:t>[13]</w:t>
+      </w:r>
+      <w:r>
+        <w:tab/>
+        <w:t xml:space="preserve">F. Humam and M. A. Triawan, “Sistem Keamanan Ruangan Menggunakan ESP32CAM dan Sensor Gerak Berbasis IoT,” </w:t>
+      </w:r>
+      <w:r>
+        <w:rPr>
+          <w:i/>
+          <w:iCs/>
+        </w:rPr>
+        <w:t>Infotek J. Inform. Dan Teknol.</w:t>
+      </w:r>
+      <w:r>
+        <w:t>, vol. 7, no. 2, pp. 575–584, July 2024, doi: 10.29408/jit.v7i2.26109.</w:t>
       </w:r>
     </w:p>
     <w:p>
@@ -14506,7 +15703,21 @@
         <w:pStyle w:val="Bibliography"/>
       </w:pPr>
       <w:r>
-        <w:t>Saifanis, R., Hanafi, H., &amp; Fauziah, A. (2024). RANCANG BANGUN GPS IoT DENGAN ARDUINO NANO DAN MODUL NEO-6M DALAM SISTEM PEMANTAUAN LOKASI OBJEK. Jurnal TEKTRO, 8(2), 286–290. https://doi.org/10.30811/tektro.v8i2.6323</w:t>
+        <w:t>[14]</w:t>
+      </w:r>
+      <w:r>
+        <w:tab/>
+        <w:t xml:space="preserve">R. Saifanis, H. Hanafi, and A. Fauziah, “RANCANG BANGUN GPS IoT DENGAN ARDUINO NANO DAN MODUL NEO-6M DALAM SISTEM PEMANTAUAN LOKASI OBJEK,” </w:t>
+      </w:r>
+      <w:r>
+        <w:rPr>
+          <w:i/>
+          <w:iCs/>
+        </w:rPr>
+        <w:t>J. TEKTRO</w:t>
+      </w:r>
+      <w:r>
+        <w:t>, vol. 8, no. 2, pp. 286–290, 2024, doi: 10.30811/tektro.v8i2.6323.</w:t>
       </w:r>
     </w:p>
     <w:p>
@@ -14514,7 +15725,21 @@
         <w:pStyle w:val="Bibliography"/>
       </w:pPr>
       <w:r>
-        <w:t>Sukanteri, N. P., Suparyana, P. K., Suryana, I. M., &amp; Setyawan, I. M. D. (n.d.). TEKNOLOGI PERTANIAN TERPADU BERBASIS FILOSOFI TRI HITA KARANA DALAM USAHATANI MENUJU PERTANIAN ORGANIK.</w:t>
+        <w:t>[15]</w:t>
+      </w:r>
+      <w:r>
+        <w:tab/>
+        <w:t xml:space="preserve">M. Z. Mukti, R. Nandika, and E. Susanti, “PERANCANGAN SECURITY SISTEM SMART HOME BERBASIS IOT MENGGUNAKAN ESP32 CAM DAN SENSOR PIR (PASSIVE INFRARED SENSOR) MELALUI APLIKASI BLYNK,” </w:t>
+      </w:r>
+      <w:r>
+        <w:rPr>
+          <w:i/>
+          <w:iCs/>
+        </w:rPr>
+        <w:t>SIGMA Tek.</w:t>
+      </w:r>
+      <w:r>
+        <w:t>, vol. 7, no. 2, pp. 349–360, Nov. 2024, doi: 10.33373/sigmateknika.v7i2.6982.</w:t>
       </w:r>
     </w:p>
     <w:p>
@@ -14522,7 +15747,21 @@
         <w:pStyle w:val="Bibliography"/>
       </w:pPr>
       <w:r>
-        <w:t>Tambunan, L., &amp; Putra, D. D. (2019). SISTEM KONTROL KENDARAAN BERBASIS IOT. JSR : Jaringan Sistem Informasi Robotik, 3(1), 152–160. https://doi.org/10.58486/jsr.v3i1.41</w:t>
+        <w:t>[16]</w:t>
+      </w:r>
+      <w:r>
+        <w:tab/>
+        <w:t xml:space="preserve">I. K. C. Arta, A. Febriyanto, I. B. M. H. A. Nugraha, I. G. S. Widharma, and I. B. I. Purnama, “Animal Tracking Berbasis Internet of Things,” </w:t>
+      </w:r>
+      <w:r>
+        <w:rPr>
+          <w:i/>
+          <w:iCs/>
+        </w:rPr>
+        <w:t>Maj. Ilm. Teknol. Elektro</w:t>
+      </w:r>
+      <w:r>
+        <w:t>, vol. 21, no. 1, p. 7, July 2022, doi: 10.24843/MITE.2022.v21i01.P02.</w:t>
       </w:r>
     </w:p>
     <w:p>
@@ -14530,7 +15769,21 @@
         <w:pStyle w:val="Bibliography"/>
       </w:pPr>
       <w:r>
-        <w:t>Wibowo, G. H., Ayatullah, M. D., &amp; Prasetyo, J. A. (2019). SISTEM CERDAS PEMANTAU HEWAN TERNAK PADA ALAM BEBAS BERBASIS INTERNET OF THINGS (IOT). JURNAL ELTEK, 17(2), 18. https://doi.org/10.33795/eltek.v17i2.188</w:t>
+        <w:t>[17]</w:t>
+      </w:r>
+      <w:r>
+        <w:tab/>
+        <w:t xml:space="preserve">F. Nuryadi, N. W. P. Septiani, and M. Lestari, “Implementasi ESP32 Untuk Sistem Pemantauan Kesuburan Tanah Berbasis IoT,” </w:t>
+      </w:r>
+      <w:r>
+        <w:rPr>
+          <w:i/>
+          <w:iCs/>
+        </w:rPr>
+        <w:t>Semnas Ristek Semin. Nas. Ris. Dan Inov. Teknol.</w:t>
+      </w:r>
+      <w:r>
+        <w:t>, vol. 9, no. 1, pp. 79–86, Jan. 2025, doi: 10.30998/semnasristek.v9i1.7550.</w:t>
       </w:r>
     </w:p>
     <w:p>
@@ -14538,7 +15791,21 @@
         <w:pStyle w:val="Bibliography"/>
       </w:pPr>
       <w:r>
-        <w:t>Widodo, L. (n.d.). Rancang Bangun Sistem Deteksi Posisi Sapi berbasis Smartphone.</w:t>
+        <w:t>[18]</w:t>
+      </w:r>
+      <w:r>
+        <w:tab/>
+        <w:t xml:space="preserve">F. Annisa </w:t>
+      </w:r>
+      <w:r>
+        <w:rPr>
+          <w:i/>
+          <w:iCs/>
+        </w:rPr>
+        <w:t>et al.</w:t>
+      </w:r>
+      <w:r>
+        <w:t>, “Sistem Controlling Pembuatan Pakan Ternak Silase Menggunakan ESP32 Berbasis IoT”.</w:t>
       </w:r>
     </w:p>
     <w:p>
@@ -14546,7 +15813,11 @@
         <w:pStyle w:val="Bibliography"/>
       </w:pPr>
       <w:r>
-        <w:t>Wijaya, A., &amp; Rivai, M. (2018). Monitoring dan Kontrol Sistem irigasi Berbasis IoT Menggunakan Banana PI. Jurnal Teknik ITS, 7(2), 288–292. https://doi.org/10.12962/j23373539.v7i2.31113</w:t>
+        <w:t>[19]</w:t>
+      </w:r>
+      <w:r>
+        <w:tab/>
+        <w:t>H. Muchtar and M. Z. H. Ulhaq, “Rancang Bangun Smart Monitoring Farming pada Media Tanah Menggunakan Sistem IoT (Internet of Things),” vol. 6, no. 2.</w:t>
       </w:r>
     </w:p>
     <w:p>
@@ -14554,7 +15825,11 @@
         <w:pStyle w:val="Bibliography"/>
       </w:pPr>
       <w:r>
-        <w:t>Wolfert, S., Ge, L., Verdouw, C., &amp; Bogaardt, M.-J. (2017). Big Data in Smart Farming – A review. Agricultural Systems, 153, 69–80. https://doi.org/10.1016/j.agsy.2017.01.023</w:t>
+        <w:t>[20]</w:t>
+      </w:r>
+      <w:r>
+        <w:tab/>
+        <w:t>L. Widodo, “Rancang Bangun Sistem Deteksi Posisi Sapi berbasis Smartphone”.</w:t>
       </w:r>
     </w:p>
     <w:p>
@@ -17608,8 +18883,11 @@
     <w:unhideWhenUsed/>
     <w:rsid w:val="004F0842"/>
     <w:pPr>
-      <w:spacing w:after="0" w:line="480" w:lineRule="auto"/>
-      <w:ind w:left="720" w:hanging="720"/>
+      <w:tabs>
+        <w:tab w:val="left" w:pos="504"/>
+      </w:tabs>
+      <w:spacing w:after="0" w:line="240" w:lineRule="auto"/>
+      <w:ind w:left="504" w:hanging="504"/>
     </w:pPr>
   </w:style>
   <w:style w:type="character" w:customStyle="1" w:styleId="Heading1Char">
@@ -17811,6 +19089,30 @@
       <w:rFonts w:ascii="Times New Roman" w:eastAsiaTheme="majorEastAsia" w:hAnsi="Times New Roman" w:cstheme="majorBidi"/>
       <w:iCs/>
       <w:sz w:val="24"/>
+    </w:rPr>
+  </w:style>
+  <w:style w:type="character" w:styleId="UnresolvedMention">
+    <w:name w:val="Unresolved Mention"/>
+    <w:basedOn w:val="DefaultParagraphFont"/>
+    <w:uiPriority w:val="99"/>
+    <w:semiHidden/>
+    <w:unhideWhenUsed/>
+    <w:rsid w:val="00CC39A6"/>
+    <w:rPr>
+      <w:color w:val="605E5C"/>
+      <w:shd w:val="clear" w:color="auto" w:fill="E1DFDD"/>
+    </w:rPr>
+  </w:style>
+  <w:style w:type="character" w:styleId="FollowedHyperlink">
+    <w:name w:val="FollowedHyperlink"/>
+    <w:basedOn w:val="DefaultParagraphFont"/>
+    <w:uiPriority w:val="99"/>
+    <w:semiHidden/>
+    <w:unhideWhenUsed/>
+    <w:rsid w:val="00CC39A6"/>
+    <w:rPr>
+      <w:color w:val="954F72" w:themeColor="followedHyperlink"/>
+      <w:u w:val="single"/>
     </w:rPr>
   </w:style>
 </w:styles>

</xml_diff>